<commit_message>
Update user stories and configuration files for improved contract management
- Updated user stories to reflect recent changes in contract handling, including new acceptance criteria and task management features.
- Enhanced configuration files to support additional contract types and improve data handling.
- Adjusted UI components for better user experience in the dashboard, including new buttons and layout adjustments.
- Incorporated archived status handling for form list items to streamline user interactions.

Co-authored-by: Cursor <cursoragent@cursor.com>
</commit_message>
<xml_diff>
--- a/docs/AI-Legal_User-Stories_Sprint1.docx
+++ b/docs/AI-Legal_User-Stories_Sprint1.docx
@@ -10,7 +10,7 @@
         <w:rPr>
           <w:b/>
           <w:color w:val="1F4E79"/>
-          <w:sz w:val="40"/>
+          <w:sz w:val="32"/>
         </w:rPr>
         <w:t>AI Review Hợp đồng (AI Legal)</w:t>
       </w:r>
@@ -21,7 +21,8 @@
       </w:pPr>
       <w:r>
         <w:rPr>
-          <w:sz w:val="28"/>
+          <w:b/>
+          <w:sz w:val="26"/>
         </w:rPr>
         <w:t>User Stories Sprint 1 — kèm Acceptance Criteria</w:t>
       </w:r>
@@ -33,34 +34,26 @@
       <w:r>
         <w:rPr>
           <w:i/>
-          <w:sz w:val="18"/>
+          <w:sz w:val="20"/>
         </w:rPr>
-        <w:t>Phiên bản 04/08/2026 · Nguồn: docs/requirements-alignment/03-user-stories.md (Git)</w:t>
+        <w:t>Phiên bản 06/08/2026 · Nguồn: docs/requirements-alignment/03-user-stories.md</w:t>
       </w:r>
     </w:p>
     <w:p/>
     <w:p>
-      <w:pPr>
-        <w:ind w:left="340"/>
-      </w:pPr>
       <w:r>
         <w:rPr>
           <w:i/>
-          <w:color w:val="555555"/>
-          <w:sz w:val="19"/>
+          <w:sz w:val="20"/>
         </w:rPr>
         <w:t>Owner: BA (soạn) · TESTER (review AC khả năng test) · DEV (review khả thi)</w:t>
       </w:r>
     </w:p>
     <w:p>
-      <w:pPr>
-        <w:ind w:left="340"/>
-      </w:pPr>
       <w:r>
         <w:rPr>
           <w:i/>
-          <w:color w:val="555555"/>
-          <w:sz w:val="19"/>
+          <w:sz w:val="20"/>
         </w:rPr>
         <w:t xml:space="preserve">Cột </w:t>
       </w:r>
@@ -68,29 +61,23 @@
         <w:rPr>
           <w:b/>
           <w:i/>
-          <w:color w:val="555555"/>
-          <w:sz w:val="19"/>
+          <w:sz w:val="20"/>
         </w:rPr>
         <w:t>Demo</w:t>
       </w:r>
       <w:r>
         <w:rPr>
           <w:i/>
-          <w:color w:val="555555"/>
-          <w:sz w:val="19"/>
+          <w:sz w:val="20"/>
         </w:rPr>
         <w:t>: ✅ = đã có UI demo tham chiếu tại route tương ứng; 🔧 = có service, chưa có UI; ❌ = chưa có gì.</w:t>
       </w:r>
     </w:p>
     <w:p>
-      <w:pPr>
-        <w:ind w:left="340"/>
-      </w:pPr>
       <w:r>
         <w:rPr>
           <w:i/>
-          <w:color w:val="555555"/>
-          <w:sz w:val="19"/>
+          <w:sz w:val="20"/>
         </w:rPr>
         <w:t xml:space="preserve">AC viết dạng Given–When–Then. Story phụ thuộc câu hỏi mở thì ghi </w:t>
       </w:r>
@@ -98,65 +85,38 @@
         <w:rPr>
           <w:rFonts w:ascii="Consolas" w:hAnsi="Consolas"/>
           <w:i/>
-          <w:color w:val="555555"/>
-          <w:sz w:val="19"/>
+          <w:sz w:val="20"/>
         </w:rPr>
         <w:t>[phụ thuộc Ax/Bx/...]</w:t>
       </w:r>
       <w:r>
         <w:rPr>
           <w:i/>
-          <w:color w:val="555555"/>
-          <w:sz w:val="19"/>
+          <w:sz w:val="20"/>
         </w:rPr>
         <w:t xml:space="preserve"> — chỉ Ready khi câu hỏi đã chốt.</w:t>
       </w:r>
     </w:p>
     <w:p>
-      <w:pPr>
-        <w:ind w:left="340"/>
-      </w:pPr>
-      <w:r>
-        <w:rPr>
-          <w:i/>
-          <w:color w:val="555555"/>
-          <w:sz w:val="19"/>
-        </w:rPr>
-        <w:t xml:space="preserve">Cập nhật 04/08/2026: đã phản ánh các quyết định PM chốt trong </w:t>
-      </w:r>
-      <w:r>
-        <w:rPr>
-          <w:rFonts w:ascii="Consolas" w:hAnsi="Consolas"/>
-          <w:i/>
-          <w:color w:val="555555"/>
-          <w:sz w:val="19"/>
-        </w:rPr>
-        <w:t>02-open-questions.md</w:t>
-      </w:r>
-      <w:r>
-        <w:rPr>
-          <w:i/>
-          <w:color w:val="555555"/>
-          <w:sz w:val="19"/>
-        </w:rPr>
-        <w:t xml:space="preserve"> (A4–A10, C1–C5, D1c/D1d) và màn </w:t>
-      </w:r>
+      <w:r>
+        <w:t>&gt;</w:t>
+      </w:r>
+    </w:p>
+    <w:p>
       <w:r>
         <w:rPr>
           <w:b/>
           <w:i/>
-          <w:color w:val="555555"/>
-          <w:sz w:val="19"/>
+          <w:sz w:val="20"/>
         </w:rPr>
-        <w:t>Task</w:t>
+        <w:t>Cập nhật 06/08/2026 (khớp Blueprint v1.22 + demo):</w:t>
       </w:r>
       <w:r>
         <w:rPr>
           <w:i/>
-          <w:color w:val="555555"/>
-          <w:sz w:val="19"/>
+          <w:sz w:val="20"/>
         </w:rPr>
-        <w:t xml:space="preserve"> chung thay cho "Hộp duyệt Legal".</w:t>
+        <w:t xml:space="preserve"> bỏ A6 fail-fast template; bỏ Legal Lead &amp; Draft/Publish checklist; cấu hình loại cha + overlay tên HĐ opt-in; Form lists Lưu trữ/Xóa theo usage; Task Manager/Legal TH1–TH3; System Prompt 3 stage; nút Quay lại Configurations/Config.</w:t>
       </w:r>
     </w:p>
     <w:p>
@@ -172,25 +132,16 @@
         <w:pStyle w:val="Heading2"/>
       </w:pPr>
       <w:r>
-        <w:t xml:space="preserve">US-P01 — Tạo tài liệu review · Demo ✅ </w:t>
+        <w:t>US-P01 — Tạo tài liệu review · Demo ✅ `/dashboard/contracts/new`</w:t>
+      </w:r>
+    </w:p>
+    <w:p>
+      <w:r>
+        <w:t xml:space="preserve">Là Purchasing, tôi muốn nhập thông tin hợp đồng (từ Form lists) và upload 1 file </w:t>
       </w:r>
       <w:r>
         <w:rPr>
           <w:rFonts w:ascii="Consolas" w:hAnsi="Consolas"/>
-          <w:color w:val="6B2E2E"/>
-          <w:sz w:val="20"/>
-        </w:rPr>
-        <w:t>/dashboard/contracts/new</w:t>
-      </w:r>
-    </w:p>
-    <w:p>
-      <w:r>
-        <w:t xml:space="preserve">Là Purchasing, tôi muốn nhập thông tin hợp đồng và upload 1 file </w:t>
-      </w:r>
-      <w:r>
-        <w:rPr>
-          <w:rFonts w:ascii="Consolas" w:hAnsi="Consolas"/>
-          <w:color w:val="6B2E2E"/>
           <w:sz w:val="20"/>
         </w:rPr>
         <w:t>.docx</w:t>
@@ -210,7 +161,7 @@
         <w:t>AC1</w:t>
       </w:r>
       <w:r>
-        <w:t>: Given form thiếu trường bắt buộc (loại tài liệu, tên, loại HĐ, contract name, business entity, contract base, chiết khấu, giá trị) When bấm Submit Then hệ thống chặn và chỉ rõ trường thiếu.</w:t>
+        <w:t>: Given form thiếu trường bắt buộc (Loại HĐ, Tên HĐ, Công ty, Tên tài liệu, Loại giá trị HĐ, HĐ tiêu chuẩn, Chiết khấu, Giá trị, file) When bấm Submit Then hệ thống chặn và chỉ rõ trường thiếu.</w:t>
       </w:r>
     </w:p>
     <w:p>
@@ -229,7 +180,6 @@
       <w:r>
         <w:rPr>
           <w:rFonts w:ascii="Consolas" w:hAnsi="Consolas"/>
-          <w:color w:val="6B2E2E"/>
           <w:sz w:val="20"/>
         </w:rPr>
         <w:t>.docx</w:t>
@@ -254,7 +204,6 @@
       <w:r>
         <w:rPr>
           <w:rFonts w:ascii="Consolas" w:hAnsi="Consolas"/>
-          <w:color w:val="6B2E2E"/>
           <w:sz w:val="20"/>
         </w:rPr>
         <w:t>.docx</w:t>
@@ -265,22 +214,22 @@
       <w:r>
         <w:rPr>
           <w:rFonts w:ascii="Consolas" w:hAnsi="Consolas"/>
-          <w:color w:val="6B2E2E"/>
           <w:sz w:val="20"/>
         </w:rPr>
         <w:t>queued</w:t>
       </w:r>
       <w:r>
-        <w:t xml:space="preserve">, điều hướng sang workspace, file </w:t>
+        <w:t xml:space="preserve">, điều hướng workspace; Số tài liệu tự sinh </w:t>
       </w:r>
       <w:r>
         <w:rPr>
-          <w:b/>
+          <w:rFonts w:ascii="Consolas" w:hAnsi="Consolas"/>
+          <w:sz w:val="20"/>
         </w:rPr>
-        <w:t>thật</w:t>
-      </w:r>
-      <w:r>
-        <w:t xml:space="preserve"> của user được lưu và dùng để preview (khác demo hiện tại).</w:t>
+        <w:t>(Mã công ty).(Mã loại HĐ).Năm+STT</w:t>
+      </w:r>
+      <w:r>
+        <w:t xml:space="preserve"> — user không sửa được.</w:t>
       </w:r>
     </w:p>
     <w:p>
@@ -299,22 +248,69 @@
       <w:r>
         <w:rPr>
           <w:rFonts w:ascii="Consolas" w:hAnsi="Consolas"/>
-          <w:color w:val="6B2E2E"/>
           <w:sz w:val="20"/>
         </w:rPr>
-        <w:t>[A6 đã chốt: fail-fast]</w:t>
-      </w:r>
-      <w:r>
-        <w:t xml:space="preserve">: Given HĐ khung có cờ "bắt buộc khớp template" và file không khớp Then hệ thống </w:t>
+        <w:t>[A6 đã bỏ khỏi Sprint 1]</w:t>
+      </w:r>
+      <w:r>
+        <w:t xml:space="preserve">: Given upload </w:t>
+      </w:r>
+      <w:r>
+        <w:rPr>
+          <w:rFonts w:ascii="Consolas" w:hAnsi="Consolas"/>
+          <w:sz w:val="20"/>
+        </w:rPr>
+        <w:t>.docx</w:t>
+      </w:r>
+      <w:r>
+        <w:t xml:space="preserve"> hợp lệ Then </w:t>
       </w:r>
       <w:r>
         <w:rPr>
           <w:b/>
         </w:rPr>
-        <w:t>chặn ngay lúc upload</w:t>
-      </w:r>
-      <w:r>
-        <w:t xml:space="preserve"> kèm lý do. Tiêu chí khớp (đề xuất, chờ Legal xác nhận): cấu trúc vùng khoá (số lượng + id Content Control/Range Permission) trùng template gốc + hash nội dung vùng khoá.</w:t>
+        <w:t>không</w:t>
+      </w:r>
+      <w:r>
+        <w:t xml:space="preserve"> so khớp nội dung file với template loại HĐ (không fail-fast A6). Cờ </w:t>
+      </w:r>
+      <w:r>
+        <w:rPr>
+          <w:rFonts w:ascii="Consolas" w:hAnsi="Consolas"/>
+          <w:sz w:val="20"/>
+        </w:rPr>
+        <w:t>requireTemplateMatch</w:t>
+      </w:r>
+      <w:r>
+        <w:t xml:space="preserve"> trên config chỉ là metadata tham chiếu.</w:t>
+      </w:r>
+    </w:p>
+    <w:p>
+      <w:pPr>
+        <w:pStyle w:val="ListBullet"/>
+      </w:pPr>
+      <w:r>
+        <w:rPr>
+          <w:b/>
+        </w:rPr>
+        <w:t>AC5</w:t>
+      </w:r>
+      <w:r>
+        <w:t>: Given Tên HĐ chưa có checklist loại cha đã Lưu When Submit Then cảnh báo “AI review mang tính tham khảo” (vẫn cho vào queue).</w:t>
+      </w:r>
+    </w:p>
+    <w:p>
+      <w:pPr>
+        <w:pStyle w:val="ListBullet"/>
+      </w:pPr>
+      <w:r>
+        <w:rPr>
+          <w:b/>
+        </w:rPr>
+        <w:t>AC6</w:t>
+      </w:r>
+      <w:r>
+        <w:t>: Given chọn Loại HĐ Then dropdown Tên HĐ chỉ hiện tên active thuộc loại đó (Form lists, không hiện đã lưu trữ).</w:t>
       </w:r>
     </w:p>
     <w:p>
@@ -341,7 +337,6 @@
       <w:r>
         <w:rPr>
           <w:rFonts w:ascii="Consolas" w:hAnsi="Consolas"/>
-          <w:color w:val="6B2E2E"/>
           <w:sz w:val="20"/>
         </w:rPr>
         <w:t>queued</w:t>
@@ -352,7 +347,6 @@
       <w:r>
         <w:rPr>
           <w:rFonts w:ascii="Consolas" w:hAnsi="Consolas"/>
-          <w:color w:val="6B2E2E"/>
           <w:sz w:val="20"/>
         </w:rPr>
         <w:t>processing</w:t>
@@ -377,7 +371,6 @@
       <w:r>
         <w:rPr>
           <w:rFonts w:ascii="Consolas" w:hAnsi="Consolas"/>
-          <w:color w:val="6B2E2E"/>
           <w:sz w:val="20"/>
         </w:rPr>
         <w:t>[A8 đã chốt: FIFO]</w:t>
@@ -392,7 +385,7 @@
         <w:t>first-in-first-out</w:t>
       </w:r>
       <w:r>
-        <w:t>, không ưu tiên đặc biệt.</w:t>
+        <w:t>.</w:t>
       </w:r>
     </w:p>
     <w:p>
@@ -515,7 +508,6 @@
       <w:r>
         <w:rPr>
           <w:rFonts w:ascii="Consolas" w:hAnsi="Consolas"/>
-          <w:color w:val="6B2E2E"/>
           <w:sz w:val="20"/>
         </w:rPr>
         <w:t>_shared/injection_guard.md</w:t>
@@ -540,7 +532,6 @@
       <w:r>
         <w:rPr>
           <w:rFonts w:ascii="Consolas" w:hAnsi="Consolas"/>
-          <w:color w:val="6B2E2E"/>
           <w:sz w:val="20"/>
         </w:rPr>
         <w:t>[C3 đã chốt]</w:t>
@@ -555,7 +546,7 @@
         <w:t>không có vùng mở nào</w:t>
       </w:r>
       <w:r>
-        <w:t xml:space="preserve"> Then AI phản hồi rõ cho user biết, chỉ hỗ trợ chat + annotation, không ghi file; file có vùng mở thì chỉnh sửa bình thường.</w:t>
+        <w:t xml:space="preserve"> Then AI phản hồi rõ, chỉ hỗ trợ chat + annotation, không ghi file.</w:t>
       </w:r>
     </w:p>
     <w:p>
@@ -582,13 +573,12 @@
       <w:r>
         <w:rPr>
           <w:rFonts w:ascii="Consolas" w:hAnsi="Consolas"/>
-          <w:color w:val="6B2E2E"/>
           <w:sz w:val="20"/>
         </w:rPr>
         <w:t>.docx</w:t>
       </w:r>
       <w:r>
-        <w:t xml:space="preserve"> Then hệ thống validate cấu trúc vùng khoá so với template/bản trước.</w:t>
+        <w:t xml:space="preserve"> Then hệ thống validate cấu trúc vùng khoá so với bản trước.</w:t>
       </w:r>
     </w:p>
     <w:p>
@@ -607,7 +597,6 @@
       <w:r>
         <w:rPr>
           <w:rFonts w:ascii="Consolas" w:hAnsi="Consolas"/>
-          <w:color w:val="6B2E2E"/>
           <w:sz w:val="20"/>
         </w:rPr>
         <w:t>[C5 đã chốt: chặn hoàn toàn]</w:t>
@@ -618,19 +607,18 @@
       <w:r>
         <w:rPr>
           <w:rFonts w:ascii="Consolas" w:hAnsi="Consolas"/>
-          <w:color w:val="6B2E2E"/>
           <w:sz w:val="20"/>
         </w:rPr>
         <w:t>permStart</w:t>
       </w:r>
       <w:r>
-        <w:t xml:space="preserve"> / thiếu field Then hiển thị danh sách lỗi cụ thể và </w:t>
+        <w:t xml:space="preserve"> / thiếu field Then hiển thị lỗi và </w:t>
       </w:r>
       <w:r>
         <w:rPr>
           <w:b/>
         </w:rPr>
-        <w:t>chặn hoàn toàn, không có cơ chế override</w:t>
+        <w:t>chặn hoàn toàn, không override</w:t>
       </w:r>
       <w:r>
         <w:t>.</w:t>
@@ -647,7 +635,7 @@
         <w:t>AC3</w:t>
       </w:r>
       <w:r>
-        <w:t>: Given file hợp lệ Then version bump, chạy lại AI review (vòng review mới), lịch sử version ghi nhận.</w:t>
+        <w:t>: Given file hợp lệ Then version bump, chạy lại AI review, lịch sử version ghi nhận.</w:t>
       </w:r>
     </w:p>
     <w:p>
@@ -669,7 +657,7 @@
         <w:t>AC1</w:t>
       </w:r>
       <w:r>
-        <w:t>: Given chưa gán đủ marker cho các bên ký Then nút "Gửi Legal duyệt" bị chặn kèm danh sách lỗi.</w:t>
+        <w:t>: Given chưa gán đủ marker cho các bên ký Then nút Submit for approval bị chặn kèm danh sách lỗi.</w:t>
       </w:r>
     </w:p>
     <w:p>
@@ -688,7 +676,6 @@
       <w:r>
         <w:rPr>
           <w:rFonts w:ascii="Consolas" w:hAnsi="Consolas"/>
-          <w:color w:val="6B2E2E"/>
           <w:sz w:val="20"/>
         </w:rPr>
         <w:t>#ds:id r:p_xxx_r_yyy h:100 #</w:t>
@@ -699,7 +686,6 @@
       <w:r>
         <w:rPr>
           <w:rFonts w:ascii="Consolas" w:hAnsi="Consolas"/>
-          <w:color w:val="6B2E2E"/>
           <w:sz w:val="20"/>
         </w:rPr>
         <w:t>is</w:t>
@@ -710,13 +696,12 @@
       <w:r>
         <w:rPr>
           <w:rFonts w:ascii="Consolas" w:hAnsi="Consolas"/>
-          <w:color w:val="6B2E2E"/>
           <w:sz w:val="20"/>
         </w:rPr>
         <w:t>st</w:t>
       </w:r>
       <w:r>
-        <w:t>), validate theo 8 rule eContract (id duy nhất, role khớp, height &gt; 0…).</w:t>
+        <w:t>).</w:t>
       </w:r>
     </w:p>
     <w:p>
@@ -735,7 +720,6 @@
       <w:r>
         <w:rPr>
           <w:rFonts w:ascii="Consolas" w:hAnsi="Consolas"/>
-          <w:color w:val="6B2E2E"/>
           <w:sz w:val="20"/>
         </w:rPr>
         <w:t>[A7 đã chốt]</w:t>
@@ -750,7 +734,7 @@
         <w:t>kéo-thả marker trên preview</w:t>
       </w:r>
       <w:r>
-        <w:t xml:space="preserve"> để đặt vị trí (không chỉ click chọn từ danh sách như demo); toạ độ/anchor được lưu để backend chèn marker mực trắng đúng vị trí.</w:t>
+        <w:t xml:space="preserve"> (demo hiện click-chọn; kéo-thả thuộc hoàn thiện Sprint 1).</w:t>
       </w:r>
     </w:p>
     <w:p>
@@ -758,7 +742,7 @@
         <w:pStyle w:val="Heading2"/>
       </w:pPr>
       <w:r>
-        <w:t>US-P07 — Gửi Legal &amp; xử lý feedback khi bị reject · Demo ✅</w:t>
+        <w:t>US-P07 — Gửi duyệt &amp; xử lý feedback khi bị reject · Demo ✅</w:t>
       </w:r>
     </w:p>
     <w:p>
@@ -772,27 +756,17 @@
         <w:t>AC1</w:t>
       </w:r>
       <w:r>
-        <w:t xml:space="preserve">: Given đủ marker When "Gửi Legal duyệt" Then trạng thái → </w:t>
+        <w:t xml:space="preserve">: Given đủ marker When Submit for approval Then trạng thái → </w:t>
       </w:r>
       <w:r>
         <w:rPr>
           <w:rFonts w:ascii="Consolas" w:hAnsi="Consolas"/>
-          <w:color w:val="6B2E2E"/>
           <w:sz w:val="20"/>
         </w:rPr>
-        <w:t>pending_legal</w:t>
-      </w:r>
-      <w:r>
-        <w:t xml:space="preserve">, Legal thấy ticket trong màn </w:t>
-      </w:r>
-      <w:r>
-        <w:rPr>
-          <w:b/>
-        </w:rPr>
-        <w:t>Task</w:t>
-      </w:r>
-      <w:r>
-        <w:t xml:space="preserve"> của mình.</w:t>
+        <w:t>pending_manager</w:t>
+      </w:r>
+      <w:r>
+        <w:t>; Purchasing Manager thấy ticket trong màn Task.</w:t>
       </w:r>
     </w:p>
     <w:p>
@@ -806,16 +780,7 @@
         <w:t>AC2</w:t>
       </w:r>
       <w:r>
-        <w:t xml:space="preserve">: Given Legal reject Then ticket xuất hiện trong màn </w:t>
-      </w:r>
-      <w:r>
-        <w:rPr>
-          <w:b/>
-        </w:rPr>
-        <w:t>Task</w:t>
-      </w:r>
-      <w:r>
-        <w:t xml:space="preserve"> của Purchasing owner (kèm comment Legal); Purchasing thấy checklist việc cần sửa (Structured Feedback) trên workspace, sửa xong gửi lại tạo version mới.</w:t>
+        <w:t>: Given Manager hoặc Legal reject Then ticket về Task của Purchasing owner kèm comment; Purchasing sửa (TH1 checklist / TH2 Accept Track Changes / TH3 reupload) rồi gửi lại (version mới).</w:t>
       </w:r>
     </w:p>
     <w:p>
@@ -834,7 +799,6 @@
       <w:r>
         <w:rPr>
           <w:rFonts w:ascii="Consolas" w:hAnsi="Consolas"/>
-          <w:color w:val="6B2E2E"/>
           <w:sz w:val="20"/>
         </w:rPr>
         <w:t>[A4 đã chốt]</w:t>
@@ -857,15 +821,7 @@
         <w:pStyle w:val="Heading2"/>
       </w:pPr>
       <w:r>
-        <w:t xml:space="preserve">US-P08 — Chỉ thấy hợp đồng của mình · Demo ❌ (filter đang no-op) </w:t>
-      </w:r>
-      <w:r>
-        <w:rPr>
-          <w:rFonts w:ascii="Consolas" w:hAnsi="Consolas"/>
-          <w:color w:val="6B2E2E"/>
-          <w:sz w:val="20"/>
-        </w:rPr>
-        <w:t>[A5 đã chốt: theo user]</w:t>
+        <w:t>US-P08 — Chỉ thấy hợp đồng của mình · Demo ✅ `[A5 đã chốt: theo user]`</w:t>
       </w:r>
     </w:p>
     <w:p>
@@ -879,16 +835,7 @@
         <w:t>AC1</w:t>
       </w:r>
       <w:r>
-        <w:t xml:space="preserve">: Given đăng nhập Purchasing A Then danh sách chỉ gồm ticket/HĐ </w:t>
-      </w:r>
-      <w:r>
-        <w:rPr>
-          <w:b/>
-        </w:rPr>
-        <w:t>do chính A tạo</w:t>
-      </w:r>
-      <w:r>
-        <w:t xml:space="preserve"> (scope theo user, không theo phòng ban).</w:t>
+        <w:t>: Given đăng nhập Purchasing A Then danh sách chỉ gồm HĐ do chính A tạo (hoặc gắn owner A).</w:t>
       </w:r>
     </w:p>
     <w:p>
@@ -902,7 +849,7 @@
         <w:t>AC2</w:t>
       </w:r>
       <w:r>
-        <w:t>: Given Purchasing A mở URL trực tiếp HĐ của B Then bị chặn 403.</w:t>
+        <w:t>: Given Purchasing A mở URL trực tiếp HĐ của B Then bị chặn / không thấy trong list.</w:t>
       </w:r>
     </w:p>
     <w:p>
@@ -910,15 +857,7 @@
         <w:pStyle w:val="Heading2"/>
       </w:pPr>
       <w:r>
-        <w:t xml:space="preserve">US-P09 — Sửa trực tiếp inline (Phương thức 2) · Demo 🟡 (handler có, editable chưa bật) </w:t>
-      </w:r>
-      <w:r>
-        <w:rPr>
-          <w:rFonts w:ascii="Consolas" w:hAnsi="Consolas"/>
-          <w:color w:val="6B2E2E"/>
-          <w:sz w:val="20"/>
-        </w:rPr>
-        <w:t>[phụ thuộc C6]</w:t>
+        <w:t>US-P09 — Sửa trực tiếp inline (Phương thức 2) · Demo 🟡 (handler có, editable chưa bật) `[phụ thuộc C6]`</w:t>
       </w:r>
     </w:p>
     <w:p>
@@ -932,7 +871,7 @@
         <w:t>AC1</w:t>
       </w:r>
       <w:r>
-        <w:t>: Given vùng mở trên Cột 3 When bôi đen/gõ đè Then nội dung thay đổi ngay, diff hiển thị tách lớp với diff AI, % tin cậy re-validate realtime.</w:t>
+        <w:t>: Given vùng mở trên preview When bôi đen/gõ đè Then nội dung thay đổi, diff tách lớp với diff AI.</w:t>
       </w:r>
     </w:p>
     <w:p>
@@ -946,7 +885,7 @@
         <w:t>AC2</w:t>
       </w:r>
       <w:r>
-        <w:t>: Given vị trí thuộc vùng khoá When cố sửa Then bị chặn (allow-list Lớp 1), không có đường ghi đè.</w:t>
+        <w:t>: Given vị trí thuộc vùng khoá When cố sửa Then bị chặn (allow-list Lớp 1).</w:t>
       </w:r>
     </w:p>
     <w:p>
@@ -960,7 +899,7 @@
         <w:t>AC3</w:t>
       </w:r>
       <w:r>
-        <w:t>: Given sửa inline Then audit trail ghi nguồn gốc "sửa trực tiếp" (phân biệt chat / upload lại).</w:t>
+        <w:t>: Given sửa inline Then audit trail ghi nguồn gốc "sửa trực tiếp".</w:t>
       </w:r>
     </w:p>
     <w:p>
@@ -968,15 +907,7 @@
         <w:pStyle w:val="Heading2"/>
       </w:pPr>
       <w:r>
-        <w:t xml:space="preserve">US-P10 — Lưu thủ công, không autosave (Mục 4.3) · Demo ❌ </w:t>
-      </w:r>
-      <w:r>
-        <w:rPr>
-          <w:rFonts w:ascii="Consolas" w:hAnsi="Consolas"/>
-          <w:color w:val="6B2E2E"/>
-          <w:sz w:val="20"/>
-        </w:rPr>
-        <w:t>[A4c đã chốt: mọi chỉnh sửa + hỏi xác nhận]</w:t>
+        <w:t>US-P10 — Lưu thủ công, không autosave (Mục 4.3) · Demo ❌ `[A4c đã chốt]`</w:t>
       </w:r>
     </w:p>
     <w:p>
@@ -990,7 +921,7 @@
         <w:t>AC1</w:t>
       </w:r>
       <w:r>
-        <w:t>: Given có thay đổi chưa lưu When rời trang/đổi tab Then hiện cảnh báo 3 lựa chọn: Lưu / Thoát không lưu / Huỷ.</w:t>
+        <w:t>: Given có thay đổi chưa lưu When rời trang Then cảnh báo Lưu / Thoát không lưu / Huỷ.</w:t>
       </w:r>
     </w:p>
     <w:p>
@@ -1004,25 +935,7 @@
         <w:t>AC2</w:t>
       </w:r>
       <w:r>
-        <w:t xml:space="preserve">: Given user bấm Lưu Then hệ thống </w:t>
-      </w:r>
-      <w:r>
-        <w:rPr>
-          <w:b/>
-        </w:rPr>
-        <w:t>hỏi xác nhận</w:t>
-      </w:r>
-      <w:r>
-        <w:t xml:space="preserve"> trước khi ghi thay đổi; áp dụng cho </w:t>
-      </w:r>
-      <w:r>
-        <w:rPr>
-          <w:b/>
-        </w:rPr>
-        <w:t>mọi chỉnh sửa</w:t>
-      </w:r>
-      <w:r>
-        <w:t xml:space="preserve"> (không riêng PT2 inline).</w:t>
+        <w:t>: Given user bấm Lưu Then hỏi xác nhận trước khi ghi.</w:t>
       </w:r>
     </w:p>
     <w:p>
@@ -1036,7 +949,7 @@
         <w:t>AC3</w:t>
       </w:r>
       <w:r>
-        <w:t>: Given còn thay đổi chưa lưu Then nút submit (Gửi AI / Gửi Legal) bị chặn cho đến khi lưu.</w:t>
+        <w:t>: Given còn thay đổi chưa lưu Then nút submit bị chặn đến khi lưu.</w:t>
       </w:r>
     </w:p>
     <w:p>
@@ -1044,120 +957,12 @@
         <w:pStyle w:val="Heading2"/>
       </w:pPr>
       <w:r>
-        <w:t xml:space="preserve">US-P11 — Purchasing Manager approve trước khi tới Legal · Demo ❌ </w:t>
-      </w:r>
-      <w:r>
-        <w:rPr>
-          <w:rFonts w:ascii="Consolas" w:hAnsi="Consolas"/>
-          <w:color w:val="6B2E2E"/>
-          <w:sz w:val="20"/>
-        </w:rPr>
-        <w:t>[A3 mới chốt — chờ xác nhận nguyên văn]</w:t>
-      </w:r>
-      <w:r>
-        <w:t xml:space="preserve"> </w:t>
-      </w:r>
-      <w:r>
-        <w:rPr>
-          <w:b/>
-        </w:rPr>
-        <w:t>(story mới, đổi scope)</w:t>
+        <w:t>US-P11 — Purchasing Manager approve trước Legal · Demo ✅ `/dashboard/tasks` `[A3 đã chốt]`</w:t>
       </w:r>
     </w:p>
     <w:p>
       <w:r>
-        <w:t>Là Purchasing Manager, tôi muốn duyệt ticket của nhân viên mình trước khi gửi Legal.</w:t>
-      </w:r>
-    </w:p>
-    <w:p>
-      <w:pPr>
-        <w:pStyle w:val="ListBullet"/>
-      </w:pPr>
-      <w:r>
-        <w:rPr>
-          <w:b/>
-        </w:rPr>
-        <w:t>AC1 (dự thảo)</w:t>
-      </w:r>
-      <w:r>
-        <w:t xml:space="preserve">: Given Purchasing submit Then ticket vào màn Task của </w:t>
-      </w:r>
-      <w:r>
-        <w:rPr>
-          <w:b/>
-        </w:rPr>
-        <w:t>Purchasing Manager</w:t>
-      </w:r>
-      <w:r>
-        <w:t xml:space="preserve"> để approve/reject trước, approve rồi mới chuyển </w:t>
-      </w:r>
-      <w:r>
-        <w:rPr>
-          <w:rFonts w:ascii="Consolas" w:hAnsi="Consolas"/>
-          <w:color w:val="6B2E2E"/>
-          <w:sz w:val="20"/>
-        </w:rPr>
-        <w:t>pending_legal</w:t>
-      </w:r>
-      <w:r>
-        <w:t>.</w:t>
-      </w:r>
-    </w:p>
-    <w:p>
-      <w:pPr>
-        <w:pStyle w:val="ListBullet"/>
-      </w:pPr>
-      <w:r>
-        <w:rPr>
-          <w:b/>
-        </w:rPr>
-        <w:t>AC2 (dự thảo)</w:t>
-      </w:r>
-      <w:r>
-        <w:t>: Given Manager reject Then ticket trả về màn Task của Purchasing kèm lý do, như luồng Legal reject.</w:t>
-      </w:r>
-    </w:p>
-    <w:p>
-      <w:pPr>
-        <w:pStyle w:val="ListBullet"/>
-      </w:pPr>
-      <w:r>
-        <w:t xml:space="preserve">Cần bổ sung: role mới </w:t>
-      </w:r>
-      <w:r>
-        <w:rPr>
-          <w:rFonts w:ascii="Consolas" w:hAnsi="Consolas"/>
-          <w:color w:val="6B2E2E"/>
-          <w:sz w:val="20"/>
-        </w:rPr>
-        <w:t>purchasing_manager</w:t>
-      </w:r>
-      <w:r>
-        <w:t>, quy tắc phân công (theo phòng ban?), tác động lên A5 (scope xem ticket). BA xác nhận với PM trước khi đưa vào Sprint 1.</w:t>
-      </w:r>
-    </w:p>
-    <w:p>
-      <w:pPr>
-        <w:pStyle w:val="Heading1"/>
-      </w:pPr>
-      <w:r>
-        <w:t>Epic 2 — Legal: Duyệt hợp đồng</w:t>
-      </w:r>
-    </w:p>
-    <w:p>
-      <w:pPr>
-        <w:pStyle w:val="Heading2"/>
-      </w:pPr>
-      <w:r>
-        <w:t xml:space="preserve">US-L01 — Màn Task chung (Legal + Purchasing) · Demo ✅ </w:t>
-      </w:r>
-      <w:r>
-        <w:rPr>
-          <w:rFonts w:ascii="Consolas" w:hAnsi="Consolas"/>
-          <w:color w:val="6B2E2E"/>
-          <w:sz w:val="20"/>
-        </w:rPr>
-        <w:t>/dashboard/tasks</w:t>
+        <w:t>Là Purchasing Manager, tôi muốn duyệt ticket của nhân viên trước khi gửi Legal.</w:t>
       </w:r>
     </w:p>
     <w:p>
@@ -1171,18 +976,119 @@
         <w:t>AC1</w:t>
       </w:r>
       <w:r>
-        <w:t xml:space="preserve">: Given đăng nhập Legal và có HĐ </w:t>
+        <w:t>: Given Purchasing Submit for approval Then ticket vào Task Manager (</w:t>
       </w:r>
       <w:r>
         <w:rPr>
           <w:rFonts w:ascii="Consolas" w:hAnsi="Consolas"/>
-          <w:color w:val="6B2E2E"/>
+          <w:sz w:val="20"/>
+        </w:rPr>
+        <w:t>pending_manager</w:t>
+      </w:r>
+      <w:r>
+        <w:t xml:space="preserve">); Manager Start → Approve → </w:t>
+      </w:r>
+      <w:r>
+        <w:rPr>
+          <w:rFonts w:ascii="Consolas" w:hAnsi="Consolas"/>
           <w:sz w:val="20"/>
         </w:rPr>
         <w:t>pending_legal</w:t>
       </w:r>
       <w:r>
-        <w:t xml:space="preserve"> Then màn Task hiển thị danh sách ticket chờ duyệt (2 cột Name/Action), bấm </w:t>
+        <w:t>.</w:t>
+      </w:r>
+    </w:p>
+    <w:p>
+      <w:pPr>
+        <w:pStyle w:val="ListBullet"/>
+      </w:pPr>
+      <w:r>
+        <w:rPr>
+          <w:b/>
+        </w:rPr>
+        <w:t>AC2</w:t>
+      </w:r>
+      <w:r>
+        <w:t>: Given Manager Reject Then ticket trả Purchasing (Task) kèm lý do/comment; có thể kèm file.</w:t>
+      </w:r>
+    </w:p>
+    <w:p>
+      <w:pPr>
+        <w:pStyle w:val="ListBullet"/>
+      </w:pPr>
+      <w:r>
+        <w:rPr>
+          <w:b/>
+        </w:rPr>
+        <w:t>AC3</w:t>
+      </w:r>
+      <w:r>
+        <w:t>: Given Manager duyệt Then áp dụng cùng TH1 (comment)/TH2 (Track Changes)/TH3 (tải–sửa–upload + Reject) như Legal (Blueprint).</w:t>
+      </w:r>
+    </w:p>
+    <w:p>
+      <w:pPr>
+        <w:pStyle w:val="ListBullet"/>
+      </w:pPr>
+      <w:r>
+        <w:rPr>
+          <w:b/>
+        </w:rPr>
+        <w:t>AC4</w:t>
+      </w:r>
+      <w:r>
+        <w:t xml:space="preserve">: Role </w:t>
+      </w:r>
+      <w:r>
+        <w:rPr>
+          <w:rFonts w:ascii="Consolas" w:hAnsi="Consolas"/>
+          <w:sz w:val="20"/>
+        </w:rPr>
+        <w:t>purchasing_manager</w:t>
+      </w:r>
+      <w:r>
+        <w:t>; Task cá nhân — chỉ thấy ticket cần mình xử lý.</w:t>
+      </w:r>
+    </w:p>
+    <w:p>
+      <w:pPr>
+        <w:pStyle w:val="Heading1"/>
+      </w:pPr>
+      <w:r>
+        <w:t>Epic 2 — Legal / Manager: Duyệt hợp đồng</w:t>
+      </w:r>
+    </w:p>
+    <w:p>
+      <w:pPr>
+        <w:pStyle w:val="Heading2"/>
+      </w:pPr>
+      <w:r>
+        <w:t>US-L01 — Màn Task (Purchasing / Manager / Legal) · Demo ✅ `/dashboard/tasks`</w:t>
+      </w:r>
+    </w:p>
+    <w:p>
+      <w:pPr>
+        <w:pStyle w:val="ListBullet"/>
+      </w:pPr>
+      <w:r>
+        <w:rPr>
+          <w:b/>
+        </w:rPr>
+        <w:t>AC1</w:t>
+      </w:r>
+      <w:r>
+        <w:t xml:space="preserve">: Given đăng nhập Legal và có HĐ </w:t>
+      </w:r>
+      <w:r>
+        <w:rPr>
+          <w:rFonts w:ascii="Consolas" w:hAnsi="Consolas"/>
+          <w:sz w:val="20"/>
+        </w:rPr>
+        <w:t>pending_legal</w:t>
+      </w:r>
+      <w:r>
+        <w:t xml:space="preserve"> Then Task hiển thị ticket chờ duyệt; bấm </w:t>
       </w:r>
       <w:r>
         <w:rPr>
@@ -1191,7 +1097,7 @@
         <w:t>Start</w:t>
       </w:r>
       <w:r>
-        <w:t xml:space="preserve"> mở chi tiết 2 bước.</w:t>
+        <w:t xml:space="preserve"> mở chi tiết.</w:t>
       </w:r>
     </w:p>
     <w:p>
@@ -1205,7 +1111,17 @@
         <w:t>AC2</w:t>
       </w:r>
       <w:r>
-        <w:t>: Given màn chi tiết (Legal) Then có 2 tab: "Thông tin chung" (intake read-only + file tải về + quyết định) và "AI Review" (chat read-only + document view, chia ngăn kéo được).</w:t>
+        <w:t xml:space="preserve">: Given đăng nhập Purchasing Manager và có HĐ </w:t>
+      </w:r>
+      <w:r>
+        <w:rPr>
+          <w:rFonts w:ascii="Consolas" w:hAnsi="Consolas"/>
+          <w:sz w:val="20"/>
+        </w:rPr>
+        <w:t>pending_manager</w:t>
+      </w:r>
+      <w:r>
+        <w:t xml:space="preserve"> Then Task hiển thị ticket chờ duyệt Manager.</w:t>
       </w:r>
     </w:p>
     <w:p>
@@ -1219,25 +1135,7 @@
         <w:t>AC3</w:t>
       </w:r>
       <w:r>
-        <w:t xml:space="preserve">: Given đăng nhập Purchasing và có ticket bị Legal reject Then màn Task hiển thị các ticket bị trả về </w:t>
-      </w:r>
-      <w:r>
-        <w:rPr>
-          <w:b/>
-        </w:rPr>
-        <w:t>của chính user đó</w:t>
-      </w:r>
-      <w:r>
-        <w:t xml:space="preserve"> kèm comment Legal; bấm </w:t>
-      </w:r>
-      <w:r>
-        <w:rPr>
-          <w:b/>
-        </w:rPr>
-        <w:t>Start</w:t>
-      </w:r>
-      <w:r>
-        <w:t xml:space="preserve"> mở thẳng workspace để sửa và gửi lại.</w:t>
+        <w:t>: Given màn chi tiết (Manager/Legal) Then có tab Thông tin chung + AI Review / quyết định Approve·Reject.</w:t>
       </w:r>
     </w:p>
     <w:p>
@@ -1251,18 +1149,16 @@
         <w:t>AC4</w:t>
       </w:r>
       <w:r>
-        <w:t xml:space="preserve">: Given ticket đổi trạng thái (submit → </w:t>
+        <w:t xml:space="preserve">: Given Purchasing có ticket bị reject Then Task hiển thị ticket trả về </w:t>
       </w:r>
       <w:r>
         <w:rPr>
-          <w:rFonts w:ascii="Consolas" w:hAnsi="Consolas"/>
-          <w:color w:val="6B2E2E"/>
-          <w:sz w:val="20"/>
+          <w:b/>
         </w:rPr>
-        <w:t>pending_legal</w:t>
-      </w:r>
-      <w:r>
-        <w:t>, reject → trả về) Then ticket tự chuyển sang màn Task của đúng người xử lý tiếp theo.</w:t>
+        <w:t>của chính user</w:t>
+      </w:r>
+      <w:r>
+        <w:t>; Start mở workspace.</w:t>
       </w:r>
     </w:p>
     <w:p>
@@ -1282,10 +1178,34 @@
         <w:rPr>
           <w:b/>
         </w:rPr>
-        <w:t>Task là cá nhân</w:t>
-      </w:r>
-      <w:r>
-        <w:t xml:space="preserve"> — user chỉ thấy task cần chính mình xử lý, không thấy task của người khác (IT cũng không xem được hàng chờ của Legal/Purchasing). Given user không có task Then hiển thị trạng thái trống "Bạn không có task nào cần xử lý", không render danh sách rỗng của mục khác.</w:t>
+        <w:t>Task cá nhân</w:t>
+      </w:r>
+      <w:r>
+        <w:t xml:space="preserve"> — không thấy task người khác. Không có task → trạng thái trống rõ ràng.</w:t>
+      </w:r>
+    </w:p>
+    <w:p>
+      <w:pPr>
+        <w:pStyle w:val="ListBullet"/>
+      </w:pPr>
+      <w:r>
+        <w:rPr>
+          <w:b/>
+        </w:rPr>
+        <w:t>AC6</w:t>
+      </w:r>
+      <w:r>
+        <w:t xml:space="preserve">: Task Name: dòng 1 = </w:t>
+      </w:r>
+      <w:r>
+        <w:rPr>
+          <w:rFonts w:ascii="Consolas" w:hAnsi="Consolas"/>
+          <w:sz w:val="20"/>
+        </w:rPr>
+        <w:t>Số tài liệu - Tên tài liệu</w:t>
+      </w:r>
+      <w:r>
+        <w:t>; dòng 2 = Họ tên người yêu cầu.</w:t>
       </w:r>
     </w:p>
     <w:p>
@@ -1326,22 +1246,12 @@
       <w:r>
         <w:rPr>
           <w:rFonts w:ascii="Consolas" w:hAnsi="Consolas"/>
-          <w:color w:val="6B2E2E"/>
           <w:sz w:val="20"/>
         </w:rPr>
         <w:t>[A4 đã chốt]</w:t>
       </w:r>
       <w:r>
-        <w:t xml:space="preserve">: Given reject kèm comment + file đính kèm Then feedback lưu đầy đủ (kể cả nội dung file) và </w:t>
-      </w:r>
-      <w:r>
-        <w:rPr>
-          <w:b/>
-        </w:rPr>
-        <w:t>Purchasing tải được</w:t>
-      </w:r>
-      <w:r>
-        <w:t>.</w:t>
+        <w:t>: Given reject kèm comment + file đính kèm Then feedback lưu đầy đủ; Purchasing tải được.</w:t>
       </w:r>
     </w:p>
     <w:p>
@@ -1355,7 +1265,41 @@
         <w:t>AC3</w:t>
       </w:r>
       <w:r>
-        <w:t>: Given Approve Then trạng thái → đồng bộ Econtract, có trace kết quả gọi API.</w:t>
+        <w:t xml:space="preserve">: Given Manager Approve Then → </w:t>
+      </w:r>
+      <w:r>
+        <w:rPr>
+          <w:rFonts w:ascii="Consolas" w:hAnsi="Consolas"/>
+          <w:sz w:val="20"/>
+        </w:rPr>
+        <w:t>pending_legal</w:t>
+      </w:r>
+      <w:r>
+        <w:t>. Given Legal Approve Then → đồng bộ Econtract (trace API).</w:t>
+      </w:r>
+    </w:p>
+    <w:p>
+      <w:pPr>
+        <w:pStyle w:val="ListBullet"/>
+      </w:pPr>
+      <w:r>
+        <w:rPr>
+          <w:b/>
+        </w:rPr>
+        <w:t>AC4</w:t>
+      </w:r>
+      <w:r>
+        <w:t xml:space="preserve"> </w:t>
+      </w:r>
+      <w:r>
+        <w:rPr>
+          <w:rFonts w:ascii="Consolas" w:hAnsi="Consolas"/>
+          <w:sz w:val="20"/>
+        </w:rPr>
+        <w:t>[TH1/TH2/TH3]</w:t>
+      </w:r>
+      <w:r>
+        <w:t>: Manager và Legal đều có đủ 3 trường hợp xử lý khi duyệt (comment / Track Changes / tải–sửa–upload + Reject) theo Blueprint.</w:t>
       </w:r>
     </w:p>
     <w:p>
@@ -1377,23 +1321,39 @@
         <w:t>AC1</w:t>
       </w:r>
       <w:r>
-        <w:t>: Given đăng nhập Legal Then thấy tất cả HĐ mọi Purchasing, kèm bộ lọc trạng thái/loại.</w:t>
+        <w:t>: Given đăng nhập Legal (hoặc IT/role có quyền list) Then thấy tất cả HĐ, kèm bộ lọc.</w:t>
       </w:r>
     </w:p>
     <w:p>
       <w:pPr>
-        <w:pStyle w:val="Heading2"/>
-      </w:pPr>
-      <w:r>
-        <w:t xml:space="preserve">US-L04 — Comment 2 chiều theo field/đoạn · Demo ❌ </w:t>
+        <w:pStyle w:val="ListBullet"/>
+      </w:pPr>
+      <w:r>
+        <w:rPr>
+          <w:b/>
+        </w:rPr>
+        <w:t>AC2</w:t>
+      </w:r>
+      <w:r>
+        <w:t>: Nút Quay lại từ Cấu hình HĐ / Configurations về danh sách HĐ (</w:t>
       </w:r>
       <w:r>
         <w:rPr>
           <w:rFonts w:ascii="Consolas" w:hAnsi="Consolas"/>
-          <w:color w:val="6B2E2E"/>
           <w:sz w:val="20"/>
         </w:rPr>
-        <w:t>[phụ thuộc A4]</w:t>
+        <w:t>/dashboard</w:t>
+      </w:r>
+      <w:r>
+        <w:t>).</w:t>
+      </w:r>
+    </w:p>
+    <w:p>
+      <w:pPr>
+        <w:pStyle w:val="Heading2"/>
+      </w:pPr>
+      <w:r>
+        <w:t>US-L04 — Comment 2 chiều theo field/đoạn · Demo ❌ `[phụ thuộc A4 / PA-A·PA-B]`</w:t>
       </w:r>
     </w:p>
     <w:p>
@@ -1407,18 +1367,7 @@
         <w:t>AC1</w:t>
       </w:r>
       <w:r>
-        <w:t xml:space="preserve">: Given Legal (hoặc Purchasing) chọn 1 field/đoạn When thêm comment Then comment anchor theo vị trí (kiểu </w:t>
-      </w:r>
-      <w:r>
-        <w:rPr>
-          <w:rFonts w:ascii="Consolas" w:hAnsi="Consolas"/>
-          <w:color w:val="6B2E2E"/>
-          <w:sz w:val="20"/>
-        </w:rPr>
-        <w:t>w:commentRange</w:t>
-      </w:r>
-      <w:r>
-        <w:t>, không theo số dòng), hiển thị trong panel riêng, 2 bên reply được cùng thread.</w:t>
+        <w:t>: Given Manager/Legal chọn đoạn When thêm comment Then comment anchor theo vị trí, thread 2 chiều.</w:t>
       </w:r>
     </w:p>
     <w:p>
@@ -1432,7 +1381,7 @@
         <w:t>AC2</w:t>
       </w:r>
       <w:r>
-        <w:t>: Given đoạn được comment bị xoá trong version sau Then comment chuyển trạng thái "orphaned" nhưng vẫn hiển thị.</w:t>
+        <w:t>: Given đoạn bị xoá Then comment "orphaned" vẫn hiển thị.</w:t>
       </w:r>
     </w:p>
     <w:p>
@@ -1446,23 +1395,29 @@
         <w:t>AC3</w:t>
       </w:r>
       <w:r>
-        <w:t>: Given nhiều comment Then hệ thống tự tổng hợp thành checklist việc cần sửa cho Purchasing.</w:t>
+        <w:t>: Given nhiều comment Then tổng hợp checklist việc cần sửa cho Purchasing.</w:t>
       </w:r>
     </w:p>
     <w:p>
       <w:pPr>
+        <w:pStyle w:val="ListBullet"/>
+      </w:pPr>
+      <w:r>
+        <w:rPr>
+          <w:b/>
+        </w:rPr>
+        <w:t>AC4</w:t>
+      </w:r>
+      <w:r>
+        <w:t>: Lưu trữ theo PA-A (gắn version) và/hoặc PA-B (ghi trong .docx) — chốt Tech Design.</w:t>
+      </w:r>
+    </w:p>
+    <w:p>
+      <w:pPr>
         <w:pStyle w:val="Heading2"/>
       </w:pPr>
       <w:r>
-        <w:t xml:space="preserve">US-L05 — Track Changes của Legal (chỉ vùng mở, luôn kèm Reject) · Demo ❌ </w:t>
-      </w:r>
-      <w:r>
-        <w:rPr>
-          <w:rFonts w:ascii="Consolas" w:hAnsi="Consolas"/>
-          <w:color w:val="6B2E2E"/>
-          <w:sz w:val="20"/>
-        </w:rPr>
-        <w:t>[phụ thuộc A4b]</w:t>
+        <w:t>US-L05 — Track Changes (chỉ vùng mở, luôn kèm Reject) · Demo ❌ `[phụ thuộc A4b]`</w:t>
       </w:r>
     </w:p>
     <w:p>
@@ -1476,7 +1431,7 @@
         <w:t>AC1</w:t>
       </w:r>
       <w:r>
-        <w:t>: Given Legal tô đen text vùng mở When nhập nội dung mới qua popup Then sinh diff đỏ/xanh tách lớp với diff AI (không sửa trực tiếp file).</w:t>
+        <w:t>: Given Manager/Legal tô vùng mở When nhập đề xuất Then sinh diff đỏ/xanh tách lớp với diff AI.</w:t>
       </w:r>
     </w:p>
     <w:p>
@@ -1490,7 +1445,7 @@
         <w:t>AC2</w:t>
       </w:r>
       <w:r>
-        <w:t>: Given Legal có track changes Then chỉ được Reject (không có sửa + approve).</w:t>
+        <w:t>: Given có Track Changes Then chỉ Reject (không Approve kèm sửa).</w:t>
       </w:r>
     </w:p>
     <w:p>
@@ -1504,7 +1459,7 @@
         <w:t>AC3</w:t>
       </w:r>
       <w:r>
-        <w:t>: Given Purchasing nhận bản reject Then Accept (ghi giá trị Legal đề xuất) / Undo từng dòng hoặc cả file, và phải chủ động bấm "Gửi Legal duyệt" lại (version bump theo bộ đếm chung).</w:t>
+        <w:t>: Given Purchasing nhận reject Then Accept/Undo từng dòng hoặc cả file, rồi Submit for approval lại.</w:t>
       </w:r>
     </w:p>
     <w:p>
@@ -1512,7 +1467,7 @@
         <w:pStyle w:val="Heading1"/>
       </w:pPr>
       <w:r>
-        <w:t>Epic 3 — Legal / Legal Lead: Cấu hình checklist</w:t>
+        <w:t>Epic 3 — Legal: Cấu hình checklist</w:t>
       </w:r>
     </w:p>
     <w:p>
@@ -1520,15 +1475,21 @@
         <w:pStyle w:val="Heading2"/>
       </w:pPr>
       <w:r>
-        <w:t xml:space="preserve">US-C01 — CRUD checklist theo loại HĐ · Demo ✅ </w:t>
+        <w:t>US-C01 — Cấu hình checklist loại HĐ cha · Demo ✅ `/dashboard/config`</w:t>
+      </w:r>
+    </w:p>
+    <w:p>
+      <w:r>
+        <w:t xml:space="preserve">Là Legal, tôi muốn soạn checklist Ideal/Fallback/Red Line gắn </w:t>
       </w:r>
       <w:r>
         <w:rPr>
-          <w:rFonts w:ascii="Consolas" w:hAnsi="Consolas"/>
-          <w:color w:val="6B2E2E"/>
-          <w:sz w:val="20"/>
+          <w:b/>
         </w:rPr>
-        <w:t>/dashboard/config</w:t>
+        <w:t>Loại hợp đồng</w:t>
+      </w:r>
+      <w:r>
+        <w:t xml:space="preserve"> (Form lists) để mọi Tên HĐ con được hưởng.</w:t>
       </w:r>
     </w:p>
     <w:p>
@@ -1542,7 +1503,36 @@
         <w:t>AC1</w:t>
       </w:r>
       <w:r>
-        <w:t>: Given bản Draft When thêm/sửa điều khoản Then đủ trường: mã, tên, Loại (bắt buộc/cấm/khuyến nghị), Mức độ (Block/cảnh báo cao/thấp), Ideal/Fallback/Red Line, rationale, keywords, điều kiện, field liên kết, cấp duyệt vượt Fallback.</w:t>
+        <w:t xml:space="preserve">: Given quyền </w:t>
+      </w:r>
+      <w:r>
+        <w:rPr>
+          <w:rFonts w:ascii="Consolas" w:hAnsi="Consolas"/>
+          <w:sz w:val="20"/>
+        </w:rPr>
+        <w:t>contract_config</w:t>
+      </w:r>
+      <w:r>
+        <w:t xml:space="preserve"> When mở </w:t>
+      </w:r>
+      <w:r>
+        <w:rPr>
+          <w:rFonts w:ascii="Consolas" w:hAnsi="Consolas"/>
+          <w:sz w:val="20"/>
+        </w:rPr>
+        <w:t>/dashboard/config</w:t>
+      </w:r>
+      <w:r>
+        <w:t xml:space="preserve"> Then thấy card theo từng Loại HĐ </w:t>
+      </w:r>
+      <w:r>
+        <w:rPr>
+          <w:b/>
+        </w:rPr>
+        <w:t>active</w:t>
+      </w:r>
+      <w:r>
+        <w:t xml:space="preserve"> (không hiện loại đã lưu trữ Form lists).</w:t>
       </w:r>
     </w:p>
     <w:p>
@@ -1556,15 +1546,130 @@
         <w:t>AC2</w:t>
       </w:r>
       <w:r>
-        <w:t>: Given người soạn là Legal (không phải Lead) Then không thấy nút Publish (tách quyền soạn/publish).</w:t>
+        <w:t xml:space="preserve">: Given bấm </w:t>
+      </w:r>
+      <w:r>
+        <w:rPr>
+          <w:b/>
+        </w:rPr>
+        <w:t>Cấu hình</w:t>
+      </w:r>
+      <w:r>
+        <w:t xml:space="preserve"> trên loại cha When chưa có config Then tạo </w:t>
+      </w:r>
+      <w:r>
+        <w:rPr>
+          <w:rFonts w:ascii="Consolas" w:hAnsi="Consolas"/>
+          <w:sz w:val="20"/>
+        </w:rPr>
+        <w:t>ContractTypeConfigVersion</w:t>
+      </w:r>
+      <w:r>
+        <w:t xml:space="preserve"> (</w:t>
+      </w:r>
+      <w:r>
+        <w:rPr>
+          <w:rFonts w:ascii="Consolas" w:hAnsi="Consolas"/>
+          <w:sz w:val="20"/>
+        </w:rPr>
+        <w:t>configLayer: parent</w:t>
+      </w:r>
+      <w:r>
+        <w:t xml:space="preserve">, </w:t>
+      </w:r>
+      <w:r>
+        <w:rPr>
+          <w:rFonts w:ascii="Consolas" w:hAnsi="Consolas"/>
+          <w:sz w:val="20"/>
+        </w:rPr>
+        <w:t>contractTypeId = category.id</w:t>
+      </w:r>
+      <w:r>
+        <w:t>).</w:t>
       </w:r>
     </w:p>
     <w:p>
       <w:pPr>
+        <w:pStyle w:val="ListBullet"/>
+      </w:pPr>
+      <w:r>
+        <w:rPr>
+          <w:b/>
+        </w:rPr>
+        <w:t>AC3</w:t>
+      </w:r>
+      <w:r>
+        <w:t xml:space="preserve">: Given thêm/sửa điều khoản Then đủ trường: mã tự sinh </w:t>
+      </w:r>
+      <w:r>
+        <w:rPr>
+          <w:rFonts w:ascii="Consolas" w:hAnsi="Consolas"/>
+          <w:sz w:val="20"/>
+        </w:rPr>
+        <w:t>CL-xxx</w:t>
+      </w:r>
+      <w:r>
+        <w:t xml:space="preserve"> (read-only), tên, Loại, Severity, Ideal/Fallback/Red Line, rationale, keywords/patterns, bật rule/semantic. </w:t>
+      </w:r>
+      <w:r>
+        <w:rPr>
+          <w:b/>
+        </w:rPr>
+        <w:t>Không</w:t>
+      </w:r>
+      <w:r>
+        <w:t xml:space="preserve"> còn Content Control, cấp duyệt Fallback, đối tác, GT HĐ tối thiểu trên UI.</w:t>
+      </w:r>
+    </w:p>
+    <w:p>
+      <w:pPr>
+        <w:pStyle w:val="ListBullet"/>
+      </w:pPr>
+      <w:r>
+        <w:rPr>
+          <w:b/>
+        </w:rPr>
+        <w:t>AC4</w:t>
+      </w:r>
+      <w:r>
+        <w:t>: Given bấm Lưu Then cấu hình ghi nhận; AI review dùng bản đã Lưu (không Draft/Publish). Audit trail ghi ai/lúc nào/thay đổi gì.</w:t>
+      </w:r>
+    </w:p>
+    <w:p>
+      <w:pPr>
+        <w:pStyle w:val="ListBullet"/>
+      </w:pPr>
+      <w:r>
+        <w:rPr>
+          <w:b/>
+        </w:rPr>
+        <w:t>AC5</w:t>
+      </w:r>
+      <w:r>
+        <w:t xml:space="preserve">: Given nút Quay lại Then về danh sách HĐ </w:t>
+      </w:r>
+      <w:r>
+        <w:rPr>
+          <w:rFonts w:ascii="Consolas" w:hAnsi="Consolas"/>
+          <w:sz w:val="20"/>
+        </w:rPr>
+        <w:t>/dashboard</w:t>
+      </w:r>
+      <w:r>
+        <w:t>.</w:t>
+      </w:r>
+    </w:p>
+    <w:p>
+      <w:pPr>
         <w:pStyle w:val="Heading2"/>
       </w:pPr>
       <w:r>
-        <w:t>US-C02 — Publish với governance · Demo ✅</w:t>
+        <w:t>US-C05 — Overlay checklist theo Tên HĐ (opt-in) · Demo ✅ `/dashboard/config`</w:t>
+      </w:r>
+    </w:p>
+    <w:p>
+      <w:r>
+        <w:t>Là Legal, tôi muốn (tuỳ chọn) thêm cấu hình riêng cho một Tên HĐ; AI gộp với checklist loại cha.</w:t>
       </w:r>
     </w:p>
     <w:p>
@@ -1578,7 +1683,16 @@
         <w:t>AC1</w:t>
       </w:r>
       <w:r>
-        <w:t>: Given Legal Lead publish bản Draft Then bản Published cũ (nếu có) chuyển Archived — mỗi loại HĐ chỉ 1 bản Published.</w:t>
+        <w:t xml:space="preserve">: Given loại cha When chưa chọn overlay Then bảng con </w:t>
+      </w:r>
+      <w:r>
+        <w:rPr>
+          <w:b/>
+        </w:rPr>
+        <w:t>không</w:t>
+      </w:r>
+      <w:r>
+        <w:t xml:space="preserve"> liệt kê mọi tên Form lists — chỉ hiện tên đã có overlay.</w:t>
       </w:r>
     </w:p>
     <w:p>
@@ -1592,49 +1706,75 @@
         <w:t>AC2</w:t>
       </w:r>
       <w:r>
-        <w:t>: Given publish Then audit trail ghi ai/lúc nào/thay đổi gì.</w:t>
+        <w:t>: Given chọn tên trong dropdown “Thêm cấu hình riêng” + Thêm Then tạo overlay (</w:t>
+      </w:r>
+      <w:r>
+        <w:rPr>
+          <w:rFonts w:ascii="Consolas" w:hAnsi="Consolas"/>
+          <w:sz w:val="20"/>
+        </w:rPr>
+        <w:t>configLayer: child</w:t>
+      </w:r>
+      <w:r>
+        <w:t>) và mở chi tiết.</w:t>
       </w:r>
     </w:p>
     <w:p>
       <w:pPr>
-        <w:pStyle w:val="Heading2"/>
-      </w:pPr>
-      <w:r>
-        <w:t xml:space="preserve">US-C03 — Import/Export checklist · ❌ </w:t>
-      </w:r>
+        <w:pStyle w:val="ListBullet"/>
+      </w:pPr>
       <w:r>
         <w:rPr>
           <w:b/>
         </w:rPr>
-        <w:t>Bỏ khỏi Sprint 1</w:t>
-      </w:r>
-      <w:r>
-        <w:t xml:space="preserve"> </w:t>
+        <w:t>AC3</w:t>
+      </w:r>
+      <w:r>
+        <w:t xml:space="preserve">: Given AI review HĐ có </w:t>
       </w:r>
       <w:r>
         <w:rPr>
           <w:rFonts w:ascii="Consolas" w:hAnsi="Consolas"/>
-          <w:color w:val="6B2E2E"/>
           <w:sz w:val="20"/>
         </w:rPr>
-        <w:t>[A10 đã chốt]</w:t>
+        <w:t>intake.contractNameId</w:t>
+      </w:r>
+      <w:r>
+        <w:t xml:space="preserve"> Then </w:t>
+      </w:r>
+      <w:r>
+        <w:rPr>
+          <w:rFonts w:ascii="Consolas" w:hAnsi="Consolas"/>
+          <w:sz w:val="20"/>
+        </w:rPr>
+        <w:t>getMergedConfigForContractName</w:t>
+      </w:r>
+      <w:r>
+        <w:t xml:space="preserve"> = cha ∪ con; cùng </w:t>
+      </w:r>
+      <w:r>
+        <w:rPr>
+          <w:rFonts w:ascii="Consolas" w:hAnsi="Consolas"/>
+          <w:sz w:val="20"/>
+        </w:rPr>
+        <w:t>clause.code</w:t>
+      </w:r>
+      <w:r>
+        <w:t xml:space="preserve"> → bản con thắng; không overlay → chỉ cha.</w:t>
       </w:r>
     </w:p>
     <w:p>
       <w:pPr>
         <w:pStyle w:val="ListBullet"/>
       </w:pPr>
-      <w:r>
-        <w:t xml:space="preserve">PM quyết định </w:t>
-      </w:r>
       <w:r>
         <w:rPr>
           <w:b/>
         </w:rPr>
-        <w:t>bỏ Import/Export checklist</w:t>
-      </w:r>
-      <w:r>
-        <w:t xml:space="preserve"> khỏi scope Sprint 1 → chuyển backlog. Legal soạn checklist trực tiếp trên UI (US-C01). Template file trao đổi (nếu cần lại) sẽ chốt sau.</w:t>
+        <w:t>AC4</w:t>
+      </w:r>
+      <w:r>
+        <w:t>: Given Xóa overlay When usage = 0 Then overlay bị xóa, tên biến mất khỏi bảng; tên vẫn trên Form lists và vẫn hưởng checklist cha. Usage &gt; 0 → chặn xóa.</w:t>
       </w:r>
     </w:p>
     <w:p>
@@ -1642,7 +1782,48 @@
         <w:pStyle w:val="Heading2"/>
       </w:pPr>
       <w:r>
-        <w:t>US-C04 — Quản lý Approval Matrix · Demo 🟡 (chỉ link, chưa CRUD)</w:t>
+        <w:t>US-C02 — Publish với governance · ❌ **Bỏ khỏi Sprint 1**</w:t>
+      </w:r>
+    </w:p>
+    <w:p>
+      <w:pPr>
+        <w:pStyle w:val="ListBullet"/>
+      </w:pPr>
+      <w:r>
+        <w:t xml:space="preserve">Đã chốt: chỉ </w:t>
+      </w:r>
+      <w:r>
+        <w:rPr>
+          <w:b/>
+        </w:rPr>
+        <w:t>Sửa + Lưu</w:t>
+      </w:r>
+      <w:r>
+        <w:t>. Không Draft → Published; không role Legal Lead; không hạng mục quyền Publish checklist.</w:t>
+      </w:r>
+    </w:p>
+    <w:p>
+      <w:pPr>
+        <w:pStyle w:val="Heading2"/>
+      </w:pPr>
+      <w:r>
+        <w:t>US-C03 — Import/Export checklist · ❌ **Bỏ khỏi Sprint 1** `[A10 đã chốt]`</w:t>
+      </w:r>
+    </w:p>
+    <w:p>
+      <w:pPr>
+        <w:pStyle w:val="ListBullet"/>
+      </w:pPr>
+      <w:r>
+        <w:t>Legal soạn checklist trực tiếp trên UI (US-C01 / US-C05).</w:t>
+      </w:r>
+    </w:p>
+    <w:p>
+      <w:pPr>
+        <w:pStyle w:val="Heading2"/>
+      </w:pPr>
+      <w:r>
+        <w:t>US-C04 — Quản lý Approval Matrix · Demo 🟡 (metadata / link, chưa CRUD đầy đủ)</w:t>
       </w:r>
     </w:p>
     <w:p>
@@ -1656,7 +1837,7 @@
         <w:t>AC1</w:t>
       </w:r>
       <w:r>
-        <w:t>: Given quyền phù hợp When tạo/sửa matrix (ngưỡng giá trị ↔ cấp duyệt) Then lưu được và link vào loại HĐ.</w:t>
+        <w:t>: Given cấu hình loại HĐ Then có thể gắn/tham chiếu matrix (global hoặc theo loại) trên list/meta.</w:t>
       </w:r>
     </w:p>
     <w:p>
@@ -1670,27 +1851,7 @@
         <w:t>AC2</w:t>
       </w:r>
       <w:r>
-        <w:t xml:space="preserve"> </w:t>
-      </w:r>
-      <w:r>
-        <w:rPr>
-          <w:rFonts w:ascii="Consolas" w:hAnsi="Consolas"/>
-          <w:color w:val="6B2E2E"/>
-          <w:sz w:val="20"/>
-        </w:rPr>
-        <w:t>[phụ thuộc A3 — đang xác nhận lại]</w:t>
-      </w:r>
-      <w:r>
-        <w:t xml:space="preserve">: A3 mới chốt luồng duyệt </w:t>
-      </w:r>
-      <w:r>
-        <w:rPr>
-          <w:b/>
-        </w:rPr>
-        <w:t>có thêm bước Purchasing Manager approve</w:t>
-      </w:r>
-      <w:r>
-        <w:t xml:space="preserve"> trước Legal (khác single-step trước đây); vai trò của matrix (chỉ cảnh báo + % tin cậy hay routing) cần chốt lại theo luồng mới.</w:t>
+        <w:t>: Vai trò matrix với luồng Manager → Legal (routing vs cảnh báo + summary) — chốt Tech Design; demo chưa CRUD matrix đầy đủ.</w:t>
       </w:r>
     </w:p>
     <w:p>
@@ -1706,15 +1867,12 @@
         <w:pStyle w:val="Heading2"/>
       </w:pPr>
       <w:r>
-        <w:t xml:space="preserve">US-I01 — Quản lý form lists · Demo ✅ </w:t>
-      </w:r>
-      <w:r>
-        <w:rPr>
-          <w:rFonts w:ascii="Consolas" w:hAnsi="Consolas"/>
-          <w:color w:val="6B2E2E"/>
-          <w:sz w:val="20"/>
-        </w:rPr>
-        <w:t>/dashboard/configurations</w:t>
+        <w:t>US-I01 — Quản lý Form lists · Demo ✅ `/dashboard/configurations`</w:t>
+      </w:r>
+    </w:p>
+    <w:p>
+      <w:r>
+        <w:t>Là IT, tôi muốn quản trị danh mục dropdown form Tạo tài liệu, gồm Lưu trữ an toàn khi đã có giao dịch.</w:t>
       </w:r>
     </w:p>
     <w:p>
@@ -1728,7 +1886,7 @@
         <w:t>AC1</w:t>
       </w:r>
       <w:r>
-        <w:t>: Given role IT When sửa danh sách (loại tài liệu, contract name, business entity, contract base, chiết khấu) Then form tạo review dùng giá trị mới.</w:t>
+        <w:t>: Given quyền Form lists When sửa Mã/Giá trị (Loại HĐ, Tên HĐ, Công ty, Loại giá trị, HĐ tiêu chuẩn, nhãn Chiết khấu) + Lưu Then form tạo review dùng giá trị mới.</w:t>
       </w:r>
     </w:p>
     <w:p>
@@ -1742,23 +1900,126 @@
         <w:t>AC2</w:t>
       </w:r>
       <w:r>
-        <w:t>: Given role khác IT Then bị redirect khỏi màn Configurations.</w:t>
+        <w:t xml:space="preserve">: Given giá trị </w:t>
+      </w:r>
+      <w:r>
+        <w:rPr>
+          <w:b/>
+        </w:rPr>
+        <w:t>chưa</w:t>
+      </w:r>
+      <w:r>
+        <w:t xml:space="preserve"> có HĐ dùng When Xóa Then xóa được. Given </w:t>
+      </w:r>
+      <w:r>
+        <w:rPr>
+          <w:b/>
+        </w:rPr>
+        <w:t>đã</w:t>
+      </w:r>
+      <w:r>
+        <w:t xml:space="preserve"> có ≥1 HĐ When Xóa Then chặn — chỉ </w:t>
+      </w:r>
+      <w:r>
+        <w:rPr>
+          <w:b/>
+        </w:rPr>
+        <w:t>Lưu trữ</w:t>
+      </w:r>
+      <w:r>
+        <w:t>.</w:t>
       </w:r>
     </w:p>
     <w:p>
       <w:pPr>
-        <w:pStyle w:val="Heading2"/>
-      </w:pPr>
-      <w:r>
-        <w:t xml:space="preserve">US-I02 — Quản lý System Prompt · Demo ✅ (ghi file thật) </w:t>
+        <w:pStyle w:val="ListBullet"/>
+      </w:pPr>
+      <w:r>
+        <w:rPr>
+          <w:b/>
+        </w:rPr>
+        <w:t>AC3</w:t>
+      </w:r>
+      <w:r>
+        <w:t>: Given Lưu trữ Then giá trị ẩn khỏi dropdown form tạo và list Cấu hình loại HĐ; HĐ cũ giữ tham chiếu.</w:t>
+      </w:r>
+    </w:p>
+    <w:p>
+      <w:pPr>
+        <w:pStyle w:val="ListBullet"/>
+      </w:pPr>
+      <w:r>
+        <w:rPr>
+          <w:b/>
+        </w:rPr>
+        <w:t>AC4</w:t>
+      </w:r>
+      <w:r>
+        <w:t xml:space="preserve">: Given nút </w:t>
+      </w:r>
+      <w:r>
+        <w:rPr>
+          <w:b/>
+        </w:rPr>
+        <w:t>Đã lưu trữ (n)</w:t>
+      </w:r>
+      <w:r>
+        <w:t xml:space="preserve"> trên header từng khối When bật Then hiện dòng archived (ô nhập disabled) + </w:t>
+      </w:r>
+      <w:r>
+        <w:rPr>
+          <w:b/>
+        </w:rPr>
+        <w:t>Bỏ lưu trữ</w:t>
+      </w:r>
+      <w:r>
+        <w:t>.</w:t>
+      </w:r>
+    </w:p>
+    <w:p>
+      <w:pPr>
+        <w:pStyle w:val="ListBullet"/>
+      </w:pPr>
+      <w:r>
+        <w:rPr>
+          <w:b/>
+        </w:rPr>
+        <w:t>AC5</w:t>
+      </w:r>
+      <w:r>
+        <w:t>: Given Chiết khấu (yes/no) Then chỉ sửa nhãn — không Thêm/Xóa/Lưu trữ.</w:t>
+      </w:r>
+    </w:p>
+    <w:p>
+      <w:pPr>
+        <w:pStyle w:val="ListBullet"/>
+      </w:pPr>
+      <w:r>
+        <w:rPr>
+          <w:b/>
+        </w:rPr>
+        <w:t>AC6</w:t>
+      </w:r>
+      <w:r>
+        <w:t xml:space="preserve">: Given nút Quay lại Then về </w:t>
       </w:r>
       <w:r>
         <w:rPr>
           <w:rFonts w:ascii="Consolas" w:hAnsi="Consolas"/>
-          <w:color w:val="6B2E2E"/>
           <w:sz w:val="20"/>
         </w:rPr>
-        <w:t>[phụ thuộc B7]</w:t>
+        <w:t>/dashboard</w:t>
+      </w:r>
+      <w:r>
+        <w:t>. User không đủ quyền → redirect.</w:t>
+      </w:r>
+    </w:p>
+    <w:p>
+      <w:pPr>
+        <w:pStyle w:val="Heading2"/>
+      </w:pPr>
+      <w:r>
+        <w:t>US-I02 — Quản lý System Prompt · Demo ✅ `[phụ thuộc B7]`</w:t>
       </w:r>
     </w:p>
     <w:p>
@@ -1772,18 +2033,46 @@
         <w:t>AC1</w:t>
       </w:r>
       <w:r>
-        <w:t>: Given IT sửa prompt CURRENT của 1 stage Then validate placeholder (</w:t>
+        <w:t xml:space="preserve">: Given IT mở tab System prompts Then thấy </w:t>
+      </w:r>
+      <w:r>
+        <w:rPr>
+          <w:b/>
+        </w:rPr>
+        <w:t>3 stage</w:t>
+      </w:r>
+      <w:r>
+        <w:t xml:space="preserve">: </w:t>
       </w:r>
       <w:r>
         <w:rPr>
           <w:rFonts w:ascii="Consolas" w:hAnsi="Consolas"/>
-          <w:color w:val="6B2E2E"/>
           <w:sz w:val="20"/>
         </w:rPr>
-        <w:t>{{checklist_items}}</w:t>
-      </w:r>
-      <w:r>
-        <w:t>…) và chặn hardcode heuristic pháp lý trước khi lưu.</w:t>
+        <w:t>checklist_review</w:t>
+      </w:r>
+      <w:r>
+        <w:t xml:space="preserve"> · </w:t>
+      </w:r>
+      <w:r>
+        <w:rPr>
+          <w:rFonts w:ascii="Consolas" w:hAnsi="Consolas"/>
+          <w:sz w:val="20"/>
+        </w:rPr>
+        <w:t>chat_edit</w:t>
+      </w:r>
+      <w:r>
+        <w:t xml:space="preserve"> · </w:t>
+      </w:r>
+      <w:r>
+        <w:rPr>
+          <w:rFonts w:ascii="Consolas" w:hAnsi="Consolas"/>
+          <w:sz w:val="20"/>
+        </w:rPr>
+        <w:t>ai_summary_fairness</w:t>
+      </w:r>
+      <w:r>
+        <w:t xml:space="preserve"> (không còn Field validation).</w:t>
       </w:r>
     </w:p>
     <w:p>
@@ -1797,42 +2086,49 @@
         <w:t>AC2</w:t>
       </w:r>
       <w:r>
-        <w:t xml:space="preserve">: Given prompt thay đổi trên Git Then CI </w:t>
+        <w:t>: Given sửa prompt CURRENT Then validate placeholder (</w:t>
       </w:r>
       <w:r>
         <w:rPr>
           <w:rFonts w:ascii="Consolas" w:hAnsi="Consolas"/>
-          <w:color w:val="6B2E2E"/>
+          <w:sz w:val="20"/>
+        </w:rPr>
+        <w:t>{{checklist_items}}</w:t>
+      </w:r>
+      <w:r>
+        <w:t>…) và chặn hardcode nội dung pháp lý trước khi lưu.</w:t>
+      </w:r>
+    </w:p>
+    <w:p>
+      <w:pPr>
+        <w:pStyle w:val="ListBullet"/>
+      </w:pPr>
+      <w:r>
+        <w:rPr>
+          <w:b/>
+        </w:rPr>
+        <w:t>AC3</w:t>
+      </w:r>
+      <w:r>
+        <w:t xml:space="preserve">: Given thay đổi trên Git Then CI </w:t>
+      </w:r>
+      <w:r>
+        <w:rPr>
+          <w:rFonts w:ascii="Consolas" w:hAnsi="Consolas"/>
           <w:sz w:val="20"/>
         </w:rPr>
         <w:t>validate-prompts</w:t>
       </w:r>
       <w:r>
-        <w:t xml:space="preserve"> phải pass mới merge được.</w:t>
+        <w:t xml:space="preserve"> phải pass mới merge.</w:t>
       </w:r>
     </w:p>
     <w:p>
       <w:pPr>
-        <w:pStyle w:val="Heading1"/>
-      </w:pPr>
-      <w:r>
-        <w:t>Epic 5 — Hệ thống: AI Engine &amp; Tích hợp (backend mới hoàn toàn)</w:t>
-      </w:r>
-    </w:p>
-    <w:p>
-      <w:pPr>
         <w:pStyle w:val="Heading2"/>
       </w:pPr>
       <w:r>
-        <w:t xml:space="preserve">US-S01 — AI Review Engine thật · Demo ❌ </w:t>
-      </w:r>
-      <w:r>
-        <w:rPr>
-          <w:rFonts w:ascii="Consolas" w:hAnsi="Consolas"/>
-          <w:color w:val="6B2E2E"/>
-          <w:sz w:val="20"/>
-        </w:rPr>
-        <w:t>[phụ thuộc B1–B5]</w:t>
+        <w:t>US-I03 — Users &amp; phân quyền hạng mục · Demo ✅ `/dashboard/users`</w:t>
       </w:r>
     </w:p>
     <w:p>
@@ -1846,18 +2142,7 @@
         <w:t>AC1</w:t>
       </w:r>
       <w:r>
-        <w:t xml:space="preserve">: Given HĐ vào queue Then engine chạy 2 tầng: rule-based (keywords checklist) + semantic (LLM so với Ideal), sinh đề xuất A/B đúng schema </w:t>
-      </w:r>
-      <w:r>
-        <w:rPr>
-          <w:rFonts w:ascii="Consolas" w:hAnsi="Consolas"/>
-          <w:color w:val="6B2E2E"/>
-          <w:sz w:val="20"/>
-        </w:rPr>
-        <w:t>AiProposal</w:t>
-      </w:r>
-      <w:r>
-        <w:t>.</w:t>
+        <w:t>: Given IT When tạo/sửa user Then có Họ tên, username, role, tick quyền hạng mục (Task, Danh sách HĐ, Tạo tài liệu, Cấu hình HĐ, Form lists, System prompts, Users…).</w:t>
       </w:r>
     </w:p>
     <w:p>
@@ -1871,12 +2156,75 @@
         <w:t>AC2</w:t>
       </w:r>
       <w:r>
-        <w:t xml:space="preserve">: Given LLM lỗi/timeout Then fallback rule-based, kết quả đánh dấu rõ là fallback </w:t>
+        <w:t>: Given user thiếu quyền một hạng mục Then không vào được màn tương ứng.</w:t>
+      </w:r>
+    </w:p>
+    <w:p>
+      <w:pPr>
+        <w:pStyle w:val="Heading1"/>
+      </w:pPr>
+      <w:r>
+        <w:t>Epic 5 — Hệ thống: AI Engine &amp; Tích hợp</w:t>
+      </w:r>
+    </w:p>
+    <w:p>
+      <w:pPr>
+        <w:pStyle w:val="Heading2"/>
+      </w:pPr>
+      <w:r>
+        <w:t>US-S01 — AI Review Engine · Demo 🟡 (mock heuristic; pipeline logic theo Blueprint 1.3.5)</w:t>
+      </w:r>
+    </w:p>
+    <w:p>
+      <w:pPr>
+        <w:pStyle w:val="ListBullet"/>
+      </w:pPr>
+      <w:r>
+        <w:rPr>
+          <w:b/>
+        </w:rPr>
+        <w:t>AC1</w:t>
+      </w:r>
+      <w:r>
+        <w:t xml:space="preserve">: Given HĐ vào queue Then resolve checklist bằng </w:t>
       </w:r>
       <w:r>
         <w:rPr>
           <w:rFonts w:ascii="Consolas" w:hAnsi="Consolas"/>
-          <w:color w:val="6B2E2E"/>
+          <w:sz w:val="20"/>
+        </w:rPr>
+        <w:t>getMergedConfigForContractName(contractNameId)</w:t>
+      </w:r>
+      <w:r>
+        <w:t xml:space="preserve"> (cha ∪ overlay) + System Prompt </w:t>
+      </w:r>
+      <w:r>
+        <w:rPr>
+          <w:rFonts w:ascii="Consolas" w:hAnsi="Consolas"/>
+          <w:sz w:val="20"/>
+        </w:rPr>
+        <w:t>checklist_review</w:t>
+      </w:r>
+      <w:r>
+        <w:t xml:space="preserve"> → findings / đề xuất A/B.</w:t>
+      </w:r>
+    </w:p>
+    <w:p>
+      <w:pPr>
+        <w:pStyle w:val="ListBullet"/>
+      </w:pPr>
+      <w:r>
+        <w:rPr>
+          <w:b/>
+        </w:rPr>
+        <w:t>AC2</w:t>
+      </w:r>
+      <w:r>
+        <w:t xml:space="preserve">: Given LLM lỗi/timeout Then fallback rule-based, đánh dấu rõ </w:t>
+      </w:r>
+      <w:r>
+        <w:rPr>
+          <w:rFonts w:ascii="Consolas" w:hAnsi="Consolas"/>
           <w:sz w:val="20"/>
         </w:rPr>
         <w:t>[phụ thuộc B4]</w:t>
@@ -1896,7 +2244,27 @@
         <w:t>AC3</w:t>
       </w:r>
       <w:r>
-        <w:t>: Given kết quả Then % tin cậy + Fairness + 4 nhóm phát hiện tính theo công thức đã chốt tại B2 (thay heuristic demo).</w:t>
+        <w:t xml:space="preserve">: Given có findings Then stage </w:t>
+      </w:r>
+      <w:r>
+        <w:rPr>
+          <w:rFonts w:ascii="Consolas" w:hAnsi="Consolas"/>
+          <w:sz w:val="20"/>
+        </w:rPr>
+        <w:t>ai_summary_fairness</w:t>
+      </w:r>
+      <w:r>
+        <w:t xml:space="preserve"> sinh summary + fairness; % tin cậy và Fairness Score tách biệt </w:t>
+      </w:r>
+      <w:r>
+        <w:rPr>
+          <w:rFonts w:ascii="Consolas" w:hAnsi="Consolas"/>
+          <w:sz w:val="20"/>
+        </w:rPr>
+        <w:t>[B2]</w:t>
+      </w:r>
+      <w:r>
+        <w:t>.</w:t>
       </w:r>
     </w:p>
     <w:p>
@@ -1904,15 +2272,7 @@
         <w:pStyle w:val="Heading2"/>
       </w:pPr>
       <w:r>
-        <w:t xml:space="preserve">US-S02 — Đồng bộ Econtract (outbound) · Demo ❌ </w:t>
-      </w:r>
-      <w:r>
-        <w:rPr>
-          <w:rFonts w:ascii="Consolas" w:hAnsi="Consolas"/>
-          <w:color w:val="6B2E2E"/>
-          <w:sz w:val="20"/>
-        </w:rPr>
-        <w:t>[phụ thuộc D1a/D1b/D1e]</w:t>
+        <w:t>US-S02 — Đồng bộ Econtract (outbound) · Demo ❌ `[phụ thuộc D1a/D1b/D1e]`</w:t>
       </w:r>
     </w:p>
     <w:p>
@@ -1926,27 +2286,17 @@
         <w:t>AC1</w:t>
       </w:r>
       <w:r>
-        <w:t xml:space="preserve">: Given Legal approve Then hệ thống gọi API FPT.eContract đẩy trình ký với marker đã gán, file </w:t>
-      </w:r>
-      <w:r>
-        <w:rPr>
-          <w:b/>
-        </w:rPr>
-        <w:t>convert base64</w:t>
-      </w:r>
-      <w:r>
-        <w:t xml:space="preserve"> khi gửi </w:t>
+        <w:t xml:space="preserve">: Given Legal approve Then gọi API FPT.eContract đẩy trình ký với marker; file convert base64 </w:t>
       </w:r>
       <w:r>
         <w:rPr>
           <w:rFonts w:ascii="Consolas" w:hAnsi="Consolas"/>
-          <w:color w:val="6B2E2E"/>
           <w:sz w:val="20"/>
         </w:rPr>
-        <w:t>[D1c đã chốt]</w:t>
-      </w:r>
-      <w:r>
-        <w:t>; lỗi thì retry + báo trạng thái.</w:t>
+        <w:t>[D1c]</w:t>
+      </w:r>
+      <w:r>
+        <w:t>.</w:t>
       </w:r>
     </w:p>
     <w:p>
@@ -1965,10 +2315,9 @@
       <w:r>
         <w:rPr>
           <w:rFonts w:ascii="Consolas" w:hAnsi="Consolas"/>
-          <w:color w:val="6B2E2E"/>
           <w:sz w:val="20"/>
         </w:rPr>
-        <w:t>[D1d đã chốt]</w:t>
+        <w:t>[D1d]</w:t>
       </w:r>
       <w:r>
         <w:t xml:space="preserve">: Kênh nhận file ký về </w:t>
@@ -1977,21 +2326,10 @@
         <w:rPr>
           <w:b/>
         </w:rPr>
-        <w:t>không thuộc scope AI Legal</w:t>
-      </w:r>
-      <w:r>
-        <w:t xml:space="preserve"> — hệ thống hiện hữu đã có sẵn. AI Legal chỉ cần gửi HĐ đi ký; trạng thái </w:t>
-      </w:r>
-      <w:r>
-        <w:rPr>
-          <w:rFonts w:ascii="Consolas" w:hAnsi="Consolas"/>
-          <w:color w:val="6B2E2E"/>
-          <w:sz w:val="20"/>
-        </w:rPr>
-        <w:t>signed</w:t>
-      </w:r>
-      <w:r>
-        <w:t xml:space="preserve"> (nếu hiển thị) đồng bộ từ hệ thống hiện hữu, không xây callback/sFTP mới.</w:t>
+        <w:t>không thuộc scope</w:t>
+      </w:r>
+      <w:r>
+        <w:t xml:space="preserve"> AI Legal.</w:t>
       </w:r>
     </w:p>
     <w:p>
@@ -1999,26 +2337,7 @@
         <w:pStyle w:val="Heading2"/>
       </w:pPr>
       <w:r>
-        <w:t xml:space="preserve">US-S03 — Xuất </w:t>
-      </w:r>
-      <w:r>
-        <w:rPr>
-          <w:rFonts w:ascii="Consolas" w:hAnsi="Consolas"/>
-          <w:color w:val="6B2E2E"/>
-          <w:sz w:val="20"/>
-        </w:rPr>
-        <w:t>.docx</w:t>
-      </w:r>
-      <w:r>
-        <w:t xml:space="preserve"> giữ format · Demo ❌ </w:t>
-      </w:r>
-      <w:r>
-        <w:rPr>
-          <w:rFonts w:ascii="Consolas" w:hAnsi="Consolas"/>
-          <w:color w:val="6B2E2E"/>
-          <w:sz w:val="20"/>
-        </w:rPr>
-        <w:t>[phụ thuộc C4]</w:t>
+        <w:t>US-S03 — Xuất `.docx` giữ format · Demo ❌ `[phụ thuộc C4]`</w:t>
       </w:r>
     </w:p>
     <w:p>
@@ -2032,18 +2351,17 @@
         <w:t>AC1</w:t>
       </w:r>
       <w:r>
-        <w:t xml:space="preserve">: Given review hoàn tất When export Then file </w:t>
+        <w:t xml:space="preserve">: Given review hoàn tất When export Then </w:t>
       </w:r>
       <w:r>
         <w:rPr>
           <w:rFonts w:ascii="Consolas" w:hAnsi="Consolas"/>
-          <w:color w:val="6B2E2E"/>
           <w:sz w:val="20"/>
         </w:rPr>
         <w:t>.docx</w:t>
       </w:r>
       <w:r>
-        <w:t xml:space="preserve"> giữ format gốc, chỉ thay nội dung vùng mở theo allow-list.</w:t>
+        <w:t xml:space="preserve"> giữ format gốc, chỉ thay vùng mở theo allow-list.</w:t>
       </w:r>
     </w:p>
     <w:p>
@@ -2064,7 +2382,6 @@
       <w:r>
         <w:rPr>
           <w:rFonts w:ascii="Consolas" w:hAnsi="Consolas"/>
-          <w:color w:val="6B2E2E"/>
           <w:sz w:val="20"/>
         </w:rPr>
         <w:t>[phụ thuộc]</w:t>
@@ -2075,13 +2392,12 @@
       <w:r>
         <w:rPr>
           <w:rFonts w:ascii="Consolas" w:hAnsi="Consolas"/>
-          <w:color w:val="6B2E2E"/>
           <w:sz w:val="20"/>
         </w:rPr>
         <w:t>02-open-questions.md</w:t>
       </w:r>
       <w:r>
-        <w:t>.</w:t>
+        <w:t xml:space="preserve"> hoặc Blueprint đã chốt.</w:t>
       </w:r>
     </w:p>
     <w:p>
@@ -2102,7 +2418,6 @@
       <w:r>
         <w:rPr>
           <w:rFonts w:ascii="Consolas" w:hAnsi="Consolas"/>
-          <w:color w:val="6B2E2E"/>
           <w:sz w:val="20"/>
         </w:rPr>
         <w:t>04-api-contract.md</w:t>
@@ -2119,9 +2434,17 @@
         <w:t>UI story có màn hình demo tham chiếu hoặc mockup được duyệt.</w:t>
       </w:r>
     </w:p>
+    <w:p>
+      <w:pPr>
+        <w:pStyle w:val="ListNumber"/>
+      </w:pPr>
+      <w:r>
+        <w:t>Story cấu hình checklist / Form lists khớp Blueprint VI.4–VI.5 (v1.22+).</w:t>
+      </w:r>
+    </w:p>
     <w:sectPr>
-      <w:pgSz w:w="12240" w:h="15840"/>
-      <w:pgMar w:top="1440" w:right="1800" w:bottom="1440" w:left="1800" w:header="720" w:footer="720" w:gutter="0"/>
+      <w:pgSz w:w="11906" w:h="16838"/>
+      <w:pgMar w:top="1020" w:right="1134" w:bottom="1020" w:left="1134" w:header="720" w:footer="720" w:gutter="0"/>
       <w:cols w:space="720"/>
       <w:docGrid w:linePitch="360"/>
     </w:sectPr>
@@ -2604,10 +2927,10 @@
       <w:outlineLvl w:val="2"/>
     </w:pPr>
     <w:rPr>
-      <w:rFonts w:asciiTheme="majorHAnsi" w:eastAsiaTheme="majorEastAsia" w:hAnsiTheme="majorHAnsi" w:cstheme="majorBidi" w:ascii="Calibri" w:hAnsi="Calibri"/>
+      <w:rFonts w:asciiTheme="majorHAnsi" w:eastAsiaTheme="majorEastAsia" w:hAnsiTheme="majorHAnsi" w:cstheme="majorBidi"/>
       <w:b/>
       <w:bCs/>
-      <w:color w:val="1F4E79"/>
+      <w:color w:val="4F81BD" w:themeColor="accent1"/>
     </w:rPr>
   </w:style>
   <w:style w:type="paragraph" w:styleId="Heading4">

</xml_diff>

<commit_message>
Update README and refactor user management and configurations
- Revised README to clarify API integration details and environment variable usage.
- Enhanced user management functionality by updating user creation, deletion, and fetching methods to use remote services.
- Improved form lists handling by integrating fetch and persist functions for better data management.
- Updated system prompts panel to utilize a dedicated service for fetching and updating prompts, ensuring a more streamlined user experience.
- Adjusted signing rules panel to fetch users and form lists concurrently, optimizing loading times.

Co-authored-by: Cursor <cursoragent@cursor.com>
</commit_message>
<xml_diff>
--- a/docs/AI-Legal_User-Stories_Sprint1.docx
+++ b/docs/AI-Legal_User-Stories_Sprint1.docx
@@ -3,47 +3,36 @@
 <w:document xmlns:wpc="http://schemas.microsoft.com/office/word/2010/wordprocessingCanvas" xmlns:mo="http://schemas.microsoft.com/office/mac/office/2008/main" xmlns:mc="http://schemas.openxmlformats.org/markup-compatibility/2006" xmlns:mv="urn:schemas-microsoft-com:mac:vml" xmlns:o="urn:schemas-microsoft-com:office:office" xmlns:r="http://schemas.openxmlformats.org/officeDocument/2006/relationships" xmlns:m="http://schemas.openxmlformats.org/officeDocument/2006/math" xmlns:v="urn:schemas-microsoft-com:vml" xmlns:wp14="http://schemas.microsoft.com/office/word/2010/wordprocessingDrawing" xmlns:wp="http://schemas.openxmlformats.org/drawingml/2006/wordprocessingDrawing" xmlns:w10="urn:schemas-microsoft-com:office:word" xmlns:w="http://schemas.openxmlformats.org/wordprocessingml/2006/main" xmlns:w14="http://schemas.microsoft.com/office/word/2010/wordml" xmlns:wpg="http://schemas.microsoft.com/office/word/2010/wordprocessingGroup" xmlns:wpi="http://schemas.microsoft.com/office/word/2010/wordprocessingInk" xmlns:wne="http://schemas.microsoft.com/office/word/2006/wordml" xmlns:wps="http://schemas.microsoft.com/office/word/2010/wordprocessingShape" mc:Ignorable="w14 wp14">
   <w:body>
     <w:p>
-      <w:pPr>
-        <w:jc w:val="center"/>
-      </w:pPr>
       <w:r>
         <w:rPr>
           <w:b/>
-          <w:color w:val="1F4E79"/>
-          <w:sz w:val="32"/>
+          <w:sz w:val="36"/>
         </w:rPr>
         <w:t>AI Review Hợp đồng (AI Legal)</w:t>
       </w:r>
     </w:p>
     <w:p>
-      <w:pPr>
-        <w:jc w:val="center"/>
-      </w:pPr>
       <w:r>
         <w:rPr>
           <w:b/>
-          <w:sz w:val="26"/>
+          <w:sz w:val="28"/>
         </w:rPr>
         <w:t>User Stories Sprint 1 — kèm Acceptance Criteria</w:t>
       </w:r>
     </w:p>
     <w:p>
-      <w:pPr>
-        <w:jc w:val="center"/>
-      </w:pPr>
       <w:r>
         <w:rPr>
           <w:i/>
+          <w:color w:val="555555"/>
           <w:sz w:val="20"/>
         </w:rPr>
-        <w:t>Phiên bản 06/08/2026 · Nguồn: docs/requirements-alignment/03-user-stories.md</w:t>
+        <w:t>Phiên bản 12/08/2026 · Nguồn: docs/requirements-alignment/03-user-stories.md · Blueprint v1.28</w:t>
       </w:r>
     </w:p>
-    <w:p/>
     <w:p>
       <w:r>
         <w:rPr>
-          <w:i/>
           <w:sz w:val="20"/>
         </w:rPr>
         <w:t>Owner: BA (soạn) · TESTER (review AC khả năng test) · DEV (review khả thi)</w:t>
@@ -52,71 +41,25 @@
     <w:p>
       <w:r>
         <w:rPr>
-          <w:i/>
           <w:sz w:val="20"/>
         </w:rPr>
-        <w:t xml:space="preserve">Cột </w:t>
-      </w:r>
-      <w:r>
-        <w:rPr>
-          <w:b/>
-          <w:i/>
-          <w:sz w:val="20"/>
-        </w:rPr>
-        <w:t>Demo</w:t>
-      </w:r>
-      <w:r>
-        <w:rPr>
-          <w:i/>
-          <w:sz w:val="20"/>
-        </w:rPr>
-        <w:t>: ✅ = đã có UI demo tham chiếu tại route tương ứng; 🔧 = có service, chưa có UI; ❌ = chưa có gì.</w:t>
+        <w:t>Cột Demo: ✅ = đã có UI demo tham chiếu tại route tương ứng; 🔧 = có service, chưa có UI; ❌ = chưa có gì; Bỏ = ngoài phạm vi Sprint 1 (Blueprint VII).</w:t>
       </w:r>
     </w:p>
     <w:p>
       <w:r>
         <w:rPr>
-          <w:i/>
           <w:sz w:val="20"/>
         </w:rPr>
-        <w:t xml:space="preserve">AC viết dạng Given–When–Then. Story phụ thuộc câu hỏi mở thì ghi </w:t>
-      </w:r>
-      <w:r>
-        <w:rPr>
-          <w:rFonts w:ascii="Consolas" w:hAnsi="Consolas"/>
-          <w:i/>
-          <w:sz w:val="20"/>
-        </w:rPr>
-        <w:t>[phụ thuộc Ax/Bx/...]</w:t>
-      </w:r>
-      <w:r>
-        <w:rPr>
-          <w:i/>
-          <w:sz w:val="20"/>
-        </w:rPr>
-        <w:t xml:space="preserve"> — chỉ Ready khi câu hỏi đã chốt.</w:t>
-      </w:r>
-    </w:p>
-    <w:p>
-      <w:r>
-        <w:t>&gt;</w:t>
+        <w:t>AC viết dạng Given–When–Then. Story phụ thuộc câu hỏi mở thì ghi [phụ thuộc Ax/Bx/...] — chỉ Ready khi câu hỏi đã chốt.</w:t>
       </w:r>
     </w:p>
     <w:p>
       <w:r>
         <w:rPr>
-          <w:b/>
-          <w:i/>
           <w:sz w:val="20"/>
         </w:rPr>
-        <w:t>Cập nhật 06/08/2026 (khớp Blueprint v1.22 + demo):</w:t>
-      </w:r>
-      <w:r>
-        <w:rPr>
-          <w:i/>
-          <w:sz w:val="20"/>
-        </w:rPr>
-        <w:t xml:space="preserve"> bỏ A6 fail-fast template; bỏ Legal Lead &amp; Draft/Publish checklist; cấu hình loại cha + overlay tên HĐ opt-in; Form lists Lưu trữ/Xóa theo usage; Task Manager/Legal TH1–TH3; System Prompt 3 stage; nút Quay lại Configurations/Config.</w:t>
+        <w:t>Cập nhật 12/08/2026 (khớp Blueprint v1.28 + demo): Review hợp đồng (US-P12); marker/eContract sau Legal (pending_markers); PT2/PT3 &amp; UI TH1·TH2·TH3 / PA-A·PA-B → VII; Phân quyền ký eContract; Legal Approve ≠ đẩy eContract ngay; System Prompt qua backend/; API contract FE sẵn sàng đấu nối.</w:t>
       </w:r>
     </w:p>
     <w:p>
@@ -124,6 +67,9 @@
         <w:pStyle w:val="Heading1"/>
       </w:pPr>
       <w:r>
+        <w:rPr>
+          <w:color w:val="1A365D"/>
+        </w:rPr>
         <w:t>Epic 1 — Purchasing: Tạo &amp; theo dõi review</w:t>
       </w:r>
     </w:p>
@@ -132,185 +78,72 @@
         <w:pStyle w:val="Heading2"/>
       </w:pPr>
       <w:r>
-        <w:t>US-P01 — Tạo tài liệu review · Demo ✅ `/dashboard/contracts/new`</w:t>
+        <w:rPr>
+          <w:color w:val="2C5282"/>
+        </w:rPr>
+        <w:t>US-P01 — Tạo tài liệu review · Demo ✅ /dashboard/contracts/new</w:t>
       </w:r>
     </w:p>
     <w:p>
+      <w:pPr>
+        <w:spacing w:after="80"/>
+      </w:pPr>
       <w:r>
-        <w:t xml:space="preserve">Là Purchasing, tôi muốn nhập thông tin hợp đồng (từ Form lists) và upload 1 file </w:t>
-      </w:r>
-      <w:r>
-        <w:rPr>
-          <w:rFonts w:ascii="Consolas" w:hAnsi="Consolas"/>
-          <w:sz w:val="20"/>
-        </w:rPr>
-        <w:t>.docx</w:t>
-      </w:r>
-      <w:r>
-        <w:t xml:space="preserve"> để gửi AI review.</w:t>
+        <w:t>Là Purchasing, tôi muốn nhập thông tin hợp đồng (từ Form lists) và upload 1 file .docx để gửi AI review (luồng đầy đủ: duyệt → gán chữ ký → eContract).</w:t>
       </w:r>
     </w:p>
     <w:p>
       <w:pPr>
         <w:pStyle w:val="ListBullet"/>
+        <w:spacing w:after="40"/>
       </w:pPr>
       <w:r>
-        <w:rPr>
-          <w:b/>
-        </w:rPr>
-        <w:t>AC1</w:t>
-      </w:r>
-      <w:r>
-        <w:t>: Given form thiếu trường bắt buộc (Loại HĐ, Tên HĐ, Công ty, Tên tài liệu, Loại giá trị HĐ, HĐ tiêu chuẩn, Chiết khấu, Giá trị, file) When bấm Submit Then hệ thống chặn và chỉ rõ trường thiếu.</w:t>
+        <w:t>AC1: Given form thiếu trường bắt buộc (Loại HĐ, Tên HĐ, Công ty, Tên tài liệu, Loại giá trị HĐ, HĐ tiêu chuẩn, Chiết khấu, Giá trị, file) When bấm Submit Then hệ thống chặn và chỉ rõ trường thiếu.</w:t>
       </w:r>
     </w:p>
     <w:p>
       <w:pPr>
         <w:pStyle w:val="ListBullet"/>
+        <w:spacing w:after="40"/>
       </w:pPr>
       <w:r>
-        <w:rPr>
-          <w:b/>
-        </w:rPr>
-        <w:t>AC2</w:t>
-      </w:r>
-      <w:r>
-        <w:t xml:space="preserve">: Given file không phải </w:t>
-      </w:r>
-      <w:r>
-        <w:rPr>
-          <w:rFonts w:ascii="Consolas" w:hAnsi="Consolas"/>
-          <w:sz w:val="20"/>
-        </w:rPr>
-        <w:t>.docx</w:t>
-      </w:r>
-      <w:r>
-        <w:t xml:space="preserve"> When kéo thả Then file bị từ chối kèm thông báo.</w:t>
+        <w:t>AC2: Given file không phải .docx When kéo thả Then file bị từ chối kèm thông báo.</w:t>
       </w:r>
     </w:p>
     <w:p>
       <w:pPr>
         <w:pStyle w:val="ListBullet"/>
+        <w:spacing w:after="40"/>
       </w:pPr>
       <w:r>
-        <w:rPr>
-          <w:b/>
-        </w:rPr>
-        <w:t>AC3</w:t>
-      </w:r>
-      <w:r>
-        <w:t xml:space="preserve">: Given form hợp lệ + 1 file </w:t>
-      </w:r>
-      <w:r>
-        <w:rPr>
-          <w:rFonts w:ascii="Consolas" w:hAnsi="Consolas"/>
-          <w:sz w:val="20"/>
-        </w:rPr>
-        <w:t>.docx</w:t>
-      </w:r>
-      <w:r>
-        <w:t xml:space="preserve"> When Submit Then review được tạo trạng thái </w:t>
-      </w:r>
-      <w:r>
-        <w:rPr>
-          <w:rFonts w:ascii="Consolas" w:hAnsi="Consolas"/>
-          <w:sz w:val="20"/>
-        </w:rPr>
-        <w:t>queued</w:t>
-      </w:r>
-      <w:r>
-        <w:t xml:space="preserve">, điều hướng workspace; Số tài liệu tự sinh </w:t>
-      </w:r>
-      <w:r>
-        <w:rPr>
-          <w:rFonts w:ascii="Consolas" w:hAnsi="Consolas"/>
-          <w:sz w:val="20"/>
-        </w:rPr>
-        <w:t>(Mã công ty).(Mã loại HĐ).Năm+STT</w:t>
-      </w:r>
-      <w:r>
-        <w:t xml:space="preserve"> — user không sửa được.</w:t>
+        <w:t>AC3: Given form hợp lệ + 1 file .docx When Submit Then review được tạo trạng thái queued, điều hướng workspace; Số tài liệu tự sinh (Mã công ty).(Mã loại HĐ).Năm+STT — user không sửa được.</w:t>
       </w:r>
     </w:p>
     <w:p>
       <w:pPr>
         <w:pStyle w:val="ListBullet"/>
+        <w:spacing w:after="40"/>
       </w:pPr>
       <w:r>
-        <w:rPr>
-          <w:b/>
-        </w:rPr>
-        <w:t>AC4</w:t>
-      </w:r>
-      <w:r>
-        <w:t xml:space="preserve"> </w:t>
-      </w:r>
-      <w:r>
-        <w:rPr>
-          <w:rFonts w:ascii="Consolas" w:hAnsi="Consolas"/>
-          <w:sz w:val="20"/>
-        </w:rPr>
-        <w:t>[A6 đã bỏ khỏi Sprint 1]</w:t>
-      </w:r>
-      <w:r>
-        <w:t xml:space="preserve">: Given upload </w:t>
-      </w:r>
-      <w:r>
-        <w:rPr>
-          <w:rFonts w:ascii="Consolas" w:hAnsi="Consolas"/>
-          <w:sz w:val="20"/>
-        </w:rPr>
-        <w:t>.docx</w:t>
-      </w:r>
-      <w:r>
-        <w:t xml:space="preserve"> hợp lệ Then </w:t>
-      </w:r>
-      <w:r>
-        <w:rPr>
-          <w:b/>
-        </w:rPr>
-        <w:t>không</w:t>
-      </w:r>
-      <w:r>
-        <w:t xml:space="preserve"> so khớp nội dung file với template loại HĐ (không fail-fast A6). Cờ </w:t>
-      </w:r>
-      <w:r>
-        <w:rPr>
-          <w:rFonts w:ascii="Consolas" w:hAnsi="Consolas"/>
-          <w:sz w:val="20"/>
-        </w:rPr>
-        <w:t>requireTemplateMatch</w:t>
-      </w:r>
-      <w:r>
-        <w:t xml:space="preserve"> trên config chỉ là metadata tham chiếu.</w:t>
+        <w:t>AC4 [A6 đã bỏ khỏi Sprint 1]: Given upload .docx hợp lệ Then không so khớp nội dung file với template loại HĐ (không fail-fast A6). Cờ requireTemplateMatch trên config chỉ là metadata tham chiếu.</w:t>
       </w:r>
     </w:p>
     <w:p>
       <w:pPr>
         <w:pStyle w:val="ListBullet"/>
+        <w:spacing w:after="40"/>
       </w:pPr>
       <w:r>
-        <w:rPr>
-          <w:b/>
-        </w:rPr>
-        <w:t>AC5</w:t>
-      </w:r>
-      <w:r>
-        <w:t>: Given Tên HĐ chưa có checklist loại cha đã Lưu When Submit Then cảnh báo “AI review mang tính tham khảo” (vẫn cho vào queue).</w:t>
+        <w:t>AC5: Given Tên HĐ chưa có checklist loại cha đã Lưu When Submit Then cảnh báo “AI review mang tính tham khảo” (vẫn cho vào queue).</w:t>
       </w:r>
     </w:p>
     <w:p>
       <w:pPr>
         <w:pStyle w:val="ListBullet"/>
+        <w:spacing w:after="40"/>
       </w:pPr>
       <w:r>
-        <w:rPr>
-          <w:b/>
-        </w:rPr>
-        <w:t>AC6</w:t>
-      </w:r>
-      <w:r>
-        <w:t>: Given chọn Loại HĐ Then dropdown Tên HĐ chỉ hiện tên active thuộc loại đó (Form lists, không hiện đã lưu trữ).</w:t>
+        <w:t>AC6: Given chọn Loại HĐ Then dropdown Tên HĐ chỉ hiện tên active thuộc loại đó (Form lists, không hiện đã lưu trữ).</w:t>
       </w:r>
     </w:p>
     <w:p>
@@ -318,74 +151,92 @@
         <w:pStyle w:val="Heading2"/>
       </w:pPr>
       <w:r>
+        <w:rPr>
+          <w:color w:val="2C5282"/>
+        </w:rPr>
+        <w:t>US-P12 — Review hợp đồng (chỉ AI review) · Demo ✅ /dashboard/review</w:t>
+      </w:r>
+    </w:p>
+    <w:p>
+      <w:pPr>
+        <w:spacing w:after="80"/>
+      </w:pPr>
+      <w:r>
+        <w:t>Là Purchasing, tôi muốn upload nhanh Loại HĐ + Tên HĐ + .docx để chỉ làm việc với AI (chat / Accept·Undo), không Submit duyệt và không eContract.</w:t>
+      </w:r>
+    </w:p>
+    <w:p>
+      <w:pPr>
+        <w:pStyle w:val="ListBullet"/>
+        <w:spacing w:after="40"/>
+      </w:pPr>
+      <w:r>
+        <w:t>AC1: Given đã đăng nhập quyền contracts / contracts_create When mở /dashboard/review Then bắt buộc chọn Loại hợp đồng + Tên hợp đồng (lọc theo loại) trước khi enable «Bắt đầu AI Review».</w:t>
+      </w:r>
+    </w:p>
+    <w:p>
+      <w:pPr>
+        <w:pStyle w:val="ListBullet"/>
+        <w:spacing w:after="40"/>
+      </w:pPr>
+      <w:r>
+        <w:t>AC2: Given đã chọn Loại + Tên + 1 file .docx When bấm Bắt đầu AI Review Then tạo ticket → queued/processing → workspace /dashboard/review/[id] (chat + tài liệu, Accept/Undo, insight).</w:t>
+      </w:r>
+    </w:p>
+    <w:p>
+      <w:pPr>
+        <w:pStyle w:val="ListBullet"/>
+        <w:spacing w:after="40"/>
+      </w:pPr>
+      <w:r>
+        <w:t>AC3: Given ticket từ Review hợp đồng When xem Danh sách HĐ (nếu có) Then có thể thấy bản ghi tham chiếu với owner; hành vi chính vẫn là workspace review — không dùng để Submit duyệt.</w:t>
+      </w:r>
+    </w:p>
+    <w:p>
+      <w:pPr>
+        <w:pStyle w:val="ListBullet"/>
+        <w:spacing w:after="40"/>
+      </w:pPr>
+      <w:r>
+        <w:t>AC4: Given đang ở /dashboard/review/[id] When bấm Upload mới Then về /dashboard/review. Không có nút Submit duyệt / Gán chữ ký trên màn này.</w:t>
+      </w:r>
+    </w:p>
+    <w:p>
+      <w:pPr>
+        <w:pStyle w:val="ListBullet"/>
+        <w:spacing w:after="40"/>
+      </w:pPr>
+      <w:r>
+        <w:t>AC5: Given ticket từ Review hợp đồng When hoàn tất xem/chỉnh trên workspace Then không có bước tiếp theo trong Sprint 1 (không pending_manager / pending_legal / pending_markers / eContract). Muốn trình ký → dùng Tạo tài liệu (US-P01) + Submit duyệt.</w:t>
+      </w:r>
+    </w:p>
+    <w:p>
+      <w:pPr>
+        <w:pStyle w:val="Heading2"/>
+      </w:pPr>
+      <w:r>
+        <w:rPr>
+          <w:color w:val="2C5282"/>
+        </w:rPr>
         <w:t>US-P02 — Theo dõi hàng đợi AI · Demo ✅ (mock queue)</w:t>
       </w:r>
     </w:p>
     <w:p>
       <w:pPr>
         <w:pStyle w:val="ListBullet"/>
+        <w:spacing w:after="40"/>
       </w:pPr>
       <w:r>
-        <w:rPr>
-          <w:b/>
-        </w:rPr>
-        <w:t>AC1</w:t>
-      </w:r>
-      <w:r>
-        <w:t xml:space="preserve">: Given review ở </w:t>
-      </w:r>
-      <w:r>
-        <w:rPr>
-          <w:rFonts w:ascii="Consolas" w:hAnsi="Consolas"/>
-          <w:sz w:val="20"/>
-        </w:rPr>
-        <w:t>queued</w:t>
-      </w:r>
-      <w:r>
-        <w:t>/</w:t>
-      </w:r>
-      <w:r>
-        <w:rPr>
-          <w:rFonts w:ascii="Consolas" w:hAnsi="Consolas"/>
-          <w:sz w:val="20"/>
-        </w:rPr>
-        <w:t>processing</w:t>
-      </w:r>
-      <w:r>
-        <w:t xml:space="preserve"> When mở workspace Then thấy vị trí hàng đợi/tiến độ, tự cập nhật không cần reload.</w:t>
+        <w:t>AC1: Given review ở queued/processing When mở workspace Then thấy vị trí hàng đợi/tiến độ, tự cập nhật không cần reload.</w:t>
       </w:r>
     </w:p>
     <w:p>
       <w:pPr>
         <w:pStyle w:val="ListBullet"/>
+        <w:spacing w:after="40"/>
       </w:pPr>
       <w:r>
-        <w:rPr>
-          <w:b/>
-        </w:rPr>
-        <w:t>AC2</w:t>
-      </w:r>
-      <w:r>
-        <w:t xml:space="preserve"> </w:t>
-      </w:r>
-      <w:r>
-        <w:rPr>
-          <w:rFonts w:ascii="Consolas" w:hAnsi="Consolas"/>
-          <w:sz w:val="20"/>
-        </w:rPr>
-        <w:t>[A8 đã chốt: FIFO]</w:t>
-      </w:r>
-      <w:r>
-        <w:t xml:space="preserve">: Given queue quá tải Then review vẫn không mất, thứ tự xử lý theo hàng chờ </w:t>
-      </w:r>
-      <w:r>
-        <w:rPr>
-          <w:b/>
-        </w:rPr>
-        <w:t>first-in-first-out</w:t>
-      </w:r>
-      <w:r>
-        <w:t>.</w:t>
+        <w:t>AC2 [A8 đã chốt: FIFO]: Given queue quá tải Then review vẫn không mất, thứ tự xử lý theo hàng chờ first-in-first-out.</w:t>
       </w:r>
     </w:p>
     <w:p>
@@ -393,58 +244,37 @@
         <w:pStyle w:val="Heading2"/>
       </w:pPr>
       <w:r>
+        <w:rPr>
+          <w:color w:val="2C5282"/>
+        </w:rPr>
         <w:t>US-P03 — Xem đề xuất AI Loại A/B và Accept/Undo · Demo ✅</w:t>
       </w:r>
     </w:p>
     <w:p>
       <w:pPr>
         <w:pStyle w:val="ListBullet"/>
+        <w:spacing w:after="40"/>
       </w:pPr>
       <w:r>
-        <w:rPr>
-          <w:b/>
-        </w:rPr>
-        <w:t>AC1</w:t>
-      </w:r>
-      <w:r>
-        <w:t>: Given AI trả kết quả Then mỗi đề xuất hiển thị loại (A/B), diff cũ→mới, giải thích, điều khoản checklist liên quan.</w:t>
+        <w:t>AC1: Given AI trả kết quả Then mỗi đề xuất hiển thị loại (A/B), diff cũ→mới, giải thích, điều khoản checklist liên quan.</w:t>
       </w:r>
     </w:p>
     <w:p>
       <w:pPr>
         <w:pStyle w:val="ListBullet"/>
+        <w:spacing w:after="40"/>
       </w:pPr>
       <w:r>
-        <w:rPr>
-          <w:b/>
-        </w:rPr>
-        <w:t>AC2</w:t>
-      </w:r>
-      <w:r>
-        <w:t>: Given đề xuất Loại A When Accept/Undo từng cái hoặc tất cả Then nội dung file cập nhật tương ứng và % tin cậy được tính lại.</w:t>
+        <w:t>AC2: Given đề xuất Loại A When Accept/Undo từng cái hoặc tất cả Then nội dung file cập nhật tương ứng và % tin cậy được tính lại.</w:t>
       </w:r>
     </w:p>
     <w:p>
       <w:pPr>
         <w:pStyle w:val="ListBullet"/>
+        <w:spacing w:after="40"/>
       </w:pPr>
       <w:r>
-        <w:rPr>
-          <w:b/>
-        </w:rPr>
-        <w:t>AC3</w:t>
-      </w:r>
-      <w:r>
-        <w:t xml:space="preserve">: Given đề xuất Loại B (vùng khoá) Then chỉ hiển thị annotation/cảnh báo, </w:t>
-      </w:r>
-      <w:r>
-        <w:rPr>
-          <w:b/>
-        </w:rPr>
-        <w:t>không có</w:t>
-      </w:r>
-      <w:r>
-        <w:t xml:space="preserve"> nút Accept và không có đường ghi đè nội dung.</w:t>
+        <w:t>AC3: Given đề xuất Loại B (vùng khoá) Then chỉ hiển thị annotation/cảnh báo, không có nút Accept và không có đường ghi đè nội dung.</w:t>
       </w:r>
     </w:p>
     <w:p>
@@ -452,101 +282,46 @@
         <w:pStyle w:val="Heading2"/>
       </w:pPr>
       <w:r>
-        <w:t>US-P04 — Chat với AI để chỉnh sửa (Phương thức 1) · Demo ✅ (reply mock)</w:t>
+        <w:rPr>
+          <w:color w:val="2C5282"/>
+        </w:rPr>
+        <w:t>US-P04 — Chat với AI để chỉnh sửa (PT1) · Demo ✅ (reply mock)</w:t>
       </w:r>
     </w:p>
     <w:p>
       <w:pPr>
         <w:pStyle w:val="ListBullet"/>
+        <w:spacing w:after="40"/>
       </w:pPr>
       <w:r>
-        <w:rPr>
-          <w:b/>
-        </w:rPr>
-        <w:t>AC1</w:t>
-      </w:r>
-      <w:r>
-        <w:t>: Given yêu cầu chỉnh sửa nằm trong vùng mở When gửi chat Then AI đề xuất diff mới trên đúng vùng, cập nhật realtime.</w:t>
+        <w:t>AC1: Given yêu cầu chỉnh sửa nằm trong vùng mở When gửi chat Then AI đề xuất diff mới trên đúng vùng, cập nhật realtime.</w:t>
       </w:r>
     </w:p>
     <w:p>
       <w:pPr>
         <w:pStyle w:val="ListBullet"/>
+        <w:spacing w:after="40"/>
       </w:pPr>
       <w:r>
-        <w:rPr>
-          <w:b/>
-        </w:rPr>
-        <w:t>AC2</w:t>
-      </w:r>
-      <w:r>
-        <w:t xml:space="preserve">: Given yêu cầu đụng vùng khoá Then hệ thống từ chối </w:t>
-      </w:r>
-      <w:r>
-        <w:rPr>
-          <w:b/>
-        </w:rPr>
-        <w:t>trước khi</w:t>
-      </w:r>
-      <w:r>
-        <w:t xml:space="preserve"> gọi LLM (write-back allow-list Lớp 1).</w:t>
+        <w:t>AC2: Given yêu cầu đụng vùng khoá Then hệ thống từ chối trước khi gọi LLM (write-back allow-list Lớp 1).</w:t>
       </w:r>
     </w:p>
     <w:p>
       <w:pPr>
         <w:pStyle w:val="ListBullet"/>
+        <w:spacing w:after="40"/>
       </w:pPr>
       <w:r>
-        <w:rPr>
-          <w:b/>
-        </w:rPr>
-        <w:t>AC3</w:t>
-      </w:r>
-      <w:r>
-        <w:t xml:space="preserve">: Given nội dung chat chứa chỉ dẫn injection Then AI không tuân theo, gắn Red Flag theo </w:t>
-      </w:r>
-      <w:r>
-        <w:rPr>
-          <w:rFonts w:ascii="Consolas" w:hAnsi="Consolas"/>
-          <w:sz w:val="20"/>
-        </w:rPr>
-        <w:t>_shared/injection_guard.md</w:t>
-      </w:r>
-      <w:r>
-        <w:t>.</w:t>
+        <w:t>AC3: Given nội dung chat chứa chỉ dẫn injection Then AI không tuân theo, gắn Red Flag theo _shared/injection_guard.md.</w:t>
       </w:r>
     </w:p>
     <w:p>
       <w:pPr>
         <w:pStyle w:val="ListBullet"/>
+        <w:spacing w:after="40"/>
       </w:pPr>
       <w:r>
-        <w:rPr>
-          <w:b/>
-        </w:rPr>
-        <w:t>AC4</w:t>
-      </w:r>
-      <w:r>
-        <w:t xml:space="preserve"> </w:t>
-      </w:r>
-      <w:r>
-        <w:rPr>
-          <w:rFonts w:ascii="Consolas" w:hAnsi="Consolas"/>
-          <w:sz w:val="20"/>
-        </w:rPr>
-        <w:t>[C3 đã chốt]</w:t>
-      </w:r>
-      <w:r>
-        <w:t xml:space="preserve">: Given file </w:t>
-      </w:r>
-      <w:r>
-        <w:rPr>
-          <w:b/>
-        </w:rPr>
-        <w:t>không có vùng mở nào</w:t>
-      </w:r>
-      <w:r>
-        <w:t xml:space="preserve"> Then AI phản hồi rõ, chỉ hỗ trợ chat + annotation, không ghi file.</w:t>
+        <w:t>AC4 [C3 đã chốt]: Given file không có vùng mở nào Then AI phản hồi rõ, chỉ hỗ trợ chat + annotation, không ghi file.</w:t>
       </w:r>
     </w:p>
     <w:p>
@@ -554,266 +329,104 @@
         <w:pStyle w:val="Heading2"/>
       </w:pPr>
       <w:r>
-        <w:t>US-P05 — Reupload file sửa offline (Phương thức 3) · Demo 🔧 (service + API có, UI chưa)</w:t>
+        <w:rPr>
+          <w:color w:val="2C5282"/>
+        </w:rPr>
+        <w:t>US-P05 — Reupload file sửa offline (PT3) · ❌ Bỏ khỏi Sprint 1 (Blueprint VII)</w:t>
       </w:r>
     </w:p>
     <w:p>
       <w:pPr>
         <w:pStyle w:val="ListBullet"/>
+        <w:spacing w:after="40"/>
       </w:pPr>
       <w:r>
-        <w:rPr>
-          <w:b/>
-        </w:rPr>
-        <w:t>AC1</w:t>
-      </w:r>
-      <w:r>
-        <w:t xml:space="preserve">: Given review đang ở trạng thái cho phép sửa When Purchasing bấm "Upload lại file đã sửa" và chọn </w:t>
-      </w:r>
-      <w:r>
-        <w:rPr>
-          <w:rFonts w:ascii="Consolas" w:hAnsi="Consolas"/>
-          <w:sz w:val="20"/>
-        </w:rPr>
-        <w:t>.docx</w:t>
-      </w:r>
-      <w:r>
-        <w:t xml:space="preserve"> Then hệ thống validate cấu trúc vùng khoá so với bản trước.</w:t>
+        <w:t>Sprint 1 chỉ PT1 Chat. Service/API reupload có sẵn để phase sau; không deliver UI PT3 trong Sprint 1.</w:t>
       </w:r>
     </w:p>
     <w:p>
       <w:pPr>
-        <w:pStyle w:val="ListBullet"/>
+        <w:pStyle w:val="Heading2"/>
       </w:pPr>
       <w:r>
         <w:rPr>
-          <w:b/>
+          <w:color w:val="2C5282"/>
         </w:rPr>
-        <w:t>AC2</w:t>
-      </w:r>
-      <w:r>
-        <w:t xml:space="preserve"> </w:t>
-      </w:r>
-      <w:r>
-        <w:rPr>
-          <w:rFonts w:ascii="Consolas" w:hAnsi="Consolas"/>
-          <w:sz w:val="20"/>
-        </w:rPr>
-        <w:t>[C5 đã chốt: chặn hoàn toàn]</w:t>
-      </w:r>
-      <w:r>
-        <w:t xml:space="preserve">: Given file bị sửa vùng khoá / mất </w:t>
-      </w:r>
-      <w:r>
-        <w:rPr>
-          <w:rFonts w:ascii="Consolas" w:hAnsi="Consolas"/>
-          <w:sz w:val="20"/>
-        </w:rPr>
-        <w:t>permStart</w:t>
-      </w:r>
-      <w:r>
-        <w:t xml:space="preserve"> / thiếu field Then hiển thị lỗi và </w:t>
-      </w:r>
-      <w:r>
-        <w:rPr>
-          <w:b/>
-        </w:rPr>
-        <w:t>chặn hoàn toàn, không override</w:t>
-      </w:r>
-      <w:r>
-        <w:t>.</w:t>
+        <w:t>US-P06 — Xác định người ký &amp; gán marker (sau Legal) · Demo ✅</w:t>
       </w:r>
     </w:p>
     <w:p>
       <w:pPr>
         <w:pStyle w:val="ListBullet"/>
+        <w:spacing w:after="40"/>
       </w:pPr>
       <w:r>
-        <w:rPr>
-          <w:b/>
-        </w:rPr>
-        <w:t>AC3</w:t>
-      </w:r>
-      <w:r>
-        <w:t>: Given file hợp lệ Then version bump, chạy lại AI review, lịch sử version ghi nhận.</w:t>
+        <w:t>AC1: Given Legal approve Then status → pending_markers; Task người tạo hiện nút Gán chữ ký — không chặn Submit duyệt vì thiếu marker.</w:t>
       </w:r>
     </w:p>
     <w:p>
       <w:pPr>
-        <w:pStyle w:val="Heading2"/>
+        <w:pStyle w:val="ListBullet"/>
+        <w:spacing w:after="40"/>
       </w:pPr>
       <w:r>
-        <w:t>US-P06 — Gán marker ký số · Demo ✅ (click-chọn; kéo-thả chưa có)</w:t>
+        <w:t>AC2: Given mở /identify-signers Then bên mua prefill từ ma trận Phân quyền ký (tên org read-only; thêm/sửa/xóa người); phải Thêm bên ký (≥1 đối tác); mỗi đối tác bắt buộc chọn Tổ chức|Cá nhân; chỉ Ký chính + Văn thư cần marker ở bước sau.</w:t>
       </w:r>
     </w:p>
     <w:p>
       <w:pPr>
         <w:pStyle w:val="ListBullet"/>
+        <w:spacing w:after="40"/>
       </w:pPr>
       <w:r>
-        <w:rPr>
-          <w:b/>
-        </w:rPr>
-        <w:t>AC1</w:t>
-      </w:r>
-      <w:r>
-        <w:t>: Given chưa gán đủ marker cho các bên ký Then nút Submit for approval bị chặn kèm danh sách lỗi.</w:t>
+        <w:t>AC3: Given /design-markers When kéo-thả loại ký + chọn Người nhận + kích thước Then lưu tọa độ %; cú pháp #ds/#is … h:… #; Submit chặn nếu thiếu marker Ký chính/Văn thư.</w:t>
       </w:r>
     </w:p>
     <w:p>
       <w:pPr>
         <w:pStyle w:val="ListBullet"/>
+        <w:spacing w:after="40"/>
       </w:pPr>
       <w:r>
-        <w:rPr>
-          <w:b/>
-        </w:rPr>
-        <w:t>AC2</w:t>
-      </w:r>
-      <w:r>
-        <w:t>: Given gán marker When lưu Then sinh đúng cú pháp FPT.eContract (</w:t>
-      </w:r>
-      <w:r>
-        <w:rPr>
-          <w:rFonts w:ascii="Consolas" w:hAnsi="Consolas"/>
-          <w:sz w:val="20"/>
-        </w:rPr>
-        <w:t>#ds:id r:p_xxx_r_yyy h:100 #</w:t>
-      </w:r>
-      <w:r>
-        <w:t xml:space="preserve">, tương tự </w:t>
-      </w:r>
-      <w:r>
-        <w:rPr>
-          <w:rFonts w:ascii="Consolas" w:hAnsi="Consolas"/>
-          <w:sz w:val="20"/>
-        </w:rPr>
-        <w:t>is</w:t>
-      </w:r>
-      <w:r>
-        <w:t>/</w:t>
-      </w:r>
-      <w:r>
-        <w:rPr>
-          <w:rFonts w:ascii="Consolas" w:hAnsi="Consolas"/>
-          <w:sz w:val="20"/>
-        </w:rPr>
-        <w:t>st</w:t>
-      </w:r>
-      <w:r>
-        <w:t>).</w:t>
+        <w:t>AC4: Given Submit đủ marker Then Word+marker → PDF/base64 → POST /api/econtract/push (BE); lưu envelopeId / trạng thái tích hợp.</w:t>
       </w:r>
     </w:p>
     <w:p>
       <w:pPr>
-        <w:pStyle w:val="ListBullet"/>
+        <w:pStyle w:val="Heading2"/>
       </w:pPr>
       <w:r>
         <w:rPr>
-          <w:b/>
+          <w:color w:val="2C5282"/>
         </w:rPr>
-        <w:t>AC3</w:t>
-      </w:r>
-      <w:r>
-        <w:t xml:space="preserve"> </w:t>
-      </w:r>
-      <w:r>
-        <w:rPr>
-          <w:rFonts w:ascii="Consolas" w:hAnsi="Consolas"/>
-          <w:sz w:val="20"/>
-        </w:rPr>
-        <w:t>[A7 đã chốt]</w:t>
-      </w:r>
-      <w:r>
-        <w:t xml:space="preserve">: Given màn gán marker Then Purchasing </w:t>
-      </w:r>
-      <w:r>
-        <w:rPr>
-          <w:b/>
-        </w:rPr>
-        <w:t>kéo-thả marker trên preview</w:t>
-      </w:r>
-      <w:r>
-        <w:t xml:space="preserve"> (demo hiện click-chọn; kéo-thả thuộc hoàn thiện Sprint 1).</w:t>
-      </w:r>
-    </w:p>
-    <w:p>
-      <w:pPr>
-        <w:pStyle w:val="Heading2"/>
-      </w:pPr>
-      <w:r>
         <w:t>US-P07 — Gửi duyệt &amp; xử lý feedback khi bị reject · Demo ✅</w:t>
       </w:r>
     </w:p>
     <w:p>
       <w:pPr>
         <w:pStyle w:val="ListBullet"/>
+        <w:spacing w:after="40"/>
       </w:pPr>
       <w:r>
-        <w:rPr>
-          <w:b/>
-        </w:rPr>
-        <w:t>AC1</w:t>
-      </w:r>
-      <w:r>
-        <w:t xml:space="preserve">: Given đủ marker When Submit for approval Then trạng thái → </w:t>
-      </w:r>
-      <w:r>
-        <w:rPr>
-          <w:rFonts w:ascii="Consolas" w:hAnsi="Consolas"/>
-          <w:sz w:val="20"/>
-        </w:rPr>
-        <w:t>pending_manager</w:t>
-      </w:r>
-      <w:r>
-        <w:t>; Purchasing Manager thấy ticket trong màn Task.</w:t>
+        <w:t>AC1: Given đã lưu chỉnh sửa When Submit for approval Then trạng thái → pending_manager (nếu có Line Manager) hoặc pending_legal — không yêu cầu marker.</w:t>
       </w:r>
     </w:p>
     <w:p>
       <w:pPr>
         <w:pStyle w:val="ListBullet"/>
+        <w:spacing w:after="40"/>
       </w:pPr>
       <w:r>
-        <w:rPr>
-          <w:b/>
-        </w:rPr>
-        <w:t>AC2</w:t>
-      </w:r>
-      <w:r>
-        <w:t>: Given Manager hoặc Legal reject Then ticket về Task của Purchasing owner kèm comment; Purchasing sửa (TH1 checklist / TH2 Accept Track Changes / TH3 reupload) rồi gửi lại (version mới).</w:t>
+        <w:t>AC2: Given Manager hoặc Legal reject Then ticket về Task của Purchasing owner kèm comment; Purchasing sửa trên workspace (PT1) rồi gửi lại (version mới).</w:t>
       </w:r>
     </w:p>
     <w:p>
       <w:pPr>
         <w:pStyle w:val="ListBullet"/>
+        <w:spacing w:after="40"/>
       </w:pPr>
       <w:r>
-        <w:rPr>
-          <w:b/>
-        </w:rPr>
-        <w:t>AC3</w:t>
-      </w:r>
-      <w:r>
-        <w:t xml:space="preserve"> </w:t>
-      </w:r>
-      <w:r>
-        <w:rPr>
-          <w:rFonts w:ascii="Consolas" w:hAnsi="Consolas"/>
-          <w:sz w:val="20"/>
-        </w:rPr>
-        <w:t>[A4 đã chốt]</w:t>
-      </w:r>
-      <w:r>
-        <w:t xml:space="preserve">: Given feedback có file đính kèm Then file được lưu và </w:t>
-      </w:r>
-      <w:r>
-        <w:rPr>
-          <w:b/>
-        </w:rPr>
-        <w:t>Purchasing tải được</w:t>
-      </w:r>
-      <w:r>
-        <w:t>.</w:t>
+        <w:t>AC3 [A4 đã chốt — phạm vi Sprint 1]: Reject cơ bản kèm comment (+ file đính kèm nếu có) là đủ. UI chi tiết TH1/TH2/TH3 + PA-A/PA-B → VII ngoài phạm vi.</w:t>
       </w:r>
     </w:p>
     <w:p>
@@ -821,35 +434,28 @@
         <w:pStyle w:val="Heading2"/>
       </w:pPr>
       <w:r>
-        <w:t>US-P08 — Chỉ thấy hợp đồng của mình · Demo ✅ `[A5 đã chốt: theo user]`</w:t>
+        <w:rPr>
+          <w:color w:val="2C5282"/>
+        </w:rPr>
+        <w:t>US-P08 — Chỉ thấy hợp đồng của mình · Demo ✅ [A5 đã chốt: theo user]</w:t>
       </w:r>
     </w:p>
     <w:p>
       <w:pPr>
         <w:pStyle w:val="ListBullet"/>
+        <w:spacing w:after="40"/>
       </w:pPr>
       <w:r>
-        <w:rPr>
-          <w:b/>
-        </w:rPr>
-        <w:t>AC1</w:t>
-      </w:r>
-      <w:r>
-        <w:t>: Given đăng nhập Purchasing A Then danh sách chỉ gồm HĐ do chính A tạo (hoặc gắn owner A).</w:t>
+        <w:t>AC1: Given đăng nhập Purchasing A Then danh sách chỉ gồm HĐ do chính A tạo (hoặc gắn owner A).</w:t>
       </w:r>
     </w:p>
     <w:p>
       <w:pPr>
         <w:pStyle w:val="ListBullet"/>
+        <w:spacing w:after="40"/>
       </w:pPr>
       <w:r>
-        <w:rPr>
-          <w:b/>
-        </w:rPr>
-        <w:t>AC2</w:t>
-      </w:r>
-      <w:r>
-        <w:t>: Given Purchasing A mở URL trực tiếp HĐ của B Then bị chặn / không thấy trong list.</w:t>
+        <w:t>AC2: Given Purchasing A mở URL trực tiếp HĐ của B Then bị chặn / không thấy trong list.</w:t>
       </w:r>
     </w:p>
     <w:p>
@@ -857,110 +463,74 @@
         <w:pStyle w:val="Heading2"/>
       </w:pPr>
       <w:r>
-        <w:t>US-P09 — Sửa trực tiếp inline (Phương thức 2) · Demo 🟡 (handler có, editable chưa bật) `[phụ thuộc C6]`</w:t>
+        <w:rPr>
+          <w:color w:val="2C5282"/>
+        </w:rPr>
+        <w:t>US-P09 — Sửa trực tiếp inline (PT2) · ❌ Bỏ khỏi Sprint 1 (Blueprint VII)</w:t>
       </w:r>
     </w:p>
     <w:p>
       <w:pPr>
         <w:pStyle w:val="ListBullet"/>
+        <w:spacing w:after="40"/>
       </w:pPr>
       <w:r>
-        <w:rPr>
-          <w:b/>
-        </w:rPr>
-        <w:t>AC1</w:t>
-      </w:r>
-      <w:r>
-        <w:t>: Given vùng mở trên preview When bôi đen/gõ đè Then nội dung thay đổi, diff tách lớp với diff AI.</w:t>
+        <w:t>Sprint 1 chỉ PT1 Chat. Handler demo có thể giữ; không bật editable / không AC deliver PT2.</w:t>
       </w:r>
     </w:p>
     <w:p>
       <w:pPr>
-        <w:pStyle w:val="ListBullet"/>
+        <w:pStyle w:val="Heading2"/>
       </w:pPr>
       <w:r>
         <w:rPr>
-          <w:b/>
+          <w:color w:val="2C5282"/>
         </w:rPr>
-        <w:t>AC2</w:t>
-      </w:r>
-      <w:r>
-        <w:t>: Given vị trí thuộc vùng khoá When cố sửa Then bị chặn (allow-list Lớp 1).</w:t>
+        <w:t>US-P10 — Lưu thủ công, không autosave (Mục 4.3) · Demo 🟡 [A4c đã chốt]</w:t>
       </w:r>
     </w:p>
     <w:p>
       <w:pPr>
         <w:pStyle w:val="ListBullet"/>
+        <w:spacing w:after="40"/>
       </w:pPr>
       <w:r>
-        <w:rPr>
-          <w:b/>
-        </w:rPr>
-        <w:t>AC3</w:t>
-      </w:r>
-      <w:r>
-        <w:t>: Given sửa inline Then audit trail ghi nguồn gốc "sửa trực tiếp".</w:t>
+        <w:t>AC1: Given có thay đổi chưa lưu When rời trang / đổi bước wizard Then cảnh báo Lưu / Thoát không lưu / Huỷ (áp dụng tối thiểu luồng Gán chữ ký).</w:t>
       </w:r>
     </w:p>
     <w:p>
       <w:pPr>
-        <w:pStyle w:val="Heading2"/>
+        <w:pStyle w:val="ListBullet"/>
+        <w:spacing w:after="40"/>
       </w:pPr>
       <w:r>
-        <w:t>US-P10 — Lưu thủ công, không autosave (Mục 4.3) · Demo ❌ `[A4c đã chốt]`</w:t>
+        <w:t>AC2: Given còn thay đổi chưa lưu Then nút chuyển bước / Submit bị chặn đến khi lưu (wizard identify-signers / design-markers).</w:t>
       </w:r>
     </w:p>
     <w:p>
       <w:pPr>
         <w:pStyle w:val="ListBullet"/>
+        <w:spacing w:after="40"/>
       </w:pPr>
       <w:r>
-        <w:rPr>
-          <w:b/>
-        </w:rPr>
-        <w:t>AC1</w:t>
-      </w:r>
-      <w:r>
-        <w:t>: Given có thay đổi chưa lưu When rời trang Then cảnh báo Lưu / Thoát không lưu / Huỷ.</w:t>
+        <w:t>AC3: Phạm vi đầy đủ “mọi chỉnh sửa trên workspace không autosave” — hoàn thiện theo Tech Design; demo hiện một phần autosave trên AI workspace.</w:t>
       </w:r>
     </w:p>
     <w:p>
       <w:pPr>
-        <w:pStyle w:val="ListBullet"/>
+        <w:pStyle w:val="Heading2"/>
       </w:pPr>
       <w:r>
         <w:rPr>
-          <w:b/>
+          <w:color w:val="2C5282"/>
         </w:rPr>
-        <w:t>AC2</w:t>
-      </w:r>
-      <w:r>
-        <w:t>: Given user bấm Lưu Then hỏi xác nhận trước khi ghi.</w:t>
+        <w:t>US-P11 — Purchasing Manager approve trước Legal · Demo ✅ /dashboard/tasks [A3 đã chốt]</w:t>
       </w:r>
     </w:p>
     <w:p>
       <w:pPr>
-        <w:pStyle w:val="ListBullet"/>
-      </w:pPr>
-      <w:r>
-        <w:rPr>
-          <w:b/>
-        </w:rPr>
-        <w:t>AC3</w:t>
-      </w:r>
-      <w:r>
-        <w:t>: Given còn thay đổi chưa lưu Then nút submit bị chặn đến khi lưu.</w:t>
-      </w:r>
-    </w:p>
-    <w:p>
-      <w:pPr>
-        <w:pStyle w:val="Heading2"/>
-      </w:pPr>
-      <w:r>
-        <w:t>US-P11 — Purchasing Manager approve trước Legal · Demo ✅ `/dashboard/tasks` `[A3 đã chốt]`</w:t>
-      </w:r>
-    </w:p>
-    <w:p>
+        <w:spacing w:after="80"/>
+      </w:pPr>
       <w:r>
         <w:t>Là Purchasing Manager, tôi muốn duyệt ticket của nhân viên trước khi gửi Legal.</w:t>
       </w:r>
@@ -968,87 +538,37 @@
     <w:p>
       <w:pPr>
         <w:pStyle w:val="ListBullet"/>
+        <w:spacing w:after="40"/>
       </w:pPr>
       <w:r>
-        <w:rPr>
-          <w:b/>
-        </w:rPr>
-        <w:t>AC1</w:t>
-      </w:r>
-      <w:r>
-        <w:t>: Given Purchasing Submit for approval Then ticket vào Task Manager (</w:t>
-      </w:r>
-      <w:r>
-        <w:rPr>
-          <w:rFonts w:ascii="Consolas" w:hAnsi="Consolas"/>
-          <w:sz w:val="20"/>
-        </w:rPr>
-        <w:t>pending_manager</w:t>
-      </w:r>
-      <w:r>
-        <w:t xml:space="preserve">); Manager Start → Approve → </w:t>
-      </w:r>
-      <w:r>
-        <w:rPr>
-          <w:rFonts w:ascii="Consolas" w:hAnsi="Consolas"/>
-          <w:sz w:val="20"/>
-        </w:rPr>
-        <w:t>pending_legal</w:t>
-      </w:r>
-      <w:r>
-        <w:t>.</w:t>
+        <w:t>AC1: Given Purchasing Submit for approval và owner có Line Manager Then ticket vào Task Manager (pending_manager); Manager Start → Approve → pending_legal.</w:t>
       </w:r>
     </w:p>
     <w:p>
       <w:pPr>
         <w:pStyle w:val="ListBullet"/>
+        <w:spacing w:after="40"/>
       </w:pPr>
       <w:r>
-        <w:rPr>
-          <w:b/>
-        </w:rPr>
-        <w:t>AC2</w:t>
-      </w:r>
-      <w:r>
-        <w:t>: Given Manager Reject Then ticket trả Purchasing (Task) kèm lý do/comment; có thể kèm file.</w:t>
+        <w:t>AC2: Given Manager Reject Then ticket trả Purchasing (Task) kèm lý do/comment; có thể kèm file.</w:t>
       </w:r>
     </w:p>
     <w:p>
       <w:pPr>
         <w:pStyle w:val="ListBullet"/>
+        <w:spacing w:after="40"/>
       </w:pPr>
       <w:r>
-        <w:rPr>
-          <w:b/>
-        </w:rPr>
-        <w:t>AC3</w:t>
-      </w:r>
-      <w:r>
-        <w:t>: Given Manager duyệt Then áp dụng cùng TH1 (comment)/TH2 (Track Changes)/TH3 (tải–sửa–upload + Reject) như Legal (Blueprint).</w:t>
+        <w:t>AC3: Sprint 1: Approve / Reject cơ bản (comment). UI TH1/TH2/TH3 chi tiết → VII.</w:t>
       </w:r>
     </w:p>
     <w:p>
       <w:pPr>
         <w:pStyle w:val="ListBullet"/>
+        <w:spacing w:after="40"/>
       </w:pPr>
       <w:r>
-        <w:rPr>
-          <w:b/>
-        </w:rPr>
-        <w:t>AC4</w:t>
-      </w:r>
-      <w:r>
-        <w:t xml:space="preserve">: Role </w:t>
-      </w:r>
-      <w:r>
-        <w:rPr>
-          <w:rFonts w:ascii="Consolas" w:hAnsi="Consolas"/>
-          <w:sz w:val="20"/>
-        </w:rPr>
-        <w:t>purchasing_manager</w:t>
-      </w:r>
-      <w:r>
-        <w:t>; Task cá nhân — chỉ thấy ticket cần mình xử lý.</w:t>
+        <w:t>AC4: Role purchasing_manager; Task cá nhân — chỉ thấy ticket cần mình xử lý.</w:t>
       </w:r>
     </w:p>
     <w:p>
@@ -1056,6 +576,9 @@
         <w:pStyle w:val="Heading1"/>
       </w:pPr>
       <w:r>
+        <w:rPr>
+          <w:color w:val="1A365D"/>
+        </w:rPr>
         <w:t>Epic 2 — Legal / Manager: Duyệt hợp đồng</w:t>
       </w:r>
     </w:p>
@@ -1064,148 +587,64 @@
         <w:pStyle w:val="Heading2"/>
       </w:pPr>
       <w:r>
-        <w:t>US-L01 — Màn Task (Purchasing / Manager / Legal) · Demo ✅ `/dashboard/tasks`</w:t>
+        <w:rPr>
+          <w:color w:val="2C5282"/>
+        </w:rPr>
+        <w:t>US-L01 — Màn Task (Purchasing / Manager / Legal) · Demo ✅ /dashboard/tasks</w:t>
       </w:r>
     </w:p>
     <w:p>
       <w:pPr>
         <w:pStyle w:val="ListBullet"/>
+        <w:spacing w:after="40"/>
       </w:pPr>
       <w:r>
-        <w:rPr>
-          <w:b/>
-        </w:rPr>
-        <w:t>AC1</w:t>
-      </w:r>
-      <w:r>
-        <w:t xml:space="preserve">: Given đăng nhập Legal và có HĐ </w:t>
-      </w:r>
-      <w:r>
-        <w:rPr>
-          <w:rFonts w:ascii="Consolas" w:hAnsi="Consolas"/>
-          <w:sz w:val="20"/>
-        </w:rPr>
-        <w:t>pending_legal</w:t>
-      </w:r>
-      <w:r>
-        <w:t xml:space="preserve"> Then Task hiển thị ticket chờ duyệt; bấm </w:t>
-      </w:r>
-      <w:r>
-        <w:rPr>
-          <w:b/>
-        </w:rPr>
-        <w:t>Start</w:t>
-      </w:r>
-      <w:r>
-        <w:t xml:space="preserve"> mở chi tiết.</w:t>
+        <w:t>AC1: Given đăng nhập Legal và có HĐ pending_legal Then Task hiển thị ticket chờ duyệt; bấm Start mở chi tiết.</w:t>
       </w:r>
     </w:p>
     <w:p>
       <w:pPr>
         <w:pStyle w:val="ListBullet"/>
+        <w:spacing w:after="40"/>
       </w:pPr>
       <w:r>
-        <w:rPr>
-          <w:b/>
-        </w:rPr>
-        <w:t>AC2</w:t>
-      </w:r>
-      <w:r>
-        <w:t xml:space="preserve">: Given đăng nhập Purchasing Manager và có HĐ </w:t>
-      </w:r>
-      <w:r>
-        <w:rPr>
-          <w:rFonts w:ascii="Consolas" w:hAnsi="Consolas"/>
-          <w:sz w:val="20"/>
-        </w:rPr>
-        <w:t>pending_manager</w:t>
-      </w:r>
-      <w:r>
-        <w:t xml:space="preserve"> Then Task hiển thị ticket chờ duyệt Manager.</w:t>
+        <w:t>AC2: Given đăng nhập Purchasing Manager và có HĐ pending_manager Then Task hiển thị ticket chờ duyệt Manager.</w:t>
       </w:r>
     </w:p>
     <w:p>
       <w:pPr>
         <w:pStyle w:val="ListBullet"/>
+        <w:spacing w:after="40"/>
       </w:pPr>
       <w:r>
-        <w:rPr>
-          <w:b/>
-        </w:rPr>
-        <w:t>AC3</w:t>
-      </w:r>
-      <w:r>
-        <w:t>: Given màn chi tiết (Manager/Legal) Then có tab Thông tin chung + AI Review / quyết định Approve·Reject.</w:t>
+        <w:t>AC3: Given màn chi tiết (Manager/Legal) Then có tab Thông tin chung + AI Review / quyết định Approve·Reject.</w:t>
       </w:r>
     </w:p>
     <w:p>
       <w:pPr>
         <w:pStyle w:val="ListBullet"/>
+        <w:spacing w:after="40"/>
       </w:pPr>
       <w:r>
-        <w:rPr>
-          <w:b/>
-        </w:rPr>
-        <w:t>AC4</w:t>
-      </w:r>
-      <w:r>
-        <w:t xml:space="preserve">: Given Purchasing có ticket bị reject Then Task hiển thị ticket trả về </w:t>
-      </w:r>
-      <w:r>
-        <w:rPr>
-          <w:b/>
-        </w:rPr>
-        <w:t>của chính user</w:t>
-      </w:r>
-      <w:r>
-        <w:t>; Start mở workspace.</w:t>
+        <w:t>AC4: Given Purchasing có ticket bị reject hoặc pending_markers Then Task hiển thị ticket của chính user; Start mở workspace / Gán chữ ký.</w:t>
       </w:r>
     </w:p>
     <w:p>
       <w:pPr>
         <w:pStyle w:val="ListBullet"/>
+        <w:spacing w:after="40"/>
       </w:pPr>
       <w:r>
-        <w:rPr>
-          <w:b/>
-        </w:rPr>
-        <w:t>AC5</w:t>
-      </w:r>
-      <w:r>
-        <w:t xml:space="preserve">: </w:t>
-      </w:r>
-      <w:r>
-        <w:rPr>
-          <w:b/>
-        </w:rPr>
-        <w:t>Task cá nhân</w:t>
-      </w:r>
-      <w:r>
-        <w:t xml:space="preserve"> — không thấy task người khác. Không có task → trạng thái trống rõ ràng.</w:t>
+        <w:t>AC5: Task cá nhân — không thấy task người khác. Không có task → trạng thái trống rõ ràng.</w:t>
       </w:r>
     </w:p>
     <w:p>
       <w:pPr>
         <w:pStyle w:val="ListBullet"/>
+        <w:spacing w:after="40"/>
       </w:pPr>
       <w:r>
-        <w:rPr>
-          <w:b/>
-        </w:rPr>
-        <w:t>AC6</w:t>
-      </w:r>
-      <w:r>
-        <w:t xml:space="preserve">: Task Name: dòng 1 = </w:t>
-      </w:r>
-      <w:r>
-        <w:rPr>
-          <w:rFonts w:ascii="Consolas" w:hAnsi="Consolas"/>
-          <w:sz w:val="20"/>
-        </w:rPr>
-        <w:t>Số tài liệu - Tên tài liệu</w:t>
-      </w:r>
-      <w:r>
-        <w:t>; dòng 2 = Họ tên người yêu cầu.</w:t>
+        <w:t>AC6: Task Name: dòng 1 = Số tài liệu - Tên tài liệu; dòng 2 = Họ tên người yêu cầu.</w:t>
       </w:r>
     </w:p>
     <w:p>
@@ -1213,93 +652,46 @@
         <w:pStyle w:val="Heading2"/>
       </w:pPr>
       <w:r>
+        <w:rPr>
+          <w:color w:val="2C5282"/>
+        </w:rPr>
         <w:t>US-L02 — Approve / Reject với Structured Feedback · Demo ✅</w:t>
       </w:r>
     </w:p>
     <w:p>
       <w:pPr>
         <w:pStyle w:val="ListBullet"/>
+        <w:spacing w:after="40"/>
       </w:pPr>
       <w:r>
-        <w:rPr>
-          <w:b/>
-        </w:rPr>
-        <w:t>AC1</w:t>
-      </w:r>
-      <w:r>
-        <w:t>: Given bấm Từ chối mà chưa nhập comment Then bị chặn.</w:t>
+        <w:t>AC1: Given bấm Từ chối mà chưa nhập comment Then bị chặn.</w:t>
       </w:r>
     </w:p>
     <w:p>
       <w:pPr>
         <w:pStyle w:val="ListBullet"/>
+        <w:spacing w:after="40"/>
       </w:pPr>
       <w:r>
-        <w:rPr>
-          <w:b/>
-        </w:rPr>
-        <w:t>AC2</w:t>
-      </w:r>
-      <w:r>
-        <w:t xml:space="preserve"> </w:t>
-      </w:r>
-      <w:r>
-        <w:rPr>
-          <w:rFonts w:ascii="Consolas" w:hAnsi="Consolas"/>
-          <w:sz w:val="20"/>
-        </w:rPr>
-        <w:t>[A4 đã chốt]</w:t>
-      </w:r>
-      <w:r>
-        <w:t>: Given reject kèm comment + file đính kèm Then feedback lưu đầy đủ; Purchasing tải được.</w:t>
+        <w:t>AC2 [A4 đã chốt]: Given reject kèm comment (+ file đính kèm nếu có) Then feedback lưu; Purchasing tải được (nếu có file).</w:t>
       </w:r>
     </w:p>
     <w:p>
       <w:pPr>
         <w:pStyle w:val="ListBullet"/>
+        <w:spacing w:after="40"/>
       </w:pPr>
       <w:r>
-        <w:rPr>
-          <w:b/>
-        </w:rPr>
-        <w:t>AC3</w:t>
-      </w:r>
-      <w:r>
-        <w:t xml:space="preserve">: Given Manager Approve Then → </w:t>
-      </w:r>
-      <w:r>
-        <w:rPr>
-          <w:rFonts w:ascii="Consolas" w:hAnsi="Consolas"/>
-          <w:sz w:val="20"/>
-        </w:rPr>
-        <w:t>pending_legal</w:t>
-      </w:r>
-      <w:r>
-        <w:t>. Given Legal Approve Then → đồng bộ Econtract (trace API).</w:t>
+        <w:t>AC3: Given Manager Approve Then → pending_legal. Given Legal Approve Then resolve ma trận Phân quyền ký → pending_markers (+ Task người tạo) — không gọi FPT tại bước này.</w:t>
       </w:r>
     </w:p>
     <w:p>
       <w:pPr>
         <w:pStyle w:val="ListBullet"/>
+        <w:spacing w:after="40"/>
       </w:pPr>
       <w:r>
-        <w:rPr>
-          <w:b/>
-        </w:rPr>
-        <w:t>AC4</w:t>
-      </w:r>
-      <w:r>
-        <w:t xml:space="preserve"> </w:t>
-      </w:r>
-      <w:r>
-        <w:rPr>
-          <w:rFonts w:ascii="Consolas" w:hAnsi="Consolas"/>
-          <w:sz w:val="20"/>
-        </w:rPr>
-        <w:t>[TH1/TH2/TH3]</w:t>
-      </w:r>
-      <w:r>
-        <w:t>: Manager và Legal đều có đủ 3 trường hợp xử lý khi duyệt (comment / Track Changes / tải–sửa–upload + Reject) theo Blueprint.</w:t>
+        <w:t>AC4: Sprint 1 chỉ Approve/Reject cơ bản. UI TH1/TH2/TH3 + PA-A/PA-B → VII (Blueprint giữ mô tả tham chiếu phase sau).</w:t>
       </w:r>
     </w:p>
     <w:p>
@@ -1307,45 +699,28 @@
         <w:pStyle w:val="Heading2"/>
       </w:pPr>
       <w:r>
+        <w:rPr>
+          <w:color w:val="2C5282"/>
+        </w:rPr>
         <w:t>US-L03 — Xem toàn bộ hợp đồng · Demo ✅</w:t>
       </w:r>
     </w:p>
     <w:p>
       <w:pPr>
         <w:pStyle w:val="ListBullet"/>
+        <w:spacing w:after="40"/>
       </w:pPr>
       <w:r>
-        <w:rPr>
-          <w:b/>
-        </w:rPr>
-        <w:t>AC1</w:t>
-      </w:r>
-      <w:r>
-        <w:t>: Given đăng nhập Legal (hoặc IT/role có quyền list) Then thấy tất cả HĐ, kèm bộ lọc.</w:t>
+        <w:t>AC1: Given đăng nhập Legal (hoặc IT/role có quyền list) Then thấy tất cả HĐ, kèm bộ lọc.</w:t>
       </w:r>
     </w:p>
     <w:p>
       <w:pPr>
         <w:pStyle w:val="ListBullet"/>
+        <w:spacing w:after="40"/>
       </w:pPr>
       <w:r>
-        <w:rPr>
-          <w:b/>
-        </w:rPr>
-        <w:t>AC2</w:t>
-      </w:r>
-      <w:r>
-        <w:t>: Nút Quay lại từ Cấu hình HĐ / Configurations về danh sách HĐ (</w:t>
-      </w:r>
-      <w:r>
-        <w:rPr>
-          <w:rFonts w:ascii="Consolas" w:hAnsi="Consolas"/>
-          <w:sz w:val="20"/>
-        </w:rPr>
-        <w:t>/dashboard</w:t>
-      </w:r>
-      <w:r>
-        <w:t>).</w:t>
+        <w:t>AC2: Nút Quay lại từ Cấu hình HĐ / Configurations về danh sách HĐ (/dashboard).</w:t>
       </w:r>
     </w:p>
     <w:p>
@@ -1353,120 +728,49 @@
         <w:pStyle w:val="Heading2"/>
       </w:pPr>
       <w:r>
-        <w:t>US-L04 — Comment 2 chiều theo field/đoạn · Demo ❌ `[phụ thuộc A4 / PA-A·PA-B]`</w:t>
+        <w:rPr>
+          <w:color w:val="2C5282"/>
+        </w:rPr>
+        <w:t>US-L04 — Comment 2 chiều theo field/đoạn · ❌ Bỏ khỏi Sprint 1 (Blueprint VII)</w:t>
       </w:r>
     </w:p>
     <w:p>
       <w:pPr>
         <w:pStyle w:val="ListBullet"/>
+        <w:spacing w:after="40"/>
       </w:pPr>
       <w:r>
-        <w:rPr>
-          <w:b/>
-        </w:rPr>
-        <w:t>AC1</w:t>
-      </w:r>
-      <w:r>
-        <w:t>: Given Manager/Legal chọn đoạn When thêm comment Then comment anchor theo vị trí, thread 2 chiều.</w:t>
+        <w:t>Thuộc nhóm UI TH1 / PA-A·PA-B — ngoài phạm vi Sprint 1.</w:t>
       </w:r>
     </w:p>
     <w:p>
       <w:pPr>
-        <w:pStyle w:val="ListBullet"/>
+        <w:pStyle w:val="Heading2"/>
       </w:pPr>
       <w:r>
         <w:rPr>
-          <w:b/>
+          <w:color w:val="2C5282"/>
         </w:rPr>
-        <w:t>AC2</w:t>
-      </w:r>
-      <w:r>
-        <w:t>: Given đoạn bị xoá Then comment "orphaned" vẫn hiển thị.</w:t>
+        <w:t>US-L05 — Track Changes (chỉ vùng mở, luôn kèm Reject) · ❌ Bỏ khỏi Sprint 1 (Blueprint VII)</w:t>
       </w:r>
     </w:p>
     <w:p>
       <w:pPr>
         <w:pStyle w:val="ListBullet"/>
+        <w:spacing w:after="40"/>
       </w:pPr>
       <w:r>
-        <w:rPr>
-          <w:b/>
-        </w:rPr>
-        <w:t>AC3</w:t>
-      </w:r>
-      <w:r>
-        <w:t>: Given nhiều comment Then tổng hợp checklist việc cần sửa cho Purchasing.</w:t>
+        <w:t>Thuộc nhóm UI TH2 — ngoài phạm vi Sprint 1.</w:t>
       </w:r>
     </w:p>
     <w:p>
       <w:pPr>
-        <w:pStyle w:val="ListBullet"/>
+        <w:pStyle w:val="Heading1"/>
       </w:pPr>
       <w:r>
         <w:rPr>
-          <w:b/>
+          <w:color w:val="1A365D"/>
         </w:rPr>
-        <w:t>AC4</w:t>
-      </w:r>
-      <w:r>
-        <w:t>: Lưu trữ theo PA-A (gắn version) và/hoặc PA-B (ghi trong .docx) — chốt Tech Design.</w:t>
-      </w:r>
-    </w:p>
-    <w:p>
-      <w:pPr>
-        <w:pStyle w:val="Heading2"/>
-      </w:pPr>
-      <w:r>
-        <w:t>US-L05 — Track Changes (chỉ vùng mở, luôn kèm Reject) · Demo ❌ `[phụ thuộc A4b]`</w:t>
-      </w:r>
-    </w:p>
-    <w:p>
-      <w:pPr>
-        <w:pStyle w:val="ListBullet"/>
-      </w:pPr>
-      <w:r>
-        <w:rPr>
-          <w:b/>
-        </w:rPr>
-        <w:t>AC1</w:t>
-      </w:r>
-      <w:r>
-        <w:t>: Given Manager/Legal tô vùng mở When nhập đề xuất Then sinh diff đỏ/xanh tách lớp với diff AI.</w:t>
-      </w:r>
-    </w:p>
-    <w:p>
-      <w:pPr>
-        <w:pStyle w:val="ListBullet"/>
-      </w:pPr>
-      <w:r>
-        <w:rPr>
-          <w:b/>
-        </w:rPr>
-        <w:t>AC2</w:t>
-      </w:r>
-      <w:r>
-        <w:t>: Given có Track Changes Then chỉ Reject (không Approve kèm sửa).</w:t>
-      </w:r>
-    </w:p>
-    <w:p>
-      <w:pPr>
-        <w:pStyle w:val="ListBullet"/>
-      </w:pPr>
-      <w:r>
-        <w:rPr>
-          <w:b/>
-        </w:rPr>
-        <w:t>AC3</w:t>
-      </w:r>
-      <w:r>
-        <w:t>: Given Purchasing nhận reject Then Accept/Undo từng dòng hoặc cả file, rồi Submit for approval lại.</w:t>
-      </w:r>
-    </w:p>
-    <w:p>
-      <w:pPr>
-        <w:pStyle w:val="Heading1"/>
-      </w:pPr>
-      <w:r>
         <w:t>Epic 3 — Legal: Cấu hình checklist</w:t>
       </w:r>
     </w:p>
@@ -1475,188 +779,63 @@
         <w:pStyle w:val="Heading2"/>
       </w:pPr>
       <w:r>
-        <w:t>US-C01 — Cấu hình checklist loại HĐ cha · Demo ✅ `/dashboard/config`</w:t>
+        <w:rPr>
+          <w:color w:val="2C5282"/>
+        </w:rPr>
+        <w:t>US-C01 — Cấu hình checklist loại HĐ cha · Demo ✅ /dashboard/config</w:t>
       </w:r>
     </w:p>
     <w:p>
+      <w:pPr>
+        <w:spacing w:after="80"/>
+      </w:pPr>
       <w:r>
-        <w:t xml:space="preserve">Là Legal, tôi muốn soạn checklist Ideal/Fallback/Red Line gắn </w:t>
-      </w:r>
-      <w:r>
-        <w:rPr>
-          <w:b/>
-        </w:rPr>
-        <w:t>Loại hợp đồng</w:t>
-      </w:r>
-      <w:r>
-        <w:t xml:space="preserve"> (Form lists) để mọi Tên HĐ con được hưởng.</w:t>
+        <w:t>Là Legal, tôi muốn soạn checklist Ideal/Fallback/Red Line gắn Loại hợp đồng (Form lists) để mọi Tên HĐ con được hưởng.</w:t>
       </w:r>
     </w:p>
     <w:p>
       <w:pPr>
         <w:pStyle w:val="ListBullet"/>
+        <w:spacing w:after="40"/>
       </w:pPr>
       <w:r>
-        <w:rPr>
-          <w:b/>
-        </w:rPr>
-        <w:t>AC1</w:t>
-      </w:r>
-      <w:r>
-        <w:t xml:space="preserve">: Given quyền </w:t>
-      </w:r>
-      <w:r>
-        <w:rPr>
-          <w:rFonts w:ascii="Consolas" w:hAnsi="Consolas"/>
-          <w:sz w:val="20"/>
-        </w:rPr>
-        <w:t>contract_config</w:t>
-      </w:r>
-      <w:r>
-        <w:t xml:space="preserve"> When mở </w:t>
-      </w:r>
-      <w:r>
-        <w:rPr>
-          <w:rFonts w:ascii="Consolas" w:hAnsi="Consolas"/>
-          <w:sz w:val="20"/>
-        </w:rPr>
-        <w:t>/dashboard/config</w:t>
-      </w:r>
-      <w:r>
-        <w:t xml:space="preserve"> Then thấy card theo từng Loại HĐ </w:t>
-      </w:r>
-      <w:r>
-        <w:rPr>
-          <w:b/>
-        </w:rPr>
-        <w:t>active</w:t>
-      </w:r>
-      <w:r>
-        <w:t xml:space="preserve"> (không hiện loại đã lưu trữ Form lists).</w:t>
+        <w:t>AC1: Given quyền contract_config When mở /dashboard/config Then thấy card theo từng Loại HĐ active (không hiện loại đã lưu trữ Form lists).</w:t>
       </w:r>
     </w:p>
     <w:p>
       <w:pPr>
         <w:pStyle w:val="ListBullet"/>
+        <w:spacing w:after="40"/>
       </w:pPr>
       <w:r>
-        <w:rPr>
-          <w:b/>
-        </w:rPr>
-        <w:t>AC2</w:t>
-      </w:r>
-      <w:r>
-        <w:t xml:space="preserve">: Given bấm </w:t>
-      </w:r>
-      <w:r>
-        <w:rPr>
-          <w:b/>
-        </w:rPr>
-        <w:t>Cấu hình</w:t>
-      </w:r>
-      <w:r>
-        <w:t xml:space="preserve"> trên loại cha When chưa có config Then tạo </w:t>
-      </w:r>
-      <w:r>
-        <w:rPr>
-          <w:rFonts w:ascii="Consolas" w:hAnsi="Consolas"/>
-          <w:sz w:val="20"/>
-        </w:rPr>
-        <w:t>ContractTypeConfigVersion</w:t>
-      </w:r>
-      <w:r>
-        <w:t xml:space="preserve"> (</w:t>
-      </w:r>
-      <w:r>
-        <w:rPr>
-          <w:rFonts w:ascii="Consolas" w:hAnsi="Consolas"/>
-          <w:sz w:val="20"/>
-        </w:rPr>
-        <w:t>configLayer: parent</w:t>
-      </w:r>
-      <w:r>
-        <w:t xml:space="preserve">, </w:t>
-      </w:r>
-      <w:r>
-        <w:rPr>
-          <w:rFonts w:ascii="Consolas" w:hAnsi="Consolas"/>
-          <w:sz w:val="20"/>
-        </w:rPr>
-        <w:t>contractTypeId = category.id</w:t>
-      </w:r>
-      <w:r>
-        <w:t>).</w:t>
+        <w:t>AC2: Given bấm Cấu hình trên loại cha When chưa có config Then tạo ContractTypeConfigVersion (configLayer: parent, contractTypeId = category.id).</w:t>
       </w:r>
     </w:p>
     <w:p>
       <w:pPr>
         <w:pStyle w:val="ListBullet"/>
+        <w:spacing w:after="40"/>
       </w:pPr>
       <w:r>
-        <w:rPr>
-          <w:b/>
-        </w:rPr>
-        <w:t>AC3</w:t>
-      </w:r>
-      <w:r>
-        <w:t xml:space="preserve">: Given thêm/sửa điều khoản Then đủ trường: mã tự sinh </w:t>
-      </w:r>
-      <w:r>
-        <w:rPr>
-          <w:rFonts w:ascii="Consolas" w:hAnsi="Consolas"/>
-          <w:sz w:val="20"/>
-        </w:rPr>
-        <w:t>CL-xxx</w:t>
-      </w:r>
-      <w:r>
-        <w:t xml:space="preserve"> (read-only), tên, Loại, Severity, Ideal/Fallback/Red Line, rationale, keywords/patterns, bật rule/semantic. </w:t>
-      </w:r>
-      <w:r>
-        <w:rPr>
-          <w:b/>
-        </w:rPr>
-        <w:t>Không</w:t>
-      </w:r>
-      <w:r>
-        <w:t xml:space="preserve"> còn Content Control, cấp duyệt Fallback, đối tác, GT HĐ tối thiểu trên UI.</w:t>
+        <w:t>AC3: Given thêm/sửa điều khoản Then đủ trường: mã tự sinh CL-xxx (read-only), tên, Loại, Severity, Ideal/Fallback/Red Line, rationale, keywords/patterns, bật rule/semantic. Không còn Content Control, cấp duyệt Fallback, đối tác, GT HĐ tối thiểu trên UI.</w:t>
       </w:r>
     </w:p>
     <w:p>
       <w:pPr>
         <w:pStyle w:val="ListBullet"/>
+        <w:spacing w:after="40"/>
       </w:pPr>
       <w:r>
-        <w:rPr>
-          <w:b/>
-        </w:rPr>
-        <w:t>AC4</w:t>
-      </w:r>
-      <w:r>
-        <w:t>: Given bấm Lưu Then cấu hình ghi nhận; AI review dùng bản đã Lưu (không Draft/Publish). Audit trail ghi ai/lúc nào/thay đổi gì.</w:t>
+        <w:t>AC4: Given bấm Lưu Then cấu hình ghi nhận; AI review dùng bản đã Lưu (không Draft/Publish). Audit trail ghi ai/lúc nào/thay đổi gì.</w:t>
       </w:r>
     </w:p>
     <w:p>
       <w:pPr>
         <w:pStyle w:val="ListBullet"/>
+        <w:spacing w:after="40"/>
       </w:pPr>
       <w:r>
-        <w:rPr>
-          <w:b/>
-        </w:rPr>
-        <w:t>AC5</w:t>
-      </w:r>
-      <w:r>
-        <w:t xml:space="preserve">: Given nút Quay lại Then về danh sách HĐ </w:t>
-      </w:r>
-      <w:r>
-        <w:rPr>
-          <w:rFonts w:ascii="Consolas" w:hAnsi="Consolas"/>
-          <w:sz w:val="20"/>
-        </w:rPr>
-        <w:t>/dashboard</w:t>
-      </w:r>
-      <w:r>
-        <w:t>.</w:t>
+        <w:t>AC5: Given nút Quay lại Then về danh sách HĐ /dashboard.</w:t>
       </w:r>
     </w:p>
     <w:p>
@@ -1664,10 +843,16 @@
         <w:pStyle w:val="Heading2"/>
       </w:pPr>
       <w:r>
-        <w:t>US-C05 — Overlay checklist theo Tên HĐ (opt-in) · Demo ✅ `/dashboard/config`</w:t>
+        <w:rPr>
+          <w:color w:val="2C5282"/>
+        </w:rPr>
+        <w:t>US-C05 — Overlay checklist theo Tên HĐ (opt-in) · Demo ✅ /dashboard/config</w:t>
       </w:r>
     </w:p>
     <w:p>
+      <w:pPr>
+        <w:spacing w:after="80"/>
+      </w:pPr>
       <w:r>
         <w:t>Là Legal, tôi muốn (tuỳ chọn) thêm cấu hình riêng cho một Tên HĐ; AI gộp với checklist loại cha.</w:t>
       </w:r>
@@ -1675,106 +860,37 @@
     <w:p>
       <w:pPr>
         <w:pStyle w:val="ListBullet"/>
+        <w:spacing w:after="40"/>
       </w:pPr>
       <w:r>
-        <w:rPr>
-          <w:b/>
-        </w:rPr>
-        <w:t>AC1</w:t>
-      </w:r>
-      <w:r>
-        <w:t xml:space="preserve">: Given loại cha When chưa chọn overlay Then bảng con </w:t>
-      </w:r>
-      <w:r>
-        <w:rPr>
-          <w:b/>
-        </w:rPr>
-        <w:t>không</w:t>
-      </w:r>
-      <w:r>
-        <w:t xml:space="preserve"> liệt kê mọi tên Form lists — chỉ hiện tên đã có overlay.</w:t>
+        <w:t>AC1: Given loại cha When chưa chọn overlay Then bảng con không liệt kê mọi tên Form lists — chỉ hiện tên đã có overlay.</w:t>
       </w:r>
     </w:p>
     <w:p>
       <w:pPr>
         <w:pStyle w:val="ListBullet"/>
+        <w:spacing w:after="40"/>
       </w:pPr>
       <w:r>
-        <w:rPr>
-          <w:b/>
-        </w:rPr>
-        <w:t>AC2</w:t>
-      </w:r>
-      <w:r>
-        <w:t>: Given chọn tên trong dropdown “Thêm cấu hình riêng” + Thêm Then tạo overlay (</w:t>
-      </w:r>
-      <w:r>
-        <w:rPr>
-          <w:rFonts w:ascii="Consolas" w:hAnsi="Consolas"/>
-          <w:sz w:val="20"/>
-        </w:rPr>
-        <w:t>configLayer: child</w:t>
-      </w:r>
-      <w:r>
-        <w:t>) và mở chi tiết.</w:t>
+        <w:t>AC2: Given chọn tên trong dropdown “Thêm cấu hình riêng” + Thêm Then tạo overlay (configLayer: child) và mở chi tiết.</w:t>
       </w:r>
     </w:p>
     <w:p>
       <w:pPr>
         <w:pStyle w:val="ListBullet"/>
+        <w:spacing w:after="40"/>
       </w:pPr>
       <w:r>
-        <w:rPr>
-          <w:b/>
-        </w:rPr>
-        <w:t>AC3</w:t>
-      </w:r>
-      <w:r>
-        <w:t xml:space="preserve">: Given AI review HĐ có </w:t>
-      </w:r>
-      <w:r>
-        <w:rPr>
-          <w:rFonts w:ascii="Consolas" w:hAnsi="Consolas"/>
-          <w:sz w:val="20"/>
-        </w:rPr>
-        <w:t>intake.contractNameId</w:t>
-      </w:r>
-      <w:r>
-        <w:t xml:space="preserve"> Then </w:t>
-      </w:r>
-      <w:r>
-        <w:rPr>
-          <w:rFonts w:ascii="Consolas" w:hAnsi="Consolas"/>
-          <w:sz w:val="20"/>
-        </w:rPr>
-        <w:t>getMergedConfigForContractName</w:t>
-      </w:r>
-      <w:r>
-        <w:t xml:space="preserve"> = cha ∪ con; cùng </w:t>
-      </w:r>
-      <w:r>
-        <w:rPr>
-          <w:rFonts w:ascii="Consolas" w:hAnsi="Consolas"/>
-          <w:sz w:val="20"/>
-        </w:rPr>
-        <w:t>clause.code</w:t>
-      </w:r>
-      <w:r>
-        <w:t xml:space="preserve"> → bản con thắng; không overlay → chỉ cha.</w:t>
+        <w:t>AC3: Given AI review HĐ có intake.contractNameId Then getMergedConfigForContractName = cha ∪ con; cùng clause.code → bản con thắng; không overlay → chỉ cha.</w:t>
       </w:r>
     </w:p>
     <w:p>
       <w:pPr>
         <w:pStyle w:val="ListBullet"/>
+        <w:spacing w:after="40"/>
       </w:pPr>
       <w:r>
-        <w:rPr>
-          <w:b/>
-        </w:rPr>
-        <w:t>AC4</w:t>
-      </w:r>
-      <w:r>
-        <w:t>: Given Xóa overlay When usage = 0 Then overlay bị xóa, tên biến mất khỏi bảng; tên vẫn trên Form lists và vẫn hưởng checklist cha. Usage &gt; 0 → chặn xóa.</w:t>
+        <w:t>AC4: Given Xóa overlay When usage = 0 Then overlay bị xóa, tên biến mất khỏi bảng; tên vẫn trên Form lists và vẫn hưởng checklist cha. Usage &gt; 0 → chặn xóa.</w:t>
       </w:r>
     </w:p>
     <w:p>
@@ -1782,24 +898,19 @@
         <w:pStyle w:val="Heading2"/>
       </w:pPr>
       <w:r>
-        <w:t>US-C02 — Publish với governance · ❌ **Bỏ khỏi Sprint 1**</w:t>
+        <w:rPr>
+          <w:color w:val="2C5282"/>
+        </w:rPr>
+        <w:t>US-C02 — Publish với governance · ❌ Bỏ khỏi Sprint 1</w:t>
       </w:r>
     </w:p>
     <w:p>
       <w:pPr>
         <w:pStyle w:val="ListBullet"/>
+        <w:spacing w:after="40"/>
       </w:pPr>
       <w:r>
-        <w:t xml:space="preserve">Đã chốt: chỉ </w:t>
-      </w:r>
-      <w:r>
-        <w:rPr>
-          <w:b/>
-        </w:rPr>
-        <w:t>Sửa + Lưu</w:t>
-      </w:r>
-      <w:r>
-        <w:t>. Không Draft → Published; không role Legal Lead; không hạng mục quyền Publish checklist.</w:t>
+        <w:t>Đã chốt: chỉ Sửa + Lưu. Không Draft → Published; không role Legal Lead; không hạng mục quyền Publish checklist.</w:t>
       </w:r>
     </w:p>
     <w:p>
@@ -1807,12 +918,16 @@
         <w:pStyle w:val="Heading2"/>
       </w:pPr>
       <w:r>
-        <w:t>US-C03 — Import/Export checklist · ❌ **Bỏ khỏi Sprint 1** `[A10 đã chốt]`</w:t>
+        <w:rPr>
+          <w:color w:val="2C5282"/>
+        </w:rPr>
+        <w:t>US-C03 — Import/Export checklist · ❌ Bỏ khỏi Sprint 1 [A10 đã chốt]</w:t>
       </w:r>
     </w:p>
     <w:p>
       <w:pPr>
         <w:pStyle w:val="ListBullet"/>
+        <w:spacing w:after="40"/>
       </w:pPr>
       <w:r>
         <w:t>Legal soạn checklist trực tiếp trên UI (US-C01 / US-C05).</w:t>
@@ -1823,42 +938,47 @@
         <w:pStyle w:val="Heading2"/>
       </w:pPr>
       <w:r>
-        <w:t>US-C04 — Quản lý Approval Matrix · Demo 🟡 (metadata / link, chưa CRUD đầy đủ)</w:t>
+        <w:rPr>
+          <w:color w:val="2C5282"/>
+        </w:rPr>
+        <w:t>US-C04 — Phân quyền ký eContract + Approval Matrix confidence · Demo ✅ / 🟡</w:t>
       </w:r>
     </w:p>
     <w:p>
       <w:pPr>
         <w:pStyle w:val="ListBullet"/>
+        <w:spacing w:after="40"/>
       </w:pPr>
       <w:r>
-        <w:rPr>
-          <w:b/>
-        </w:rPr>
-        <w:t>AC1</w:t>
-      </w:r>
-      <w:r>
-        <w:t>: Given cấu hình loại HĐ Then có thể gắn/tham chiếu matrix (global hoặc theo loại) trên list/meta.</w:t>
+        <w:t>AC1 ✅: Given Configurations → tab Phân quyền ký Then cấu hình bảng Công ty (multi) × Loại HĐ × min/max × Xem xét|Ký chính × User; Lưu; resolve → recipients eContract (reviewer/signer).</w:t>
       </w:r>
     </w:p>
     <w:p>
       <w:pPr>
         <w:pStyle w:val="ListBullet"/>
+        <w:spacing w:after="40"/>
       </w:pPr>
       <w:r>
-        <w:rPr>
-          <w:b/>
-        </w:rPr>
-        <w:t>AC2</w:t>
-      </w:r>
-      <w:r>
-        <w:t>: Vai trò matrix với luồng Manager → Legal (routing vs cảnh báo + summary) — chốt Tech Design; demo chưa CRUD matrix đầy đủ.</w:t>
+        <w:t>AC2 ✅: Given Legal approve (hoặc mở /identify-signers) Then resolve ma trận → prefill bên mua; người tạo chỉnh được; Legal approve chặn nếu không khớp dòng.</w:t>
       </w:r>
     </w:p>
     <w:p>
       <w:pPr>
+        <w:pStyle w:val="ListBullet"/>
+        <w:spacing w:after="40"/>
+      </w:pPr>
+      <w:r>
+        <w:t>AC3 🟡: Approval Matrix (ngưỡng ↔ Manager/Director/BOD) vẫn dùng cảnh báo + % tin cậy — không routing nội bộ thay Line Manager→Legal.</w:t>
+      </w:r>
+    </w:p>
+    <w:p>
+      <w:pPr>
         <w:pStyle w:val="Heading1"/>
       </w:pPr>
       <w:r>
+        <w:rPr>
+          <w:color w:val="1A365D"/>
+        </w:rPr>
         <w:t>Epic 4 — IT: Cấu hình hệ thống</w:t>
       </w:r>
     </w:p>
@@ -1867,10 +987,16 @@
         <w:pStyle w:val="Heading2"/>
       </w:pPr>
       <w:r>
-        <w:t>US-I01 — Quản lý Form lists · Demo ✅ `/dashboard/configurations`</w:t>
+        <w:rPr>
+          <w:color w:val="2C5282"/>
+        </w:rPr>
+        <w:t>US-I01 — Quản lý Form lists · Demo ✅ /dashboard/configurations</w:t>
       </w:r>
     </w:p>
     <w:p>
+      <w:pPr>
+        <w:spacing w:after="80"/>
+      </w:pPr>
       <w:r>
         <w:t>Là IT, tôi muốn quản trị danh mục dropdown form Tạo tài liệu, gồm Lưu trữ an toàn khi đã có giao dịch.</w:t>
       </w:r>
@@ -1878,140 +1004,55 @@
     <w:p>
       <w:pPr>
         <w:pStyle w:val="ListBullet"/>
+        <w:spacing w:after="40"/>
       </w:pPr>
       <w:r>
-        <w:rPr>
-          <w:b/>
-        </w:rPr>
-        <w:t>AC1</w:t>
-      </w:r>
-      <w:r>
-        <w:t>: Given quyền Form lists When sửa Mã/Giá trị (Loại HĐ, Tên HĐ, Công ty, Loại giá trị, HĐ tiêu chuẩn, nhãn Chiết khấu) + Lưu Then form tạo review dùng giá trị mới.</w:t>
+        <w:t>AC1: Given quyền Form lists When sửa Mã/Giá trị (Loại HĐ, Tên HĐ, Công ty, Loại giá trị, HĐ tiêu chuẩn, nhãn Chiết khấu) + Lưu Then form tạo review dùng giá trị mới.</w:t>
       </w:r>
     </w:p>
     <w:p>
       <w:pPr>
         <w:pStyle w:val="ListBullet"/>
+        <w:spacing w:after="40"/>
       </w:pPr>
       <w:r>
-        <w:rPr>
-          <w:b/>
-        </w:rPr>
-        <w:t>AC2</w:t>
-      </w:r>
-      <w:r>
-        <w:t xml:space="preserve">: Given giá trị </w:t>
-      </w:r>
-      <w:r>
-        <w:rPr>
-          <w:b/>
-        </w:rPr>
-        <w:t>chưa</w:t>
-      </w:r>
-      <w:r>
-        <w:t xml:space="preserve"> có HĐ dùng When Xóa Then xóa được. Given </w:t>
-      </w:r>
-      <w:r>
-        <w:rPr>
-          <w:b/>
-        </w:rPr>
-        <w:t>đã</w:t>
-      </w:r>
-      <w:r>
-        <w:t xml:space="preserve"> có ≥1 HĐ When Xóa Then chặn — chỉ </w:t>
-      </w:r>
-      <w:r>
-        <w:rPr>
-          <w:b/>
-        </w:rPr>
-        <w:t>Lưu trữ</w:t>
-      </w:r>
-      <w:r>
-        <w:t>.</w:t>
+        <w:t>AC2: Given giá trị chưa có HĐ dùng When Xóa Then xóa được. Given đã có ≥1 HĐ When Xóa Then chặn — chỉ Lưu trữ.</w:t>
       </w:r>
     </w:p>
     <w:p>
       <w:pPr>
         <w:pStyle w:val="ListBullet"/>
+        <w:spacing w:after="40"/>
       </w:pPr>
       <w:r>
-        <w:rPr>
-          <w:b/>
-        </w:rPr>
-        <w:t>AC3</w:t>
-      </w:r>
-      <w:r>
-        <w:t>: Given Lưu trữ Then giá trị ẩn khỏi dropdown form tạo và list Cấu hình loại HĐ; HĐ cũ giữ tham chiếu.</w:t>
+        <w:t>AC3: Given Lưu trữ Then giá trị ẩn khỏi dropdown form tạo và list Cấu hình loại HĐ; HĐ cũ giữ tham chiếu.</w:t>
       </w:r>
     </w:p>
     <w:p>
       <w:pPr>
         <w:pStyle w:val="ListBullet"/>
+        <w:spacing w:after="40"/>
       </w:pPr>
       <w:r>
-        <w:rPr>
-          <w:b/>
-        </w:rPr>
-        <w:t>AC4</w:t>
-      </w:r>
-      <w:r>
-        <w:t xml:space="preserve">: Given nút </w:t>
-      </w:r>
-      <w:r>
-        <w:rPr>
-          <w:b/>
-        </w:rPr>
-        <w:t>Đã lưu trữ (n)</w:t>
-      </w:r>
-      <w:r>
-        <w:t xml:space="preserve"> trên header từng khối When bật Then hiện dòng archived (ô nhập disabled) + </w:t>
-      </w:r>
-      <w:r>
-        <w:rPr>
-          <w:b/>
-        </w:rPr>
-        <w:t>Bỏ lưu trữ</w:t>
-      </w:r>
-      <w:r>
-        <w:t>.</w:t>
+        <w:t>AC4: Given nút Đã lưu trữ (n) trên header từng khối When bật Then hiện dòng archived (ô nhập disabled) + Bỏ lưu trữ.</w:t>
       </w:r>
     </w:p>
     <w:p>
       <w:pPr>
         <w:pStyle w:val="ListBullet"/>
+        <w:spacing w:after="40"/>
       </w:pPr>
       <w:r>
-        <w:rPr>
-          <w:b/>
-        </w:rPr>
-        <w:t>AC5</w:t>
-      </w:r>
-      <w:r>
-        <w:t>: Given Chiết khấu (yes/no) Then chỉ sửa nhãn — không Thêm/Xóa/Lưu trữ.</w:t>
+        <w:t>AC5: Given Chiết khấu (yes/no) Then chỉ sửa nhãn — không Thêm/Xóa/Lưu trữ.</w:t>
       </w:r>
     </w:p>
     <w:p>
       <w:pPr>
         <w:pStyle w:val="ListBullet"/>
+        <w:spacing w:after="40"/>
       </w:pPr>
       <w:r>
-        <w:rPr>
-          <w:b/>
-        </w:rPr>
-        <w:t>AC6</w:t>
-      </w:r>
-      <w:r>
-        <w:t xml:space="preserve">: Given nút Quay lại Then về </w:t>
-      </w:r>
-      <w:r>
-        <w:rPr>
-          <w:rFonts w:ascii="Consolas" w:hAnsi="Consolas"/>
-          <w:sz w:val="20"/>
-        </w:rPr>
-        <w:t>/dashboard</w:t>
-      </w:r>
-      <w:r>
-        <w:t>. User không đủ quyền → redirect.</w:t>
+        <w:t>AC6: Given nút Quay lại Then về /dashboard. User không đủ quyền → redirect.</w:t>
       </w:r>
     </w:p>
     <w:p>
@@ -2019,108 +1060,37 @@
         <w:pStyle w:val="Heading2"/>
       </w:pPr>
       <w:r>
-        <w:t>US-I02 — Quản lý System Prompt · Demo ✅ `[phụ thuộc B7]`</w:t>
+        <w:rPr>
+          <w:color w:val="2C5282"/>
+        </w:rPr>
+        <w:t>US-I02 — Quản lý System Prompt · Demo ✅ [phụ thuộc B7]</w:t>
       </w:r>
     </w:p>
     <w:p>
       <w:pPr>
         <w:pStyle w:val="ListBullet"/>
+        <w:spacing w:after="40"/>
       </w:pPr>
       <w:r>
-        <w:rPr>
-          <w:b/>
-        </w:rPr>
-        <w:t>AC1</w:t>
-      </w:r>
-      <w:r>
-        <w:t xml:space="preserve">: Given IT mở tab System prompts Then thấy </w:t>
-      </w:r>
-      <w:r>
-        <w:rPr>
-          <w:b/>
-        </w:rPr>
-        <w:t>3 stage</w:t>
-      </w:r>
-      <w:r>
-        <w:t xml:space="preserve">: </w:t>
-      </w:r>
-      <w:r>
-        <w:rPr>
-          <w:rFonts w:ascii="Consolas" w:hAnsi="Consolas"/>
-          <w:sz w:val="20"/>
-        </w:rPr>
-        <w:t>checklist_review</w:t>
-      </w:r>
-      <w:r>
-        <w:t xml:space="preserve"> · </w:t>
-      </w:r>
-      <w:r>
-        <w:rPr>
-          <w:rFonts w:ascii="Consolas" w:hAnsi="Consolas"/>
-          <w:sz w:val="20"/>
-        </w:rPr>
-        <w:t>chat_edit</w:t>
-      </w:r>
-      <w:r>
-        <w:t xml:space="preserve"> · </w:t>
-      </w:r>
-      <w:r>
-        <w:rPr>
-          <w:rFonts w:ascii="Consolas" w:hAnsi="Consolas"/>
-          <w:sz w:val="20"/>
-        </w:rPr>
-        <w:t>ai_summary_fairness</w:t>
-      </w:r>
-      <w:r>
-        <w:t xml:space="preserve"> (không còn Field validation).</w:t>
+        <w:t>AC1: Given IT mở tab System prompts Then thấy 3 stage: checklist_review · chat_edit · ai_summary_fairness (không còn Field validation).</w:t>
       </w:r>
     </w:p>
     <w:p>
       <w:pPr>
         <w:pStyle w:val="ListBullet"/>
+        <w:spacing w:after="40"/>
       </w:pPr>
       <w:r>
-        <w:rPr>
-          <w:b/>
-        </w:rPr>
-        <w:t>AC2</w:t>
-      </w:r>
-      <w:r>
-        <w:t>: Given sửa prompt CURRENT Then validate placeholder (</w:t>
-      </w:r>
-      <w:r>
-        <w:rPr>
-          <w:rFonts w:ascii="Consolas" w:hAnsi="Consolas"/>
-          <w:sz w:val="20"/>
-        </w:rPr>
-        <w:t>{{checklist_items}}</w:t>
-      </w:r>
-      <w:r>
-        <w:t>…) và chặn hardcode nội dung pháp lý trước khi lưu.</w:t>
+        <w:t>AC2: Given sửa prompt CURRENT Then validate placeholder ({{checklist_items}}…) và chặn hardcode nội dung pháp lý trước khi lưu — ghi qua BE GET/PUT /api/system-prompts (file Git /prompts).</w:t>
       </w:r>
     </w:p>
     <w:p>
       <w:pPr>
         <w:pStyle w:val="ListBullet"/>
+        <w:spacing w:after="40"/>
       </w:pPr>
       <w:r>
-        <w:rPr>
-          <w:b/>
-        </w:rPr>
-        <w:t>AC3</w:t>
-      </w:r>
-      <w:r>
-        <w:t xml:space="preserve">: Given thay đổi trên Git Then CI </w:t>
-      </w:r>
-      <w:r>
-        <w:rPr>
-          <w:rFonts w:ascii="Consolas" w:hAnsi="Consolas"/>
-          <w:sz w:val="20"/>
-        </w:rPr>
-        <w:t>validate-prompts</w:t>
-      </w:r>
-      <w:r>
-        <w:t xml:space="preserve"> phải pass mới merge.</w:t>
+        <w:t>AC3: Given thay đổi trên Git Then CI validate-prompts phải pass mới merge.</w:t>
       </w:r>
     </w:p>
     <w:p>
@@ -2128,35 +1098,28 @@
         <w:pStyle w:val="Heading2"/>
       </w:pPr>
       <w:r>
-        <w:t>US-I03 — Users &amp; phân quyền hạng mục · Demo ✅ `/dashboard/users`</w:t>
+        <w:rPr>
+          <w:color w:val="2C5282"/>
+        </w:rPr>
+        <w:t>US-I03 — Users &amp; phân quyền hạng mục · Demo ✅ /dashboard/users</w:t>
       </w:r>
     </w:p>
     <w:p>
       <w:pPr>
         <w:pStyle w:val="ListBullet"/>
+        <w:spacing w:after="40"/>
       </w:pPr>
       <w:r>
-        <w:rPr>
-          <w:b/>
-        </w:rPr>
-        <w:t>AC1</w:t>
-      </w:r>
-      <w:r>
-        <w:t>: Given IT When tạo/sửa user Then có Họ tên, username, role, tick quyền hạng mục (Task, Danh sách HĐ, Tạo tài liệu, Cấu hình HĐ, Form lists, System prompts, Users…).</w:t>
+        <w:t>AC1: Given IT When tạo/sửa user Then có Họ tên, username, role, Line Manager, tick quyền hạng mục (Task, Danh sách HĐ, Tạo tài liệu, Review hợp đồng, Cấu hình HĐ, Form lists, Phân quyền ký, System prompts, Users…).</w:t>
       </w:r>
     </w:p>
     <w:p>
       <w:pPr>
         <w:pStyle w:val="ListBullet"/>
+        <w:spacing w:after="40"/>
       </w:pPr>
       <w:r>
-        <w:rPr>
-          <w:b/>
-        </w:rPr>
-        <w:t>AC2</w:t>
-      </w:r>
-      <w:r>
-        <w:t>: Given user thiếu quyền một hạng mục Then không vào được màn tương ứng.</w:t>
+        <w:t>AC2: Given user thiếu quyền một hạng mục Then không vào được màn tương ứng.</w:t>
       </w:r>
     </w:p>
     <w:p>
@@ -2164,6 +1127,9 @@
         <w:pStyle w:val="Heading1"/>
       </w:pPr>
       <w:r>
+        <w:rPr>
+          <w:color w:val="1A365D"/>
+        </w:rPr>
         <w:t>Epic 5 — Hệ thống: AI Engine &amp; Tích hợp</w:t>
       </w:r>
     </w:p>
@@ -2172,99 +1138,37 @@
         <w:pStyle w:val="Heading2"/>
       </w:pPr>
       <w:r>
+        <w:rPr>
+          <w:color w:val="2C5282"/>
+        </w:rPr>
         <w:t>US-S01 — AI Review Engine · Demo 🟡 (mock heuristic; pipeline logic theo Blueprint 1.3.5)</w:t>
       </w:r>
     </w:p>
     <w:p>
       <w:pPr>
         <w:pStyle w:val="ListBullet"/>
+        <w:spacing w:after="40"/>
       </w:pPr>
       <w:r>
-        <w:rPr>
-          <w:b/>
-        </w:rPr>
-        <w:t>AC1</w:t>
-      </w:r>
-      <w:r>
-        <w:t xml:space="preserve">: Given HĐ vào queue Then resolve checklist bằng </w:t>
-      </w:r>
-      <w:r>
-        <w:rPr>
-          <w:rFonts w:ascii="Consolas" w:hAnsi="Consolas"/>
-          <w:sz w:val="20"/>
-        </w:rPr>
-        <w:t>getMergedConfigForContractName(contractNameId)</w:t>
-      </w:r>
-      <w:r>
-        <w:t xml:space="preserve"> (cha ∪ overlay) + System Prompt </w:t>
-      </w:r>
-      <w:r>
-        <w:rPr>
-          <w:rFonts w:ascii="Consolas" w:hAnsi="Consolas"/>
-          <w:sz w:val="20"/>
-        </w:rPr>
-        <w:t>checklist_review</w:t>
-      </w:r>
-      <w:r>
-        <w:t xml:space="preserve"> → findings / đề xuất A/B.</w:t>
+        <w:t>AC1: Given HĐ vào queue Then resolve checklist bằng getMergedConfigForContractName(contractNameId) (cha ∪ overlay) + System Prompt checklist_review → findings / đề xuất A/B.</w:t>
       </w:r>
     </w:p>
     <w:p>
       <w:pPr>
         <w:pStyle w:val="ListBullet"/>
+        <w:spacing w:after="40"/>
       </w:pPr>
       <w:r>
-        <w:rPr>
-          <w:b/>
-        </w:rPr>
-        <w:t>AC2</w:t>
-      </w:r>
-      <w:r>
-        <w:t xml:space="preserve">: Given LLM lỗi/timeout Then fallback rule-based, đánh dấu rõ </w:t>
-      </w:r>
-      <w:r>
-        <w:rPr>
-          <w:rFonts w:ascii="Consolas" w:hAnsi="Consolas"/>
-          <w:sz w:val="20"/>
-        </w:rPr>
-        <w:t>[phụ thuộc B4]</w:t>
-      </w:r>
-      <w:r>
-        <w:t>.</w:t>
+        <w:t>AC2: Given LLM lỗi/timeout Then fallback rule-based, đánh dấu rõ [phụ thuộc B4].</w:t>
       </w:r>
     </w:p>
     <w:p>
       <w:pPr>
         <w:pStyle w:val="ListBullet"/>
+        <w:spacing w:after="40"/>
       </w:pPr>
       <w:r>
-        <w:rPr>
-          <w:b/>
-        </w:rPr>
-        <w:t>AC3</w:t>
-      </w:r>
-      <w:r>
-        <w:t xml:space="preserve">: Given có findings Then stage </w:t>
-      </w:r>
-      <w:r>
-        <w:rPr>
-          <w:rFonts w:ascii="Consolas" w:hAnsi="Consolas"/>
-          <w:sz w:val="20"/>
-        </w:rPr>
-        <w:t>ai_summary_fairness</w:t>
-      </w:r>
-      <w:r>
-        <w:t xml:space="preserve"> sinh summary + fairness; % tin cậy và Fairness Score tách biệt </w:t>
-      </w:r>
-      <w:r>
-        <w:rPr>
-          <w:rFonts w:ascii="Consolas" w:hAnsi="Consolas"/>
-          <w:sz w:val="20"/>
-        </w:rPr>
-        <w:t>[B2]</w:t>
-      </w:r>
-      <w:r>
-        <w:t>.</w:t>
+        <w:t>AC3: Given có findings Then stage ai_summary_fairness sinh summary + fairness; % tin cậy và Fairness Score tách biệt [B2].</w:t>
       </w:r>
     </w:p>
     <w:p>
@@ -2272,64 +1176,28 @@
         <w:pStyle w:val="Heading2"/>
       </w:pPr>
       <w:r>
-        <w:t>US-S02 — Đồng bộ Econtract (outbound) · Demo ❌ `[phụ thuộc D1a/D1b/D1e]`</w:t>
+        <w:rPr>
+          <w:color w:val="2C5282"/>
+        </w:rPr>
+        <w:t>US-S02 — Đồng bộ Econtract (outbound) · Demo 🟡 (backend/ POST /api/econtract/push; cần credentials FPT) [phụ thuộc D1a/D1b/D1e]</w:t>
       </w:r>
     </w:p>
     <w:p>
       <w:pPr>
         <w:pStyle w:val="ListBullet"/>
+        <w:spacing w:after="40"/>
       </w:pPr>
       <w:r>
-        <w:rPr>
-          <w:b/>
-        </w:rPr>
-        <w:t>AC1</w:t>
-      </w:r>
-      <w:r>
-        <w:t xml:space="preserve">: Given Legal approve Then gọi API FPT.eContract đẩy trình ký với marker; file convert base64 </w:t>
-      </w:r>
-      <w:r>
-        <w:rPr>
-          <w:rFonts w:ascii="Consolas" w:hAnsi="Consolas"/>
-          <w:sz w:val="20"/>
-        </w:rPr>
-        <w:t>[D1c]</w:t>
-      </w:r>
-      <w:r>
-        <w:t>.</w:t>
+        <w:t>AC1: Given người tạo Submit trên design-markers (sau Legal + đủ marker) Then BE gọi login + excall FPT với headerFields + parties + file base64 (PDF ưu tiên); username/password FPT = user AI Legal đang đăng nhập [D1c].</w:t>
       </w:r>
     </w:p>
     <w:p>
       <w:pPr>
         <w:pStyle w:val="ListBullet"/>
+        <w:spacing w:after="40"/>
       </w:pPr>
       <w:r>
-        <w:rPr>
-          <w:b/>
-        </w:rPr>
-        <w:t>AC2</w:t>
-      </w:r>
-      <w:r>
-        <w:t xml:space="preserve"> </w:t>
-      </w:r>
-      <w:r>
-        <w:rPr>
-          <w:rFonts w:ascii="Consolas" w:hAnsi="Consolas"/>
-          <w:sz w:val="20"/>
-        </w:rPr>
-        <w:t>[D1d]</w:t>
-      </w:r>
-      <w:r>
-        <w:t xml:space="preserve">: Kênh nhận file ký về </w:t>
-      </w:r>
-      <w:r>
-        <w:rPr>
-          <w:b/>
-        </w:rPr>
-        <w:t>không thuộc scope</w:t>
-      </w:r>
-      <w:r>
-        <w:t xml:space="preserve"> AI Legal.</w:t>
+        <w:t>AC2 [D1d]: Kênh nhận file ký về (sFTP/callback inbound) không thuộc scope xây dựng AI Legal Sprint 1.</w:t>
       </w:r>
     </w:p>
     <w:p>
@@ -2337,31 +1205,19 @@
         <w:pStyle w:val="Heading2"/>
       </w:pPr>
       <w:r>
-        <w:t>US-S03 — Xuất `.docx` giữ format · Demo ❌ `[phụ thuộc C4]`</w:t>
+        <w:rPr>
+          <w:color w:val="2C5282"/>
+        </w:rPr>
+        <w:t>US-S03 — Xuất .docx giữ format · Demo 🟡 [phụ thuộc C4]</w:t>
       </w:r>
     </w:p>
     <w:p>
       <w:pPr>
         <w:pStyle w:val="ListBullet"/>
+        <w:spacing w:after="40"/>
       </w:pPr>
       <w:r>
-        <w:rPr>
-          <w:b/>
-        </w:rPr>
-        <w:t>AC1</w:t>
-      </w:r>
-      <w:r>
-        <w:t xml:space="preserve">: Given review hoàn tất When export Then </w:t>
-      </w:r>
-      <w:r>
-        <w:rPr>
-          <w:rFonts w:ascii="Consolas" w:hAnsi="Consolas"/>
-          <w:sz w:val="20"/>
-        </w:rPr>
-        <w:t>.docx</w:t>
-      </w:r>
-      <w:r>
-        <w:t xml:space="preserve"> giữ format gốc, chỉ thay vùng mở theo allow-list.</w:t>
+        <w:t>AC1: Given cần file mang marker / export When sinh OOXML Then .docx giữ format gốc, chỉ thay vùng mở / chèn marker theo allow-list (đủ cho đẩy eContract).</w:t>
       </w:r>
     </w:p>
     <w:p>
@@ -2369,82 +1225,60 @@
         <w:pStyle w:val="Heading1"/>
       </w:pPr>
       <w:r>
+        <w:rPr>
+          <w:color w:val="1A365D"/>
+        </w:rPr>
         <w:t>Definition of Ready cho từng story</w:t>
       </w:r>
     </w:p>
     <w:p>
       <w:pPr>
-        <w:pStyle w:val="ListNumber"/>
+        <w:spacing w:after="40"/>
+        <w:ind w:left="360"/>
       </w:pPr>
       <w:r>
-        <w:t xml:space="preserve">Mọi </w:t>
-      </w:r>
-      <w:r>
-        <w:rPr>
-          <w:rFonts w:ascii="Consolas" w:hAnsi="Consolas"/>
-          <w:sz w:val="20"/>
-        </w:rPr>
-        <w:t>[phụ thuộc]</w:t>
-      </w:r>
-      <w:r>
-        <w:t xml:space="preserve"> đã có quyết định trong </w:t>
-      </w:r>
-      <w:r>
-        <w:rPr>
-          <w:rFonts w:ascii="Consolas" w:hAnsi="Consolas"/>
-          <w:sz w:val="20"/>
-        </w:rPr>
-        <w:t>02-open-questions.md</w:t>
-      </w:r>
-      <w:r>
-        <w:t xml:space="preserve"> hoặc Blueprint đã chốt.</w:t>
+        <w:t>1. Mọi [phụ thuộc] đã có quyết định trong 02-open-questions.md hoặc Blueprint đã chốt.</w:t>
       </w:r>
     </w:p>
     <w:p>
       <w:pPr>
-        <w:pStyle w:val="ListNumber"/>
+        <w:spacing w:after="40"/>
+        <w:ind w:left="360"/>
       </w:pPr>
       <w:r>
-        <w:t>AC được TESTER xác nhận viết được test case.</w:t>
+        <w:t>2. AC được TESTER xác nhận viết được test case.</w:t>
       </w:r>
     </w:p>
     <w:p>
       <w:pPr>
-        <w:pStyle w:val="ListNumber"/>
+        <w:spacing w:after="40"/>
+        <w:ind w:left="360"/>
       </w:pPr>
       <w:r>
-        <w:t xml:space="preserve">Story cần API có endpoint tương ứng trong </w:t>
-      </w:r>
-      <w:r>
-        <w:rPr>
-          <w:rFonts w:ascii="Consolas" w:hAnsi="Consolas"/>
-          <w:sz w:val="20"/>
-        </w:rPr>
-        <w:t>04-api-contract.md</w:t>
-      </w:r>
-      <w:r>
-        <w:t>.</w:t>
+        <w:t>3. Story cần API có endpoint tương ứng trong 04-api-contract.md / docs/api-contract.md.</w:t>
       </w:r>
     </w:p>
     <w:p>
       <w:pPr>
-        <w:pStyle w:val="ListNumber"/>
+        <w:spacing w:after="40"/>
+        <w:ind w:left="360"/>
       </w:pPr>
       <w:r>
-        <w:t>UI story có màn hình demo tham chiếu hoặc mockup được duyệt.</w:t>
+        <w:t>4. UI story có màn hình demo tham chiếu hoặc mockup được duyệt.</w:t>
       </w:r>
     </w:p>
     <w:p>
       <w:pPr>
-        <w:pStyle w:val="ListNumber"/>
+        <w:spacing w:after="40"/>
+        <w:ind w:left="360"/>
       </w:pPr>
       <w:r>
-        <w:t>Story cấu hình checklist / Form lists khớp Blueprint VI.4–VI.5 (v1.22+).</w:t>
+        <w:t>5. Story khớp Blueprint v1.28 (phạm vi Sprint 1 + VII ngoài phạm vi).</w:t>
       </w:r>
     </w:p>
     <w:sectPr>
-      <w:pgSz w:w="11906" w:h="16838"/>
-      <w:pgMar w:top="1020" w:right="1134" w:bottom="1020" w:left="1134" w:header="720" w:footer="720" w:gutter="0"/>
+      <w:pgSz w:w="12240" w:h="15840"/>
+      <w:pgMar w:top="1008" w:right="1224" w:bottom="1008" w:left="1224" w:header="720" w:footer="720" w:gutter="0"/>
       <w:cols w:space="720"/>
       <w:docGrid w:linePitch="360"/>
     </w:sectPr>
@@ -2816,7 +1650,7 @@
     <w:qFormat/>
     <w:rsid w:val="00FC693F"/>
     <w:rPr>
-      <w:rFonts w:ascii="Calibri" w:hAnsi="Calibri"/>
+      <w:rFonts w:ascii="Calibri" w:hAnsi="Calibri" w:eastAsia="Calibri"/>
       <w:sz w:val="22"/>
     </w:rPr>
   </w:style>
@@ -2879,10 +1713,10 @@
       <w:outlineLvl w:val="0"/>
     </w:pPr>
     <w:rPr>
-      <w:rFonts w:asciiTheme="majorHAnsi" w:eastAsiaTheme="majorEastAsia" w:hAnsiTheme="majorHAnsi" w:cstheme="majorBidi" w:ascii="Calibri" w:hAnsi="Calibri"/>
+      <w:rFonts w:asciiTheme="majorHAnsi" w:eastAsiaTheme="majorEastAsia" w:hAnsiTheme="majorHAnsi" w:cstheme="majorBidi"/>
       <w:b/>
       <w:bCs/>
-      <w:color w:val="1F4E79"/>
+      <w:color w:val="365F91" w:themeColor="accent1" w:themeShade="BF"/>
       <w:sz w:val="28"/>
       <w:szCs w:val="28"/>
     </w:rPr>
@@ -2903,10 +1737,10 @@
       <w:outlineLvl w:val="1"/>
     </w:pPr>
     <w:rPr>
-      <w:rFonts w:asciiTheme="majorHAnsi" w:eastAsiaTheme="majorEastAsia" w:hAnsiTheme="majorHAnsi" w:cstheme="majorBidi" w:ascii="Calibri" w:hAnsi="Calibri"/>
+      <w:rFonts w:asciiTheme="majorHAnsi" w:eastAsiaTheme="majorEastAsia" w:hAnsiTheme="majorHAnsi" w:cstheme="majorBidi"/>
       <w:b/>
       <w:bCs/>
-      <w:color w:val="1F4E79"/>
+      <w:color w:val="4F81BD" w:themeColor="accent1"/>
       <w:sz w:val="26"/>
       <w:szCs w:val="26"/>
     </w:rPr>

</xml_diff>